<commit_message>
refactor: Reestructura carpetas y mueve notebooks a F2
</commit_message>
<xml_diff>
--- a/docs/informe_sumativa1_grupo2.docx
+++ b/docs/informe_sumativa1_grupo2.docx
@@ -1,6 +1,6 @@
 
 <file path=word/document.xml><?xml version="1.0" encoding="utf-8"?>
-<w:document xmlns:wpc="http://schemas.microsoft.com/office/word/2010/wordprocessingCanvas" xmlns:cx="http://schemas.microsoft.com/office/drawing/2014/chartex" xmlns:cx1="http://schemas.microsoft.com/office/drawing/2015/9/8/chartex" xmlns:cx2="http://schemas.microsoft.com/office/drawing/2015/10/21/chartex" xmlns:cx3="http://schemas.microsoft.com/office/drawing/2016/5/9/chartex" xmlns:cx4="http://schemas.microsoft.com/office/drawing/2016/5/10/chartex" xmlns:cx5="http://schemas.microsoft.com/office/drawing/2016/5/11/chartex" xmlns:cx6="http://schemas.microsoft.com/office/drawing/2016/5/12/chartex" xmlns:cx7="http://schemas.microsoft.com/office/drawing/2016/5/13/chartex" xmlns:cx8="http://schemas.microsoft.com/office/drawing/2016/5/14/chartex" xmlns:mc="http://schemas.openxmlformats.org/markup-compatibility/2006" xmlns:aink="http://schemas.microsoft.com/office/drawing/2016/ink" xmlns:am3d="http://schemas.microsoft.com/office/drawing/2017/model3d" xmlns:o="urn:schemas-microsoft-com:office:office" xmlns:r="http://schemas.openxmlformats.org/officeDocument/2006/relationships" xmlns:m="http://schemas.openxmlformats.org/officeDocument/2006/math" xmlns:v="urn:schemas-microsoft-com:vml" xmlns:wp14="http://schemas.microsoft.com/office/word/2010/wordprocessingDrawing" xmlns:wp="http://schemas.openxmlformats.org/drawingml/2006/wordprocessingDrawing" xmlns:w10="urn:schemas-microsoft-com:office:word" xmlns:w="http://schemas.openxmlformats.org/wordprocessingml/2006/main" xmlns:w14="http://schemas.microsoft.com/office/word/2010/wordml" xmlns:w15="http://schemas.microsoft.com/office/word/2012/wordml" xmlns:w16cex="http://schemas.microsoft.com/office/word/2018/wordml/cex" xmlns:w16cid="http://schemas.microsoft.com/office/word/2016/wordml/cid" xmlns:w16="http://schemas.microsoft.com/office/word/2018/wordml" xmlns:w16sdtdh="http://schemas.microsoft.com/office/word/2020/wordml/sdtdatahash" xmlns:w16se="http://schemas.microsoft.com/office/word/2015/wordml/symex" xmlns:wpg="http://schemas.microsoft.com/office/word/2010/wordprocessingGroup" xmlns:wpi="http://schemas.microsoft.com/office/word/2010/wordprocessingInk" xmlns:wne="http://schemas.microsoft.com/office/word/2006/wordml" xmlns:wps="http://schemas.microsoft.com/office/word/2010/wordprocessingShape" mc:Ignorable="w14 w15 w16se w16cid w16 w16cex w16sdtdh wp14">
+<w:document xmlns:wpc="http://schemas.microsoft.com/office/word/2010/wordprocessingCanvas" xmlns:cx="http://schemas.microsoft.com/office/drawing/2014/chartex" xmlns:cx1="http://schemas.microsoft.com/office/drawing/2015/9/8/chartex" xmlns:cx2="http://schemas.microsoft.com/office/drawing/2015/10/21/chartex" xmlns:cx3="http://schemas.microsoft.com/office/drawing/2016/5/9/chartex" xmlns:cx4="http://schemas.microsoft.com/office/drawing/2016/5/10/chartex" xmlns:cx5="http://schemas.microsoft.com/office/drawing/2016/5/11/chartex" xmlns:cx6="http://schemas.microsoft.com/office/drawing/2016/5/12/chartex" xmlns:cx7="http://schemas.microsoft.com/office/drawing/2016/5/13/chartex" xmlns:cx8="http://schemas.microsoft.com/office/drawing/2016/5/14/chartex" xmlns:mc="http://schemas.openxmlformats.org/markup-compatibility/2006" xmlns:aink="http://schemas.microsoft.com/office/drawing/2016/ink" xmlns:am3d="http://schemas.microsoft.com/office/drawing/2017/model3d" xmlns:o="urn:schemas-microsoft-com:office:office" xmlns:oel="http://schemas.microsoft.com/office/2019/extlst" xmlns:r="http://schemas.openxmlformats.org/officeDocument/2006/relationships" xmlns:m="http://schemas.openxmlformats.org/officeDocument/2006/math" xmlns:v="urn:schemas-microsoft-com:vml" xmlns:wp14="http://schemas.microsoft.com/office/word/2010/wordprocessingDrawing" xmlns:wp="http://schemas.openxmlformats.org/drawingml/2006/wordprocessingDrawing" xmlns:w10="urn:schemas-microsoft-com:office:word" xmlns:w="http://schemas.openxmlformats.org/wordprocessingml/2006/main" xmlns:w14="http://schemas.microsoft.com/office/word/2010/wordml" xmlns:w15="http://schemas.microsoft.com/office/word/2012/wordml" xmlns:w16cex="http://schemas.microsoft.com/office/word/2018/wordml/cex" xmlns:w16cid="http://schemas.microsoft.com/office/word/2016/wordml/cid" xmlns:w16="http://schemas.microsoft.com/office/word/2018/wordml" xmlns:w16du="http://schemas.microsoft.com/office/word/2023/wordml/word16du" xmlns:w16sdtdh="http://schemas.microsoft.com/office/word/2020/wordml/sdtdatahash" xmlns:w16sdtfl="http://schemas.microsoft.com/office/word/2024/wordml/sdtformatlock" xmlns:w16se="http://schemas.microsoft.com/office/word/2015/wordml/symex" xmlns:wpg="http://schemas.microsoft.com/office/word/2010/wordprocessingGroup" xmlns:wpi="http://schemas.microsoft.com/office/word/2010/wordprocessingInk" xmlns:wne="http://schemas.microsoft.com/office/word/2006/wordml" xmlns:wps="http://schemas.microsoft.com/office/word/2010/wordprocessingShape" mc:Ignorable="w14 w15 w16se w16cid w16 w16cex w16sdtdh w16sdtfl w16du wp14">
   <w:body>
     <w:p>
       <w:pPr>
@@ -166,7 +166,7 @@
                           <pic:cNvPicPr/>
                         </pic:nvPicPr>
                         <pic:blipFill>
-                          <a:blip r:embed="rId7" cstate="print"/>
+                          <a:blip r:embed="rId8" cstate="print"/>
                           <a:stretch>
                             <a:fillRect/>
                           </a:stretch>
@@ -187,7 +187,7 @@
                           <pic:cNvPicPr/>
                         </pic:nvPicPr>
                         <pic:blipFill>
-                          <a:blip r:embed="rId8" cstate="print"/>
+                          <a:blip r:embed="rId9" cstate="print"/>
                           <a:stretch>
                             <a:fillRect/>
                           </a:stretch>
@@ -633,7 +633,7 @@
                           <pic:cNvPicPr/>
                         </pic:nvPicPr>
                         <pic:blipFill>
-                          <a:blip r:embed="rId9" cstate="print"/>
+                          <a:blip r:embed="rId10" cstate="print"/>
                           <a:stretch>
                             <a:fillRect/>
                           </a:stretch>
@@ -736,7 +736,7 @@
                           <pic:cNvPicPr/>
                         </pic:nvPicPr>
                         <pic:blipFill>
-                          <a:blip r:embed="rId10" cstate="print"/>
+                          <a:blip r:embed="rId11" cstate="print"/>
                           <a:stretch>
                             <a:fillRect/>
                           </a:stretch>
@@ -757,7 +757,7 @@
                           <pic:cNvPicPr/>
                         </pic:nvPicPr>
                         <pic:blipFill>
-                          <a:blip r:embed="rId11" cstate="print"/>
+                          <a:blip r:embed="rId12" cstate="print"/>
                           <a:stretch>
                             <a:fillRect/>
                           </a:stretch>
@@ -804,10 +804,10 @@
                   <o:lock v:ext="edit" aspectratio="t"/>
                 </v:shapetype>
                 <v:shape id="Image 4" o:spid="_x0000_s1028" type="#_x0000_t75" style="position:absolute;left:2681;top:994;width:1731;height:2221;visibility:visible;mso-wrap-style:square" o:gfxdata="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">
-                  <v:imagedata r:id="rId12" o:title=""/>
+                  <v:imagedata r:id="rId13" o:title=""/>
                 </v:shape>
                 <v:shape id="Image 5" o:spid="_x0000_s1029" type="#_x0000_t75" style="position:absolute;left:4679;top:994;width:1574;height:2270;visibility:visible;mso-wrap-style:square" o:gfxdata="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">
-                  <v:imagedata r:id="rId13" o:title=""/>
+                  <v:imagedata r:id="rId14" o:title=""/>
                 </v:shape>
                 <v:shape id="Graphic 6" o:spid="_x0000_s1030" style="position:absolute;left:6646;width:1969;height:3270;visibility:visible;mso-wrap-style:square;v-text-anchor:top" coordsize="196850,327025" o:gfxdata="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" path="m41738,282625r-19615,l36555,301872r17670,13702l75301,323768r24648,2723l135065,319274r15511,-10842l96710,308432,72587,304520,51852,293436,41738,282625xem23469,l1765,r-92,283490l1444,293436r-116,4163l827,309409,,321525r19418,l21170,282625r20568,l35686,276156,25273,253657r-1347,-5411l23469,242824r,-56058l24803,180860r1384,-5397l37444,151159r5592,-5998l23469,145161,23469,xem154103,117576r-55564,l131296,125205r23974,20516l169994,175564r5012,35611l169771,250224r-15249,30782l129941,301186r-33231,7246l150576,308432r15497,-10833l188186,261426r8435,-50708l189841,165885,170822,130702,154103,117576xem104000,99491r-26639,3189l55192,111801,37536,126184,24434,145161r18602,l54414,132956,75359,121535r23180,-3959l154103,117576r-12555,-9857l104000,99491xe" fillcolor="#c6c4c4" stroked="f">
                   <v:path arrowok="t"/>
@@ -816,16 +816,16 @@
                   <v:path arrowok="t"/>
                 </v:shape>
                 <v:shape id="Image 8" o:spid="_x0000_s1032" type="#_x0000_t75" style="position:absolute;left:2929;top:4259;width:1881;height:2234;visibility:visible;mso-wrap-style:square" o:gfxdata="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">
-                  <v:imagedata r:id="rId14" o:title=""/>
+                  <v:imagedata r:id="rId15" o:title=""/>
                 </v:shape>
                 <v:shape id="Graphic 9" o:spid="_x0000_s1033" style="position:absolute;left:5204;top:3545;width:1212;height:2953;visibility:visible;mso-wrap-style:square;v-text-anchor:top" coordsize="121285,295275" o:gfxdata="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" path="m39789,l,,,294817r39789,l39789,xem121208,71894r-39789,l81419,294817r39789,l121208,71894xem121208,21717r-39789,l81419,52946r39789,l121208,21717xe" fillcolor="#af0f1e" stroked="f">
                   <v:path arrowok="t"/>
                 </v:shape>
                 <v:shape id="Image 10" o:spid="_x0000_s1034" type="#_x0000_t75" style="position:absolute;left:6805;top:4259;width:1881;height:2234;visibility:visible;mso-wrap-style:square" o:gfxdata="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">
-                  <v:imagedata r:id="rId15" o:title=""/>
+                  <v:imagedata r:id="rId16" o:title=""/>
                 </v:shape>
                 <v:shape id="Image 11" o:spid="_x0000_s1035" type="#_x0000_t75" style="position:absolute;left:8921;top:4259;width:1930;height:2279;visibility:visible;mso-wrap-style:square" o:gfxdata="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">
-                  <v:imagedata r:id="rId16" o:title=""/>
+                  <v:imagedata r:id="rId17" o:title=""/>
                 </v:shape>
                 <w10:wrap type="square" anchorx="margin" anchory="margin"/>
               </v:group>
@@ -863,7 +863,7 @@
                     <pic:cNvPicPr/>
                   </pic:nvPicPr>
                   <pic:blipFill>
-                    <a:blip r:embed="rId17" cstate="print">
+                    <a:blip r:embed="rId18" cstate="print">
                       <a:extLst>
                         <a:ext uri="{28A0092B-C50C-407E-A947-70E740481C1C}">
                           <a14:useLocalDpi xmlns:a14="http://schemas.microsoft.com/office/drawing/2010/main" val="0"/>
@@ -1247,25 +1247,55 @@
       <w:pPr>
         <w:spacing w:line="252" w:lineRule="exact"/>
         <w:jc w:val="both"/>
-      </w:pPr>
-      <w:r>
         <w:rPr>
           <w:b/>
           <w:color w:val="231F20"/>
           <w:spacing w:val="-2"/>
         </w:rPr>
-        <w:t>Fecha:</w:t>
-      </w:r>
-      <w:r>
+      </w:pPr>
+    </w:p>
+    <w:p>
+      <w:pPr>
+        <w:pStyle w:val="Textoindependiente"/>
+        <w:spacing w:before="8"/>
+        <w:jc w:val="both"/>
         <w:rPr>
           <w:b/>
           <w:color w:val="231F20"/>
           <w:spacing w:val="-2"/>
         </w:rPr>
+      </w:pPr>
+      <w:r>
+        <w:rPr>
+          <w:b/>
+          <w:color w:val="231F20"/>
+          <w:spacing w:val="-2"/>
+        </w:rPr>
+        <w:t>Fecha:</w:t>
+      </w:r>
+      <w:r>
+        <w:rPr>
+          <w:b/>
+          <w:color w:val="231F20"/>
+          <w:spacing w:val="-2"/>
+        </w:rPr>
         <w:t xml:space="preserve">  </w:t>
       </w:r>
       <w:r>
-        <w:t xml:space="preserve"> de octubre de 2026</w:t>
+        <w:rPr>
+          <w:b/>
+          <w:color w:val="231F20"/>
+          <w:spacing w:val="-2"/>
+        </w:rPr>
+        <w:t xml:space="preserve"> </w:t>
+      </w:r>
+      <w:r>
+        <w:rPr>
+          <w:bCs/>
+          <w:color w:val="231F20"/>
+          <w:spacing w:val="-2"/>
+        </w:rPr>
+        <w:t>de octubre de 2026</w:t>
       </w:r>
     </w:p>
     <w:p>
@@ -1289,7 +1319,7 @@
       <w:r>
         <w:t xml:space="preserve">:  </w:t>
       </w:r>
-      <w:hyperlink r:id="rId18" w:history="1">
+      <w:hyperlink r:id="rId19" w:history="1">
         <w:r>
           <w:rPr>
             <w:rStyle w:val="Hipervnculo"/>
@@ -1306,96 +1336,117 @@
         <w:br w:type="page"/>
       </w:r>
     </w:p>
-    <w:p>
-      <w:pPr>
-        <w:spacing w:after="200"/>
-        <w:jc w:val="both"/>
-      </w:pPr>
-    </w:p>
-    <w:p>
-      <w:pPr>
-        <w:pStyle w:val="Ttulo1"/>
-        <w:jc w:val="both"/>
-      </w:pPr>
-      <w:bookmarkStart w:id="0" w:name="_Toc242557113"/>
-      <w:r>
-        <w:t>Índice</w:t>
-      </w:r>
-      <w:bookmarkEnd w:id="0"/>
-    </w:p>
     <w:sdt>
       <w:sdtPr>
-        <w:alias w:val="Índice"/>
-        <w:id w:val="1160740287"/>
+        <w:rPr>
+          <w:lang w:val="es-ES"/>
+        </w:rPr>
+        <w:id w:val="-1580749509"/>
+        <w:docPartObj>
+          <w:docPartGallery w:val="Table of Contents"/>
+          <w:docPartUnique/>
+        </w:docPartObj>
       </w:sdtPr>
-      <w:sdtEndPr/>
+      <w:sdtEndPr>
+        <w:rPr>
+          <w:rFonts w:ascii="Calibri" w:eastAsia="Calibri" w:hAnsi="Calibri" w:cs="Calibri"/>
+          <w:b/>
+          <w:bCs/>
+          <w:color w:val="000000"/>
+          <w:sz w:val="22"/>
+          <w:szCs w:val="22"/>
+        </w:rPr>
+      </w:sdtEndPr>
       <w:sdtContent>
+        <w:p>
+          <w:pPr>
+            <w:pStyle w:val="TtuloTDC"/>
+          </w:pPr>
+          <w:r>
+            <w:rPr>
+              <w:lang w:val="es-ES"/>
+            </w:rPr>
+            <w:t>Contenido</w:t>
+          </w:r>
+        </w:p>
         <w:p>
           <w:pPr>
             <w:pStyle w:val="TDC1"/>
             <w:tabs>
               <w:tab w:val="right" w:leader="dot" w:pos="9062"/>
             </w:tabs>
-            <w:jc w:val="both"/>
             <w:rPr>
+              <w:rFonts w:asciiTheme="minorHAnsi" w:eastAsiaTheme="minorEastAsia" w:hAnsiTheme="minorHAnsi" w:cstheme="minorBidi"/>
               <w:noProof/>
+              <w:color w:val="auto"/>
+              <w:kern w:val="2"/>
+              <w:sz w:val="24"/>
+              <w:szCs w:val="24"/>
+              <w14:ligatures w14:val="standardContextual"/>
             </w:rPr>
           </w:pPr>
           <w:r>
             <w:fldChar w:fldCharType="begin"/>
           </w:r>
           <w:r>
-            <w:instrText>TOC \h \o "1-2"</w:instrText>
+            <w:instrText xml:space="preserve"> TOC \o "1-3" \h \z \u </w:instrText>
           </w:r>
           <w:r>
             <w:fldChar w:fldCharType="separate"/>
           </w:r>
-          <w:hyperlink w:anchor="_Toc242557113" w:history="1">
+          <w:hyperlink w:anchor="_Toc242598455" w:history="1">
             <w:r>
               <w:rPr>
                 <w:rStyle w:val="Hipervnculo"/>
                 <w:noProof/>
               </w:rPr>
-              <w:t>Índice</w:t>
+              <w:t>1. Preparación y carga de datos</w:t>
             </w:r>
             <w:r>
               <w:rPr>
                 <w:noProof/>
+                <w:webHidden/>
               </w:rPr>
               <w:tab/>
             </w:r>
             <w:r>
               <w:rPr>
                 <w:noProof/>
+                <w:webHidden/>
               </w:rPr>
               <w:fldChar w:fldCharType="begin"/>
             </w:r>
             <w:r>
               <w:rPr>
                 <w:noProof/>
-              </w:rPr>
-              <w:instrText xml:space="preserve"> PAGEREF _Toc242557113 \h </w:instrText>
+                <w:webHidden/>
+              </w:rPr>
+              <w:instrText xml:space="preserve"> PAGEREF _Toc242598455 \h </w:instrText>
             </w:r>
             <w:r>
               <w:rPr>
                 <w:noProof/>
+                <w:webHidden/>
               </w:rPr>
             </w:r>
             <w:r>
               <w:rPr>
                 <w:noProof/>
+                <w:webHidden/>
               </w:rPr>
               <w:fldChar w:fldCharType="separate"/>
             </w:r>
             <w:r>
               <w:rPr>
                 <w:noProof/>
+                <w:webHidden/>
               </w:rPr>
               <w:t>2</w:t>
             </w:r>
             <w:r>
               <w:rPr>
                 <w:noProof/>
+                <w:webHidden/>
               </w:rPr>
               <w:fldChar w:fldCharType="end"/>
             </w:r>
@@ -1407,57 +1458,69 @@
             <w:tabs>
               <w:tab w:val="right" w:leader="dot" w:pos="9062"/>
             </w:tabs>
-            <w:jc w:val="both"/>
             <w:rPr>
+              <w:rFonts w:asciiTheme="minorHAnsi" w:eastAsiaTheme="minorEastAsia" w:hAnsiTheme="minorHAnsi" w:cstheme="minorBidi"/>
               <w:noProof/>
+              <w:color w:val="auto"/>
+              <w:kern w:val="2"/>
+              <w:sz w:val="24"/>
+              <w:szCs w:val="24"/>
+              <w14:ligatures w14:val="standardContextual"/>
             </w:rPr>
           </w:pPr>
-          <w:hyperlink w:anchor="_Toc242557114" w:history="1">
+          <w:hyperlink w:anchor="_Toc242598456" w:history="1">
             <w:r>
               <w:rPr>
                 <w:rStyle w:val="Hipervnculo"/>
                 <w:noProof/>
               </w:rPr>
-              <w:t>1. Preparación y carga de datos</w:t>
+              <w:t>2. Análisis exploratorio de datos</w:t>
             </w:r>
             <w:r>
               <w:rPr>
                 <w:noProof/>
+                <w:webHidden/>
               </w:rPr>
               <w:tab/>
             </w:r>
             <w:r>
               <w:rPr>
                 <w:noProof/>
+                <w:webHidden/>
               </w:rPr>
               <w:fldChar w:fldCharType="begin"/>
             </w:r>
             <w:r>
               <w:rPr>
                 <w:noProof/>
-              </w:rPr>
-              <w:instrText xml:space="preserve"> PAGEREF _Toc242557114 \h </w:instrText>
+                <w:webHidden/>
+              </w:rPr>
+              <w:instrText xml:space="preserve"> PAGEREF _Toc242598456 \h </w:instrText>
             </w:r>
             <w:r>
               <w:rPr>
                 <w:noProof/>
+                <w:webHidden/>
               </w:rPr>
             </w:r>
             <w:r>
               <w:rPr>
                 <w:noProof/>
+                <w:webHidden/>
               </w:rPr>
               <w:fldChar w:fldCharType="separate"/>
             </w:r>
             <w:r>
               <w:rPr>
                 <w:noProof/>
-              </w:rPr>
-              <w:t>3</w:t>
+                <w:webHidden/>
+              </w:rPr>
+              <w:t>2</w:t>
             </w:r>
             <w:r>
               <w:rPr>
                 <w:noProof/>
+                <w:webHidden/>
               </w:rPr>
               <w:fldChar w:fldCharType="end"/>
             </w:r>
@@ -1469,57 +1532,69 @@
             <w:tabs>
               <w:tab w:val="right" w:leader="dot" w:pos="9062"/>
             </w:tabs>
-            <w:jc w:val="both"/>
             <w:rPr>
+              <w:rFonts w:asciiTheme="minorHAnsi" w:eastAsiaTheme="minorEastAsia" w:hAnsiTheme="minorHAnsi" w:cstheme="minorBidi"/>
               <w:noProof/>
+              <w:color w:val="auto"/>
+              <w:kern w:val="2"/>
+              <w:sz w:val="24"/>
+              <w:szCs w:val="24"/>
+              <w14:ligatures w14:val="standardContextual"/>
             </w:rPr>
           </w:pPr>
-          <w:hyperlink w:anchor="_Toc242557115" w:history="1">
+          <w:hyperlink w:anchor="_Toc242598457" w:history="1">
             <w:r>
               <w:rPr>
                 <w:rStyle w:val="Hipervnculo"/>
                 <w:noProof/>
               </w:rPr>
-              <w:t>2. Análisis exploratorio de datos</w:t>
+              <w:t>3. Estimación de parámetros</w:t>
             </w:r>
             <w:r>
               <w:rPr>
                 <w:noProof/>
+                <w:webHidden/>
               </w:rPr>
               <w:tab/>
             </w:r>
             <w:r>
               <w:rPr>
                 <w:noProof/>
+                <w:webHidden/>
               </w:rPr>
               <w:fldChar w:fldCharType="begin"/>
             </w:r>
             <w:r>
               <w:rPr>
                 <w:noProof/>
-              </w:rPr>
-              <w:instrText xml:space="preserve"> PAGEREF _Toc242557115 \h </w:instrText>
+                <w:webHidden/>
+              </w:rPr>
+              <w:instrText xml:space="preserve"> PAGEREF _Toc242598457 \h </w:instrText>
             </w:r>
             <w:r>
               <w:rPr>
                 <w:noProof/>
+                <w:webHidden/>
               </w:rPr>
             </w:r>
             <w:r>
               <w:rPr>
                 <w:noProof/>
+                <w:webHidden/>
               </w:rPr>
               <w:fldChar w:fldCharType="separate"/>
             </w:r>
             <w:r>
               <w:rPr>
                 <w:noProof/>
+                <w:webHidden/>
               </w:rPr>
               <w:t>3</w:t>
             </w:r>
             <w:r>
               <w:rPr>
                 <w:noProof/>
+                <w:webHidden/>
               </w:rPr>
               <w:fldChar w:fldCharType="end"/>
             </w:r>
@@ -1531,57 +1606,69 @@
             <w:tabs>
               <w:tab w:val="right" w:leader="dot" w:pos="9062"/>
             </w:tabs>
-            <w:jc w:val="both"/>
             <w:rPr>
+              <w:rFonts w:asciiTheme="minorHAnsi" w:eastAsiaTheme="minorEastAsia" w:hAnsiTheme="minorHAnsi" w:cstheme="minorBidi"/>
               <w:noProof/>
+              <w:color w:val="auto"/>
+              <w:kern w:val="2"/>
+              <w:sz w:val="24"/>
+              <w:szCs w:val="24"/>
+              <w14:ligatures w14:val="standardContextual"/>
             </w:rPr>
           </w:pPr>
-          <w:hyperlink w:anchor="_Toc242557116" w:history="1">
+          <w:hyperlink w:anchor="_Toc242598458" w:history="1">
             <w:r>
               <w:rPr>
                 <w:rStyle w:val="Hipervnculo"/>
                 <w:noProof/>
               </w:rPr>
-              <w:t>3. Estimación de parámetros</w:t>
+              <w:t>4. Pruebas de hipótesis</w:t>
             </w:r>
             <w:r>
               <w:rPr>
                 <w:noProof/>
+                <w:webHidden/>
               </w:rPr>
               <w:tab/>
             </w:r>
             <w:r>
               <w:rPr>
                 <w:noProof/>
+                <w:webHidden/>
               </w:rPr>
               <w:fldChar w:fldCharType="begin"/>
             </w:r>
             <w:r>
               <w:rPr>
                 <w:noProof/>
-              </w:rPr>
-              <w:instrText xml:space="preserve"> PAGEREF _Toc242557116 \h </w:instrText>
+                <w:webHidden/>
+              </w:rPr>
+              <w:instrText xml:space="preserve"> PAGEREF _Toc242598458 \h </w:instrText>
             </w:r>
             <w:r>
               <w:rPr>
                 <w:noProof/>
+                <w:webHidden/>
               </w:rPr>
             </w:r>
             <w:r>
               <w:rPr>
                 <w:noProof/>
+                <w:webHidden/>
               </w:rPr>
               <w:fldChar w:fldCharType="separate"/>
             </w:r>
             <w:r>
               <w:rPr>
                 <w:noProof/>
+                <w:webHidden/>
               </w:rPr>
               <w:t>4</w:t>
             </w:r>
             <w:r>
               <w:rPr>
                 <w:noProof/>
+                <w:webHidden/>
               </w:rPr>
               <w:fldChar w:fldCharType="end"/>
             </w:r>
@@ -1593,57 +1680,69 @@
             <w:tabs>
               <w:tab w:val="right" w:leader="dot" w:pos="9062"/>
             </w:tabs>
-            <w:jc w:val="both"/>
             <w:rPr>
+              <w:rFonts w:asciiTheme="minorHAnsi" w:eastAsiaTheme="minorEastAsia" w:hAnsiTheme="minorHAnsi" w:cstheme="minorBidi"/>
               <w:noProof/>
+              <w:color w:val="auto"/>
+              <w:kern w:val="2"/>
+              <w:sz w:val="24"/>
+              <w:szCs w:val="24"/>
+              <w14:ligatures w14:val="standardContextual"/>
             </w:rPr>
           </w:pPr>
-          <w:hyperlink w:anchor="_Toc242557117" w:history="1">
+          <w:hyperlink w:anchor="_Toc242598459" w:history="1">
             <w:r>
               <w:rPr>
                 <w:rStyle w:val="Hipervnculo"/>
                 <w:noProof/>
               </w:rPr>
-              <w:t>4. Pruebas de hipótesis</w:t>
+              <w:t>5. Informe de avance del proyecto</w:t>
             </w:r>
             <w:r>
               <w:rPr>
                 <w:noProof/>
+                <w:webHidden/>
               </w:rPr>
               <w:tab/>
             </w:r>
             <w:r>
               <w:rPr>
                 <w:noProof/>
+                <w:webHidden/>
               </w:rPr>
               <w:fldChar w:fldCharType="begin"/>
             </w:r>
             <w:r>
               <w:rPr>
                 <w:noProof/>
-              </w:rPr>
-              <w:instrText xml:space="preserve"> PAGEREF _Toc242557117 \h </w:instrText>
+                <w:webHidden/>
+              </w:rPr>
+              <w:instrText xml:space="preserve"> PAGEREF _Toc242598459 \h </w:instrText>
             </w:r>
             <w:r>
               <w:rPr>
                 <w:noProof/>
+                <w:webHidden/>
               </w:rPr>
             </w:r>
             <w:r>
               <w:rPr>
                 <w:noProof/>
+                <w:webHidden/>
               </w:rPr>
               <w:fldChar w:fldCharType="separate"/>
             </w:r>
             <w:r>
               <w:rPr>
                 <w:noProof/>
+                <w:webHidden/>
               </w:rPr>
               <w:t>5</w:t>
             </w:r>
             <w:r>
               <w:rPr>
                 <w:noProof/>
+                <w:webHidden/>
               </w:rPr>
               <w:fldChar w:fldCharType="end"/>
             </w:r>
@@ -1655,57 +1754,69 @@
             <w:tabs>
               <w:tab w:val="right" w:leader="dot" w:pos="9062"/>
             </w:tabs>
-            <w:jc w:val="both"/>
             <w:rPr>
+              <w:rFonts w:asciiTheme="minorHAnsi" w:eastAsiaTheme="minorEastAsia" w:hAnsiTheme="minorHAnsi" w:cstheme="minorBidi"/>
               <w:noProof/>
+              <w:color w:val="auto"/>
+              <w:kern w:val="2"/>
+              <w:sz w:val="24"/>
+              <w:szCs w:val="24"/>
+              <w14:ligatures w14:val="standardContextual"/>
             </w:rPr>
           </w:pPr>
-          <w:hyperlink w:anchor="_Toc242557118" w:history="1">
+          <w:hyperlink w:anchor="_Toc242598460" w:history="1">
             <w:r>
               <w:rPr>
                 <w:rStyle w:val="Hipervnculo"/>
                 <w:noProof/>
               </w:rPr>
-              <w:t>5. Informe de avance del proyecto</w:t>
+              <w:t>6. Notebook y repositorio GitHub</w:t>
             </w:r>
             <w:r>
               <w:rPr>
                 <w:noProof/>
+                <w:webHidden/>
               </w:rPr>
               <w:tab/>
             </w:r>
             <w:r>
               <w:rPr>
                 <w:noProof/>
+                <w:webHidden/>
               </w:rPr>
               <w:fldChar w:fldCharType="begin"/>
             </w:r>
             <w:r>
               <w:rPr>
                 <w:noProof/>
-              </w:rPr>
-              <w:instrText xml:space="preserve"> PAGEREF _Toc242557118 \h </w:instrText>
+                <w:webHidden/>
+              </w:rPr>
+              <w:instrText xml:space="preserve"> PAGEREF _Toc242598460 \h </w:instrText>
             </w:r>
             <w:r>
               <w:rPr>
                 <w:noProof/>
+                <w:webHidden/>
               </w:rPr>
             </w:r>
             <w:r>
               <w:rPr>
                 <w:noProof/>
+                <w:webHidden/>
               </w:rPr>
               <w:fldChar w:fldCharType="separate"/>
             </w:r>
             <w:r>
               <w:rPr>
                 <w:noProof/>
-              </w:rPr>
-              <w:t>6</w:t>
+                <w:webHidden/>
+              </w:rPr>
+              <w:t>5</w:t>
             </w:r>
             <w:r>
               <w:rPr>
                 <w:noProof/>
+                <w:webHidden/>
               </w:rPr>
               <w:fldChar w:fldCharType="end"/>
             </w:r>
@@ -1717,129 +1828,81 @@
             <w:tabs>
               <w:tab w:val="right" w:leader="dot" w:pos="9062"/>
             </w:tabs>
-            <w:jc w:val="both"/>
             <w:rPr>
+              <w:rFonts w:asciiTheme="minorHAnsi" w:eastAsiaTheme="minorEastAsia" w:hAnsiTheme="minorHAnsi" w:cstheme="minorBidi"/>
               <w:noProof/>
+              <w:color w:val="auto"/>
+              <w:kern w:val="2"/>
+              <w:sz w:val="24"/>
+              <w:szCs w:val="24"/>
+              <w14:ligatures w14:val="standardContextual"/>
             </w:rPr>
           </w:pPr>
-          <w:hyperlink w:anchor="_Toc242557119" w:history="1">
+          <w:hyperlink w:anchor="_Toc242598461" w:history="1">
             <w:r>
               <w:rPr>
                 <w:rStyle w:val="Hipervnculo"/>
                 <w:noProof/>
               </w:rPr>
-              <w:t>6. Notebook y repositorio GitHub</w:t>
+              <w:t>7. Bibliografía (APA 7)</w:t>
             </w:r>
             <w:r>
               <w:rPr>
                 <w:noProof/>
+                <w:webHidden/>
               </w:rPr>
               <w:tab/>
             </w:r>
             <w:r>
               <w:rPr>
                 <w:noProof/>
+                <w:webHidden/>
               </w:rPr>
               <w:fldChar w:fldCharType="begin"/>
             </w:r>
             <w:r>
               <w:rPr>
                 <w:noProof/>
-              </w:rPr>
-              <w:instrText xml:space="preserve"> PAGEREF _Toc242557119 \h </w:instrText>
+                <w:webHidden/>
+              </w:rPr>
+              <w:instrText xml:space="preserve"> PAGEREF _Toc242598461 \h </w:instrText>
             </w:r>
             <w:r>
               <w:rPr>
                 <w:noProof/>
+                <w:webHidden/>
               </w:rPr>
             </w:r>
             <w:r>
               <w:rPr>
                 <w:noProof/>
+                <w:webHidden/>
               </w:rPr>
               <w:fldChar w:fldCharType="separate"/>
             </w:r>
             <w:r>
               <w:rPr>
                 <w:noProof/>
-              </w:rPr>
-              <w:t>6</w:t>
+                <w:webHidden/>
+              </w:rPr>
+              <w:t>5</w:t>
             </w:r>
             <w:r>
               <w:rPr>
                 <w:noProof/>
+                <w:webHidden/>
               </w:rPr>
               <w:fldChar w:fldCharType="end"/>
             </w:r>
           </w:hyperlink>
         </w:p>
         <w:p>
-          <w:pPr>
-            <w:pStyle w:val="TDC1"/>
-            <w:tabs>
-              <w:tab w:val="right" w:leader="dot" w:pos="9062"/>
-            </w:tabs>
-            <w:jc w:val="both"/>
+          <w:r>
             <w:rPr>
-              <w:noProof/>
+              <w:b/>
+              <w:bCs/>
+              <w:lang w:val="es-ES"/>
             </w:rPr>
-          </w:pPr>
-          <w:hyperlink w:anchor="_Toc242557120" w:history="1">
-            <w:r>
-              <w:rPr>
-                <w:rStyle w:val="Hipervnculo"/>
-                <w:noProof/>
-              </w:rPr>
-              <w:t>7. Bibliografía (APA 7)</w:t>
-            </w:r>
-            <w:r>
-              <w:rPr>
-                <w:noProof/>
-              </w:rPr>
-              <w:tab/>
-            </w:r>
-            <w:r>
-              <w:rPr>
-                <w:noProof/>
-              </w:rPr>
-              <w:fldChar w:fldCharType="begin"/>
-            </w:r>
-            <w:r>
-              <w:rPr>
-                <w:noProof/>
-              </w:rPr>
-              <w:instrText xml:space="preserve"> PAGEREF _Toc242557120 \h </w:instrText>
-            </w:r>
-            <w:r>
-              <w:rPr>
-                <w:noProof/>
-              </w:rPr>
-            </w:r>
-            <w:r>
-              <w:rPr>
-                <w:noProof/>
-              </w:rPr>
-              <w:fldChar w:fldCharType="separate"/>
-            </w:r>
-            <w:r>
-              <w:rPr>
-                <w:noProof/>
-              </w:rPr>
-              <w:t>6</w:t>
-            </w:r>
-            <w:r>
-              <w:rPr>
-                <w:noProof/>
-              </w:rPr>
-              <w:fldChar w:fldCharType="end"/>
-            </w:r>
-          </w:hyperlink>
-        </w:p>
-        <w:p>
-          <w:pPr>
-            <w:jc w:val="both"/>
-          </w:pPr>
-          <w:r>
             <w:fldChar w:fldCharType="end"/>
           </w:r>
         </w:p>
@@ -1847,95 +1910,22 @@
     </w:sdt>
     <w:p>
       <w:pPr>
+        <w:jc w:val="both"/>
+      </w:pPr>
+    </w:p>
+    <w:p>
+      <w:pPr>
         <w:pStyle w:val="Ttulo1"/>
-        <w:jc w:val="both"/>
-      </w:pPr>
-      <w:bookmarkStart w:id="1" w:name="_Toc242557114"/>
-    </w:p>
-    <w:p>
-      <w:pPr>
-        <w:pStyle w:val="Ttulo1"/>
-        <w:jc w:val="both"/>
-      </w:pPr>
-    </w:p>
-    <w:p>
-      <w:pPr>
-        <w:pStyle w:val="Ttulo1"/>
-        <w:jc w:val="both"/>
-      </w:pPr>
-    </w:p>
-    <w:p>
-      <w:pPr>
-        <w:pStyle w:val="Ttulo1"/>
-        <w:jc w:val="both"/>
-      </w:pPr>
-    </w:p>
-    <w:p>
-      <w:pPr>
-        <w:pStyle w:val="Ttulo1"/>
-        <w:jc w:val="both"/>
-      </w:pPr>
-    </w:p>
-    <w:p>
-      <w:pPr>
-        <w:pStyle w:val="Ttulo1"/>
-        <w:jc w:val="both"/>
-      </w:pPr>
-    </w:p>
-    <w:p>
-      <w:pPr>
-        <w:pStyle w:val="Ttulo1"/>
-        <w:jc w:val="both"/>
-      </w:pPr>
-    </w:p>
-    <w:p>
-      <w:pPr>
-        <w:pStyle w:val="Ttulo1"/>
-        <w:jc w:val="both"/>
-      </w:pPr>
-    </w:p>
-    <w:p>
-      <w:pPr>
-        <w:pStyle w:val="Ttulo1"/>
-        <w:jc w:val="both"/>
-      </w:pPr>
-    </w:p>
-    <w:p>
-      <w:pPr>
-        <w:pStyle w:val="Ttulo1"/>
-        <w:jc w:val="both"/>
-      </w:pPr>
-    </w:p>
-    <w:p>
-      <w:pPr>
-        <w:pStyle w:val="Ttulo1"/>
-        <w:jc w:val="both"/>
-      </w:pPr>
-    </w:p>
-    <w:p>
-      <w:pPr>
-        <w:pStyle w:val="Ttulo1"/>
-        <w:jc w:val="both"/>
-      </w:pPr>
-    </w:p>
-    <w:p>
-      <w:pPr>
-        <w:pStyle w:val="Ttulo1"/>
-        <w:jc w:val="both"/>
-      </w:pPr>
-    </w:p>
-    <w:p>
-      <w:pPr>
-        <w:pStyle w:val="Ttulo1"/>
-      </w:pPr>
-      <w:r>
-        <w:lastRenderedPageBreak/>
-        <w:t xml:space="preserve">1. Preparación y carga de </w:t>
-      </w:r>
-      <w:r>
-        <w:t>datos</w:t>
-      </w:r>
+      </w:pPr>
+      <w:bookmarkStart w:id="0" w:name="_Toc242557114"/>
+      <w:bookmarkStart w:id="1" w:name="_Toc242598244"/>
+      <w:bookmarkStart w:id="2" w:name="_Toc242598455"/>
+      <w:r>
+        <w:t>1. Preparación y carga de datos</w:t>
+      </w:r>
+      <w:bookmarkEnd w:id="0"/>
       <w:bookmarkEnd w:id="1"/>
+      <w:bookmarkEnd w:id="2"/>
     </w:p>
     <w:p>
       <w:pPr>
@@ -2014,21 +2004,7 @@
         <w:rPr>
           <w:sz w:val="21"/>
         </w:rPr>
-        <w:t xml:space="preserve"> (</w:t>
-      </w:r>
-      <w:proofErr w:type="spellStart"/>
-      <w:r>
-        <w:rPr>
-          <w:sz w:val="21"/>
-        </w:rPr>
-        <w:t>Sakar</w:t>
-      </w:r>
-      <w:proofErr w:type="spellEnd"/>
-      <w:r>
-        <w:rPr>
-          <w:sz w:val="21"/>
-        </w:rPr>
-        <w:t xml:space="preserve"> &amp; </w:t>
+        <w:t xml:space="preserve"> (Sakar &amp; </w:t>
       </w:r>
       <w:proofErr w:type="spellStart"/>
       <w:r>
@@ -2081,13 +2057,7 @@
         <w:rPr>
           <w:sz w:val="21"/>
         </w:rPr>
-        <w:t xml:space="preserve"> de navegación (unidad</w:t>
-      </w:r>
-      <w:r>
-        <w:rPr>
-          <w:sz w:val="21"/>
-        </w:rPr>
-        <w:t xml:space="preserve"> de análisis) y </w:t>
+        <w:t xml:space="preserve"> de navegación (unidad de análisis) y </w:t>
       </w:r>
       <w:r>
         <w:rPr>
@@ -2100,13 +2070,7 @@
         <w:rPr>
           <w:sz w:val="21"/>
         </w:rPr>
-        <w:t>: 10 cuantitativas de comportamiento de navegación (páginas visitadas, duración, tasas de rebote y salida, valor de página y proximidad a fechas especiales), 7 cualitativas (mes, sistema operativo, navegador, región, tipo de trá</w:t>
-      </w:r>
-      <w:r>
-        <w:rPr>
-          <w:sz w:val="21"/>
-        </w:rPr>
-        <w:t xml:space="preserve">fico, tipo de visitante y fin de semana) y la variable de resultado </w:t>
+        <w:t xml:space="preserve">: 10 cuantitativas de comportamiento de navegación (páginas visitadas, duración, tasas de rebote y salida, valor de página y proximidad a fechas especiales), 7 cualitativas (mes, sistema operativo, navegador, región, tipo de tráfico, tipo de visitante y fin de semana) y la variable de resultado </w:t>
       </w:r>
       <w:proofErr w:type="spellStart"/>
       <w:r>
@@ -2214,13 +2178,7 @@
         <w:rPr>
           <w:sz w:val="21"/>
         </w:rPr>
-        <w:t xml:space="preserve"> están alm</w:t>
-      </w:r>
-      <w:r>
-        <w:rPr>
-          <w:sz w:val="21"/>
-        </w:rPr>
-        <w:t xml:space="preserve">acenadas como enteros, pero son códigos de categorías (cualitativas nominales), por lo que no se les calcula media. </w:t>
+        <w:t xml:space="preserve"> están almacenadas como enteros, pero son códigos de categorías (cualitativas nominales), por lo que no se les calcula media. </w:t>
       </w:r>
       <w:proofErr w:type="spellStart"/>
       <w:r>
@@ -2264,14 +2222,7 @@
           <w:b/>
           <w:sz w:val="18"/>
         </w:rPr>
-        <w:t>Tabla 1. Reporte inicial de calidad de los dat</w:t>
-      </w:r>
-      <w:r>
-        <w:rPr>
-          <w:b/>
-          <w:sz w:val="18"/>
-        </w:rPr>
-        <w:t>os</w:t>
+        <w:t>Tabla 1. Reporte inicial de calidad de los datos</w:t>
       </w:r>
     </w:p>
     <w:tbl>
@@ -2291,12 +2242,6 @@
         <w:gridCol w:w="3175"/>
       </w:tblGrid>
       <w:tr>
-        <w:tblPrEx>
-          <w:tblCellMar>
-            <w:top w:w="0" w:type="dxa"/>
-            <w:bottom w:w="0" w:type="dxa"/>
-          </w:tblCellMar>
-        </w:tblPrEx>
         <w:trPr>
           <w:jc w:val="center"/>
         </w:trPr>
@@ -2371,12 +2316,6 @@
         </w:tc>
       </w:tr>
       <w:tr>
-        <w:tblPrEx>
-          <w:tblCellMar>
-            <w:top w:w="0" w:type="dxa"/>
-            <w:bottom w:w="0" w:type="dxa"/>
-          </w:tblCellMar>
-        </w:tblPrEx>
         <w:trPr>
           <w:jc w:val="center"/>
         </w:trPr>
@@ -2448,12 +2387,6 @@
         </w:tc>
       </w:tr>
       <w:tr>
-        <w:tblPrEx>
-          <w:tblCellMar>
-            <w:top w:w="0" w:type="dxa"/>
-            <w:bottom w:w="0" w:type="dxa"/>
-          </w:tblCellMar>
-        </w:tblPrEx>
         <w:trPr>
           <w:jc w:val="center"/>
         </w:trPr>
@@ -2525,12 +2458,6 @@
         </w:tc>
       </w:tr>
       <w:tr>
-        <w:tblPrEx>
-          <w:tblCellMar>
-            <w:top w:w="0" w:type="dxa"/>
-            <w:bottom w:w="0" w:type="dxa"/>
-          </w:tblCellMar>
-        </w:tblPrEx>
         <w:trPr>
           <w:jc w:val="center"/>
         </w:trPr>
@@ -2616,12 +2543,6 @@
         </w:tc>
       </w:tr>
       <w:tr>
-        <w:tblPrEx>
-          <w:tblCellMar>
-            <w:top w:w="0" w:type="dxa"/>
-            <w:bottom w:w="0" w:type="dxa"/>
-          </w:tblCellMar>
-        </w:tblPrEx>
         <w:trPr>
           <w:jc w:val="center"/>
         </w:trPr>
@@ -2756,11 +2677,15 @@
         <w:pStyle w:val="Ttulo1"/>
         <w:jc w:val="both"/>
       </w:pPr>
-      <w:bookmarkStart w:id="2" w:name="_Toc242557115"/>
+      <w:bookmarkStart w:id="3" w:name="_Toc242557115"/>
+      <w:bookmarkStart w:id="4" w:name="_Toc242598245"/>
+      <w:bookmarkStart w:id="5" w:name="_Toc242598456"/>
       <w:r>
         <w:t>2. Análisis exploratorio de datos</w:t>
       </w:r>
-      <w:bookmarkEnd w:id="2"/>
+      <w:bookmarkEnd w:id="3"/>
+      <w:bookmarkEnd w:id="4"/>
+      <w:bookmarkEnd w:id="5"/>
     </w:p>
     <w:p>
       <w:pPr>
@@ -2888,12 +2813,6 @@
         <w:gridCol w:w="1134"/>
       </w:tblGrid>
       <w:tr>
-        <w:tblPrEx>
-          <w:tblCellMar>
-            <w:top w:w="0" w:type="dxa"/>
-            <w:bottom w:w="0" w:type="dxa"/>
-          </w:tblCellMar>
-        </w:tblPrEx>
         <w:trPr>
           <w:jc w:val="center"/>
         </w:trPr>
@@ -2939,14 +2858,7 @@
                 <w:b/>
                 <w:sz w:val="17"/>
               </w:rPr>
-              <w:t>M</w:t>
-            </w:r>
-            <w:r>
-              <w:rPr>
-                <w:b/>
-                <w:sz w:val="17"/>
-              </w:rPr>
-              <w:t>edia</w:t>
+              <w:t>Media</w:t>
             </w:r>
           </w:p>
         </w:tc>
@@ -2987,21 +2899,12 @@
             <w:pPr>
               <w:jc w:val="both"/>
             </w:pPr>
-            <w:proofErr w:type="spellStart"/>
             <w:r>
               <w:rPr>
                 <w:b/>
                 <w:sz w:val="17"/>
               </w:rPr>
-              <w:t>Desv</w:t>
-            </w:r>
-            <w:proofErr w:type="spellEnd"/>
-            <w:r>
-              <w:rPr>
-                <w:b/>
-                <w:sz w:val="17"/>
-              </w:rPr>
-              <w:t xml:space="preserve">. </w:t>
+              <w:t xml:space="preserve">Desv. </w:t>
             </w:r>
             <w:proofErr w:type="spellStart"/>
             <w:r>
@@ -3069,12 +2972,6 @@
         </w:tc>
       </w:tr>
       <w:tr>
-        <w:tblPrEx>
-          <w:tblCellMar>
-            <w:top w:w="0" w:type="dxa"/>
-            <w:bottom w:w="0" w:type="dxa"/>
-          </w:tblCellMar>
-        </w:tblPrEx>
         <w:trPr>
           <w:jc w:val="center"/>
         </w:trPr>
@@ -3214,12 +3111,6 @@
         </w:tc>
       </w:tr>
       <w:tr>
-        <w:tblPrEx>
-          <w:tblCellMar>
-            <w:top w:w="0" w:type="dxa"/>
-            <w:bottom w:w="0" w:type="dxa"/>
-          </w:tblCellMar>
-        </w:tblPrEx>
         <w:trPr>
           <w:jc w:val="center"/>
         </w:trPr>
@@ -3365,12 +3256,6 @@
         </w:tc>
       </w:tr>
       <w:tr>
-        <w:tblPrEx>
-          <w:tblCellMar>
-            <w:top w:w="0" w:type="dxa"/>
-            <w:bottom w:w="0" w:type="dxa"/>
-          </w:tblCellMar>
-        </w:tblPrEx>
         <w:trPr>
           <w:jc w:val="center"/>
         </w:trPr>
@@ -3510,12 +3395,6 @@
         </w:tc>
       </w:tr>
       <w:tr>
-        <w:tblPrEx>
-          <w:tblCellMar>
-            <w:top w:w="0" w:type="dxa"/>
-            <w:bottom w:w="0" w:type="dxa"/>
-          </w:tblCellMar>
-        </w:tblPrEx>
         <w:trPr>
           <w:jc w:val="center"/>
         </w:trPr>
@@ -3655,12 +3534,6 @@
         </w:tc>
       </w:tr>
       <w:tr>
-        <w:tblPrEx>
-          <w:tblCellMar>
-            <w:top w:w="0" w:type="dxa"/>
-            <w:bottom w:w="0" w:type="dxa"/>
-          </w:tblCellMar>
-        </w:tblPrEx>
         <w:trPr>
           <w:jc w:val="center"/>
         </w:trPr>
@@ -3882,13 +3755,7 @@
         <w:rPr>
           <w:sz w:val="21"/>
         </w:rPr>
-        <w:t xml:space="preserve"> (r = 0,861): cada par contiene información en gran parte redundan</w:t>
-      </w:r>
-      <w:r>
-        <w:rPr>
-          <w:sz w:val="21"/>
-        </w:rPr>
-        <w:t xml:space="preserve">te, lo que deberá considerarse por multicolinealidad al modelar. Respecto de </w:t>
+        <w:t xml:space="preserve"> (r = 0,861): cada par contiene información en gran parte redundante, lo que deberá considerarse por multicolinealidad al modelar. Respecto de </w:t>
       </w:r>
       <w:proofErr w:type="spellStart"/>
       <w:r>
@@ -3945,13 +3812,7 @@
         <w:rPr>
           <w:sz w:val="21"/>
         </w:rPr>
-        <w:t xml:space="preserve">Entre las variables </w:t>
-      </w:r>
-      <w:r>
-        <w:rPr>
-          <w:sz w:val="21"/>
-        </w:rPr>
-        <w:t xml:space="preserve">categóricas, la proporción de compra varía según el mes (máximo en noviembre, 25,4 %, y mínimo en febrero, 1,6 %) y según el tipo de visitante: los </w:t>
+        <w:t xml:space="preserve">Entre las variables categóricas, la proporción de compra varía según el mes (máximo en noviembre, 25,4 %, y mínimo en febrero, 1,6 %) y según el tipo de visitante: los </w:t>
       </w:r>
       <w:r>
         <w:rPr>
@@ -3977,13 +3838,7 @@
         <w:rPr>
           <w:sz w:val="21"/>
         </w:rPr>
-        <w:t xml:space="preserve"> (Figura 1). Las s</w:t>
-      </w:r>
-      <w:r>
-        <w:rPr>
-          <w:sz w:val="21"/>
-        </w:rPr>
-        <w:t>esiones de fin de semana muestran una conversión levemente mayor (17,4 % vs. 14,9 %).</w:t>
+        <w:t xml:space="preserve"> (Figura 1). Las sesiones de fin de semana muestran una conversión levemente mayor (17,4 % vs. 14,9 %).</w:t>
       </w:r>
     </w:p>
     <w:p>
@@ -3996,7 +3851,6 @@
         <w:rPr>
           <w:noProof/>
         </w:rPr>
-        <w:lastRenderedPageBreak/>
         <w:drawing>
           <wp:inline distT="0" distB="0" distL="0" distR="0" wp14:anchorId="60B8C886" wp14:editId="2BF1A236">
             <wp:extent cx="5760000" cy="2160000"/>
@@ -4013,7 +3867,7 @@
                     <pic:cNvPicPr/>
                   </pic:nvPicPr>
                   <pic:blipFill>
-                    <a:blip r:embed="rId19"/>
+                    <a:blip r:embed="rId20"/>
                     <a:stretch>
                       <a:fillRect/>
                     </a:stretch>
@@ -4057,13 +3911,7 @@
         <w:rPr>
           <w:sz w:val="21"/>
         </w:rPr>
-        <w:t>La Figura 2 muestra que las sesiones con compra</w:t>
-      </w:r>
-      <w:r>
-        <w:rPr>
-          <w:sz w:val="21"/>
-        </w:rPr>
-        <w:t xml:space="preserve"> tienen valores de </w:t>
+        <w:t xml:space="preserve">La Figura 2 muestra que las sesiones con compra tienen valores de </w:t>
       </w:r>
       <w:proofErr w:type="spellStart"/>
       <w:r>
@@ -4107,7 +3955,7 @@
                     <pic:cNvPicPr/>
                   </pic:nvPicPr>
                   <pic:blipFill>
-                    <a:blip r:embed="rId20"/>
+                    <a:blip r:embed="rId21"/>
                     <a:stretch>
                       <a:fillRect/>
                     </a:stretch>
@@ -4175,15 +4023,7 @@
           <w:color w:val="404040"/>
           <w:sz w:val="18"/>
         </w:rPr>
-        <w:t xml:space="preserve"> según resultad</w:t>
-      </w:r>
-      <w:r>
-        <w:rPr>
-          <w:i/>
-          <w:color w:val="404040"/>
-          <w:sz w:val="18"/>
-        </w:rPr>
-        <w:t>o de la sesión.</w:t>
+        <w:t xml:space="preserve"> según resultado de la sesión.</w:t>
       </w:r>
     </w:p>
     <w:p>
@@ -4191,11 +4031,15 @@
         <w:pStyle w:val="Ttulo1"/>
         <w:jc w:val="both"/>
       </w:pPr>
-      <w:bookmarkStart w:id="3" w:name="_Toc242557116"/>
+      <w:bookmarkStart w:id="6" w:name="_Toc242557116"/>
+      <w:bookmarkStart w:id="7" w:name="_Toc242598246"/>
+      <w:bookmarkStart w:id="8" w:name="_Toc242598457"/>
       <w:r>
         <w:t>3. Estimación de parámetros</w:t>
       </w:r>
-      <w:bookmarkEnd w:id="3"/>
+      <w:bookmarkEnd w:id="6"/>
+      <w:bookmarkEnd w:id="7"/>
+      <w:bookmarkEnd w:id="8"/>
     </w:p>
     <w:p>
       <w:pPr>
@@ -4234,13 +4078,7 @@
         <w:rPr>
           <w:sz w:val="21"/>
         </w:rPr>
-        <w:t>, intensidad de exploración), el valor de pági</w:t>
-      </w:r>
-      <w:r>
-        <w:rPr>
-          <w:sz w:val="21"/>
-        </w:rPr>
-        <w:t>na (</w:t>
+        <w:t>, intensidad de exploración), el valor de página (</w:t>
       </w:r>
       <w:proofErr w:type="spellStart"/>
       <w:r>
@@ -4291,17 +4129,8 @@
           <w:b/>
           <w:sz w:val="21"/>
         </w:rPr>
-        <w:t xml:space="preserve">t de </w:t>
-      </w:r>
-      <w:proofErr w:type="spellStart"/>
-      <w:r>
-        <w:rPr>
-          <w:b/>
-          <w:sz w:val="21"/>
-        </w:rPr>
-        <w:t>Student</w:t>
-      </w:r>
-      <w:proofErr w:type="spellEnd"/>
+        <w:t>t de Student</w:t>
+      </w:r>
       <w:r>
         <w:rPr>
           <w:sz w:val="21"/>
@@ -4313,20 +4142,28 @@
         <w:rPr>
           <w:sz w:val="21"/>
         </w:rPr>
-        <w:t>t</w:t>
-      </w:r>
-      <w:r>
-        <w:rPr>
-          <w:sz w:val="21"/>
-        </w:rPr>
-        <w:t>(</w:t>
+        <w:t>t(</w:t>
       </w:r>
       <w:proofErr w:type="gramEnd"/>
       <w:r>
         <w:rPr>
           <w:sz w:val="21"/>
         </w:rPr>
-        <w:t>0,975; n−1)·s/√n.</w:t>
+        <w:t>0,975; n−</w:t>
+      </w:r>
+      <w:proofErr w:type="gramStart"/>
+      <w:r>
+        <w:rPr>
+          <w:sz w:val="21"/>
+        </w:rPr>
+        <w:t>1)·</w:t>
+      </w:r>
+      <w:proofErr w:type="gramEnd"/>
+      <w:r>
+        <w:rPr>
+          <w:sz w:val="21"/>
+        </w:rPr>
+        <w:t>s/√n.</w:t>
       </w:r>
     </w:p>
     <w:p>
@@ -4339,6 +4176,7 @@
           <w:b/>
           <w:sz w:val="21"/>
         </w:rPr>
+        <w:lastRenderedPageBreak/>
         <w:t>Justificación del método.</w:t>
       </w:r>
       <w:r>
@@ -4401,21 +4239,7 @@
         <w:rPr>
           <w:sz w:val="21"/>
         </w:rPr>
-        <w:t xml:space="preserve">, semilla 42; </w:t>
-      </w:r>
-      <w:proofErr w:type="spellStart"/>
-      <w:r>
-        <w:rPr>
-          <w:sz w:val="21"/>
-        </w:rPr>
-        <w:t>Efron</w:t>
-      </w:r>
-      <w:proofErr w:type="spellEnd"/>
-      <w:r>
-        <w:rPr>
-          <w:sz w:val="21"/>
-        </w:rPr>
-        <w:t xml:space="preserve"> &amp; </w:t>
+        <w:t xml:space="preserve">, semilla 42; Efron &amp; </w:t>
       </w:r>
       <w:proofErr w:type="spellStart"/>
       <w:r>
@@ -4429,13 +4253,7 @@
         <w:rPr>
           <w:sz w:val="21"/>
         </w:rPr>
-        <w:t>, 1993), que no requiere asumir normalidad de la variab</w:t>
-      </w:r>
-      <w:r>
-        <w:rPr>
-          <w:sz w:val="21"/>
-        </w:rPr>
-        <w:t>le original.</w:t>
+        <w:t>, 1993), que no requiere asumir normalidad de la variable original.</w:t>
       </w:r>
     </w:p>
     <w:p>
@@ -4471,12 +4289,6 @@
         <w:gridCol w:w="2154"/>
       </w:tblGrid>
       <w:tr>
-        <w:tblPrEx>
-          <w:tblCellMar>
-            <w:top w:w="0" w:type="dxa"/>
-            <w:bottom w:w="0" w:type="dxa"/>
-          </w:tblCellMar>
-        </w:tblPrEx>
         <w:trPr>
           <w:jc w:val="center"/>
         </w:trPr>
@@ -4613,12 +4425,6 @@
         </w:tc>
       </w:tr>
       <w:tr>
-        <w:tblPrEx>
-          <w:tblCellMar>
-            <w:top w:w="0" w:type="dxa"/>
-            <w:bottom w:w="0" w:type="dxa"/>
-          </w:tblCellMar>
-        </w:tblPrEx>
         <w:trPr>
           <w:jc w:val="center"/>
         </w:trPr>
@@ -4764,12 +4570,6 @@
         </w:tc>
       </w:tr>
       <w:tr>
-        <w:tblPrEx>
-          <w:tblCellMar>
-            <w:top w:w="0" w:type="dxa"/>
-            <w:bottom w:w="0" w:type="dxa"/>
-          </w:tblCellMar>
-        </w:tblPrEx>
         <w:trPr>
           <w:jc w:val="center"/>
         </w:trPr>
@@ -4915,12 +4715,6 @@
         </w:tc>
       </w:tr>
       <w:tr>
-        <w:tblPrEx>
-          <w:tblCellMar>
-            <w:top w:w="0" w:type="dxa"/>
-            <w:bottom w:w="0" w:type="dxa"/>
-          </w:tblCellMar>
-        </w:tblPrEx>
         <w:trPr>
           <w:jc w:val="center"/>
         </w:trPr>
@@ -5117,7 +4911,6 @@
         <w:rPr>
           <w:sz w:val="21"/>
         </w:rPr>
-        <w:lastRenderedPageBreak/>
         <w:t xml:space="preserve">• </w:t>
       </w:r>
       <w:proofErr w:type="spellStart"/>
@@ -5140,13 +4933,7 @@
         <w:rPr>
           <w:sz w:val="21"/>
         </w:rPr>
-        <w:t xml:space="preserve"> el valor medio de página está entre 5,56 y 6,22. Sin embargo, la mediana es 0 y el 77,9 % de las sesiones tie</w:t>
-      </w:r>
-      <w:r>
-        <w:rPr>
-          <w:sz w:val="21"/>
-        </w:rPr>
-        <w:t>ne valor cero: la media está impulsada por una minoría de sesiones de alto valor.</w:t>
+        <w:t xml:space="preserve"> el valor medio de página está entre 5,56 y 6,22. Sin embargo, la mediana es 0 y el 77,9 % de las sesiones tiene valor cero: la media está impulsada por una minoría de sesiones de alto valor.</w:t>
       </w:r>
     </w:p>
     <w:p>
@@ -5181,13 +4968,7 @@
         <w:rPr>
           <w:sz w:val="21"/>
         </w:rPr>
-        <w:t xml:space="preserve"> la tasa de salida media está entre 4,22 % y 4,39 %. El intervalo es estrecho principalmente por el gran tamaño muestral, que reduce el error estándar; esta preci</w:t>
-      </w:r>
-      <w:r>
-        <w:rPr>
-          <w:sz w:val="21"/>
-        </w:rPr>
-        <w:t>sión no implica baja variabilidad relativa.</w:t>
+        <w:t xml:space="preserve"> la tasa de salida media está entre 4,22 % y 4,39 %. El intervalo es estrecho principalmente por el gran tamaño muestral, que reduce el error estándar; esta precisión no implica baja variabilidad relativa.</w:t>
       </w:r>
     </w:p>
     <w:p>
@@ -5252,13 +5033,7 @@
         <w:rPr>
           <w:sz w:val="21"/>
         </w:rPr>
-        <w:t xml:space="preserve">En </w:t>
-      </w:r>
-      <w:r>
-        <w:rPr>
-          <w:sz w:val="21"/>
-        </w:rPr>
-        <w:t xml:space="preserve">las tres variables los intervalos t y </w:t>
+        <w:t xml:space="preserve">En las tres variables los intervalos t y </w:t>
       </w:r>
       <w:proofErr w:type="spellStart"/>
       <w:r>
@@ -5285,13 +5060,7 @@
         <w:rPr>
           <w:sz w:val="21"/>
         </w:rPr>
-        <w:t xml:space="preserve"> (1) en distribuciones muy asimétricas la media no representa necesariamente a la sesión típica, por lo que se reporta</w:t>
-      </w:r>
-      <w:r>
-        <w:rPr>
-          <w:sz w:val="21"/>
-        </w:rPr>
-        <w:t xml:space="preserve"> también la mediana; (2) se supone independencia entre sesiones, aunque el </w:t>
+        <w:t xml:space="preserve"> (1) en distribuciones muy asimétricas la media no representa necesariamente a la sesión típica, por lo que se reporta también la mediana; (2) se supone independencia entre sesiones, aunque el </w:t>
       </w:r>
       <w:proofErr w:type="spellStart"/>
       <w:r>
@@ -5313,11 +5082,15 @@
         <w:pStyle w:val="Ttulo1"/>
         <w:jc w:val="both"/>
       </w:pPr>
-      <w:bookmarkStart w:id="4" w:name="_Toc242557117"/>
+      <w:bookmarkStart w:id="9" w:name="_Toc242557117"/>
+      <w:bookmarkStart w:id="10" w:name="_Toc242598247"/>
+      <w:bookmarkStart w:id="11" w:name="_Toc242598458"/>
       <w:r>
         <w:t>4. Pruebas de hipótesis</w:t>
       </w:r>
-      <w:bookmarkEnd w:id="4"/>
+      <w:bookmarkEnd w:id="9"/>
+      <w:bookmarkEnd w:id="10"/>
+      <w:bookmarkEnd w:id="11"/>
     </w:p>
     <w:p>
       <w:pPr>
@@ -5328,13 +5101,7 @@
         <w:rPr>
           <w:sz w:val="21"/>
         </w:rPr>
-        <w:t>Se realizaro</w:t>
-      </w:r>
-      <w:r>
-        <w:rPr>
-          <w:sz w:val="21"/>
-        </w:rPr>
-        <w:t xml:space="preserve">n dos pruebas con nivel de significancia </w:t>
+        <w:t xml:space="preserve">Se realizaron dos pruebas con nivel de significancia </w:t>
       </w:r>
       <w:r>
         <w:rPr>
@@ -5360,13 +5127,7 @@
         <w:rPr>
           <w:b/>
         </w:rPr>
-        <w:t xml:space="preserve">4.1 Prueba 1: </w:t>
-      </w:r>
-      <w:r>
-        <w:rPr>
-          <w:b/>
-        </w:rPr>
-        <w:t>asociación entre tipo de visitante y compra</w:t>
+        <w:t>4.1 Prueba 1: asociación entre tipo de visitante y compra</w:t>
       </w:r>
     </w:p>
     <w:p>
@@ -5473,13 +5234,7 @@
         <w:rPr>
           <w:sz w:val="21"/>
         </w:rPr>
-        <w:t xml:space="preserve"> χ²</w:t>
-      </w:r>
-      <w:r>
-        <w:rPr>
-          <w:sz w:val="21"/>
-        </w:rPr>
-        <w:t xml:space="preserve"> = 135,25, </w:t>
+        <w:t xml:space="preserve"> χ² = 135,25, </w:t>
       </w:r>
       <w:proofErr w:type="spellStart"/>
       <w:r>
@@ -5561,13 +5316,7 @@
         <w:rPr>
           <w:b/>
         </w:rPr>
-        <w:t>4.2 Pr</w:t>
-      </w:r>
-      <w:r>
-        <w:rPr>
-          <w:b/>
-        </w:rPr>
-        <w:t xml:space="preserve">ueba 2: diferencia en </w:t>
+        <w:t xml:space="preserve">4.2 Prueba 2: diferencia en </w:t>
       </w:r>
       <w:proofErr w:type="spellStart"/>
       <w:r>
@@ -5641,21 +5390,7 @@
         <w:rPr>
           <w:sz w:val="21"/>
         </w:rPr>
-        <w:t xml:space="preserve"> la prueba de </w:t>
-      </w:r>
-      <w:proofErr w:type="spellStart"/>
-      <w:r>
-        <w:rPr>
-          <w:sz w:val="21"/>
-        </w:rPr>
-        <w:t>D'Agostino</w:t>
-      </w:r>
-      <w:proofErr w:type="spellEnd"/>
-      <w:r>
-        <w:rPr>
-          <w:sz w:val="21"/>
-        </w:rPr>
-        <w:t xml:space="preserve">-Pearson rechaza la normalidad en ambos grupos (p &lt; 0,001) y la de Levene rechaza la igualdad de varianzas (estadístico = 3.224,2, p &lt; 0,001). Por ello se usó la prueba no paramétrica </w:t>
+        <w:t xml:space="preserve"> la prueba de D'Agostino-Pearson rechaza la normalidad en ambos grupos (p &lt; 0,001) y la de Levene rechaza la igualdad de varianzas (estadístico = 3.224,2, p &lt; 0,001). Por ello se usó la prueba no paramétrica </w:t>
       </w:r>
       <w:r>
         <w:rPr>
@@ -5668,13 +5403,7 @@
         <w:rPr>
           <w:sz w:val="21"/>
         </w:rPr>
-        <w:t xml:space="preserve"> (Mann &amp; Whitney, 1947), con la</w:t>
-      </w:r>
-      <w:r>
-        <w:rPr>
-          <w:sz w:val="21"/>
-        </w:rPr>
-        <w:t xml:space="preserve"> </w:t>
+        <w:t xml:space="preserve"> (Mann &amp; Whitney, 1947), con la </w:t>
       </w:r>
       <w:r>
         <w:rPr>
@@ -5762,13 +5491,7 @@
         <w:rPr>
           <w:sz w:val="21"/>
         </w:rPr>
-        <w:t>. La t de Welch, usada como análisis de sensibilidad, también evidencia diferencia (t = 31,20</w:t>
-      </w:r>
-      <w:r>
-        <w:rPr>
-          <w:sz w:val="21"/>
-        </w:rPr>
-        <w:t xml:space="preserve">; </w:t>
+        <w:t xml:space="preserve">. La t de Welch, usada como análisis de sensibilidad, también evidencia diferencia (t = 31,20; </w:t>
       </w:r>
       <w:proofErr w:type="spellStart"/>
       <w:r>
@@ -5809,7 +5532,14 @@
         <w:rPr>
           <w:sz w:val="21"/>
         </w:rPr>
-        <w:t xml:space="preserve"> = 0,727). Descriptivamente, la mediana de </w:t>
+        <w:t xml:space="preserve"> = 0,727). </w:t>
+      </w:r>
+      <w:r>
+        <w:rPr>
+          <w:sz w:val="21"/>
+        </w:rPr>
+        <w:lastRenderedPageBreak/>
+        <w:t xml:space="preserve">Descriptivamente, la mediana de </w:t>
       </w:r>
       <w:proofErr w:type="spellStart"/>
       <w:r>
@@ -5838,14 +5568,7 @@
           <w:b/>
           <w:sz w:val="18"/>
         </w:rPr>
-        <w:t>Tabla 4. Resumen de las pruebas de h</w:t>
-      </w:r>
-      <w:r>
-        <w:rPr>
-          <w:b/>
-          <w:sz w:val="18"/>
-        </w:rPr>
-        <w:t>ipótesis (α = 0,05)</w:t>
+        <w:t>Tabla 4. Resumen de las pruebas de hipótesis (α = 0,05)</w:t>
       </w:r>
     </w:p>
     <w:tbl>
@@ -5867,12 +5590,6 @@
         <w:gridCol w:w="1304"/>
       </w:tblGrid>
       <w:tr>
-        <w:tblPrEx>
-          <w:tblCellMar>
-            <w:top w:w="0" w:type="dxa"/>
-            <w:bottom w:w="0" w:type="dxa"/>
-          </w:tblCellMar>
-        </w:tblPrEx>
         <w:trPr>
           <w:jc w:val="center"/>
         </w:trPr>
@@ -5993,12 +5710,6 @@
         </w:tc>
       </w:tr>
       <w:tr>
-        <w:tblPrEx>
-          <w:tblCellMar>
-            <w:top w:w="0" w:type="dxa"/>
-            <w:bottom w:w="0" w:type="dxa"/>
-          </w:tblCellMar>
-        </w:tblPrEx>
         <w:trPr>
           <w:jc w:val="center"/>
         </w:trPr>
@@ -6128,12 +5839,6 @@
         </w:tc>
       </w:tr>
       <w:tr>
-        <w:tblPrEx>
-          <w:tblCellMar>
-            <w:top w:w="0" w:type="dxa"/>
-            <w:bottom w:w="0" w:type="dxa"/>
-          </w:tblCellMar>
-        </w:tblPrEx>
         <w:trPr>
           <w:jc w:val="center"/>
         </w:trPr>
@@ -6308,13 +6013,7 @@
         <w:rPr>
           <w:sz w:val="21"/>
         </w:rPr>
-        <w:t xml:space="preserve"> es la variable más discriminante y será prioritaria en el modelamiento, aunque debe vigilarse una posible fuga de información (se calcula con pá</w:t>
-      </w:r>
-      <w:r>
-        <w:rPr>
-          <w:sz w:val="21"/>
-        </w:rPr>
-        <w:t>ginas previas a una transacción). El tipo de visitante aporta información complementaria de menor peso. Ninguno de estos resultados permite afirmar causalidad.</w:t>
+        <w:t xml:space="preserve"> es la variable más discriminante y será prioritaria en el modelamiento, aunque debe vigilarse una posible fuga de información (se calcula con páginas previas a una transacción). El tipo de visitante aporta información complementaria de menor peso. Ninguno de estos resultados permite afirmar causalidad.</w:t>
       </w:r>
     </w:p>
     <w:p>
@@ -6322,12 +6021,15 @@
         <w:pStyle w:val="Ttulo1"/>
         <w:jc w:val="both"/>
       </w:pPr>
-      <w:bookmarkStart w:id="5" w:name="_Toc242557118"/>
-      <w:r>
-        <w:lastRenderedPageBreak/>
+      <w:bookmarkStart w:id="12" w:name="_Toc242557118"/>
+      <w:bookmarkStart w:id="13" w:name="_Toc242598248"/>
+      <w:bookmarkStart w:id="14" w:name="_Toc242598459"/>
+      <w:r>
         <w:t>5. Informe de avance del proyecto</w:t>
       </w:r>
-      <w:bookmarkEnd w:id="5"/>
+      <w:bookmarkEnd w:id="12"/>
+      <w:bookmarkEnd w:id="13"/>
+      <w:bookmarkEnd w:id="14"/>
     </w:p>
     <w:p>
       <w:pPr>
@@ -6345,27 +6047,7 @@
         <w:rPr>
           <w:sz w:val="21"/>
         </w:rPr>
-        <w:t xml:space="preserve"> El proyecto busca comprender qué características de una sesión de navegación se relacionan con que esta termine en una compra, como base para anticipar la intención de compra en un sitio de comercio electrónico, problema planteado originalmente por </w:t>
-      </w:r>
-      <w:proofErr w:type="spellStart"/>
-      <w:r>
-        <w:rPr>
-          <w:sz w:val="21"/>
-        </w:rPr>
-        <w:t>Sakar</w:t>
-      </w:r>
-      <w:proofErr w:type="spellEnd"/>
-      <w:r>
-        <w:rPr>
-          <w:sz w:val="21"/>
-        </w:rPr>
-        <w:t xml:space="preserve"> </w:t>
-      </w:r>
-      <w:r>
-        <w:rPr>
-          <w:sz w:val="21"/>
-        </w:rPr>
-        <w:t>et al. (2019) con este mismo conjunto de datos.</w:t>
+        <w:t xml:space="preserve"> El proyecto busca comprender qué características de una sesión de navegación se relacionan con que esta termine en una compra, como base para anticipar la intención de compra en un sitio de comercio electrónico, problema planteado originalmente por Sakar et al. (2019) con este mismo conjunto de datos.</w:t>
       </w:r>
     </w:p>
     <w:p>
@@ -6432,13 +6114,7 @@
         <w:rPr>
           <w:sz w:val="21"/>
         </w:rPr>
-        <w:t xml:space="preserve"> es la variable más asociada a </w:t>
-      </w:r>
-      <w:r>
-        <w:rPr>
-          <w:sz w:val="21"/>
-        </w:rPr>
-        <w:t>la compra (efecto grande), seguida de las tasas de salida/rebote (relación negativa). El tipo de visitante y el mes también se asocian con la compra, con efectos menores. Existen pares de variables altamente correlacionadas.</w:t>
+        <w:t xml:space="preserve"> es la variable más asociada a la compra (efecto grande), seguida de las tasas de salida/rebote (relación negativa). El tipo de visitante y el mes también se asocian con la compra, con efectos menores. Existen pares de variables altamente correlacionadas.</w:t>
       </w:r>
     </w:p>
     <w:p>
@@ -6457,13 +6133,7 @@
         <w:rPr>
           <w:sz w:val="21"/>
         </w:rPr>
-        <w:t xml:space="preserve"> (1) Evaluar la </w:t>
-      </w:r>
-      <w:r>
-        <w:rPr>
-          <w:sz w:val="21"/>
-        </w:rPr>
-        <w:t xml:space="preserve">estabilidad de las estimaciones mediante simulación y </w:t>
+        <w:t xml:space="preserve"> (1) Evaluar la estabilidad de las estimaciones mediante simulación y </w:t>
       </w:r>
       <w:proofErr w:type="spellStart"/>
       <w:r>
@@ -6500,21 +6170,202 @@
           <w:rFonts w:ascii="Consolas" w:hAnsi="Consolas"/>
           <w:sz w:val="19"/>
         </w:rPr>
-        <w:t>PageValue</w:t>
+        <w:t>PageValues</w:t>
+      </w:r>
+      <w:proofErr w:type="spellEnd"/>
+      <w:r>
+        <w:rPr>
+          <w:sz w:val="21"/>
+        </w:rPr>
+        <w:t>.</w:t>
+      </w:r>
+    </w:p>
+    <w:p>
+      <w:pPr>
+        <w:pStyle w:val="Ttulo1"/>
+        <w:jc w:val="both"/>
+      </w:pPr>
+      <w:bookmarkStart w:id="15" w:name="_Toc242557119"/>
+      <w:bookmarkStart w:id="16" w:name="_Toc242598249"/>
+      <w:bookmarkStart w:id="17" w:name="_Toc242598460"/>
+      <w:r>
+        <w:t>6. Notebook y repositorio GitHub</w:t>
+      </w:r>
+      <w:bookmarkEnd w:id="15"/>
+      <w:bookmarkEnd w:id="16"/>
+      <w:bookmarkEnd w:id="17"/>
+    </w:p>
+    <w:p>
+      <w:pPr>
+        <w:spacing w:after="80" w:line="264" w:lineRule="auto"/>
+        <w:jc w:val="both"/>
+      </w:pPr>
+      <w:r>
+        <w:rPr>
+          <w:sz w:val="21"/>
+        </w:rPr>
+        <w:t xml:space="preserve">Todo el análisis de este informe es reproducible en el notebook </w:t>
       </w:r>
       <w:r>
         <w:rPr>
           <w:rFonts w:ascii="Consolas" w:hAnsi="Consolas"/>
           <w:sz w:val="19"/>
         </w:rPr>
-        <w:t>s</w:t>
-      </w:r>
-      <w:proofErr w:type="spellEnd"/>
-      <w:r>
-        <w:rPr>
-          <w:sz w:val="21"/>
-        </w:rPr>
-        <w:t>.</w:t>
+        <w:t>notebooks/01_exploracion_inicial.ipynb</w:t>
+      </w:r>
+      <w:r>
+        <w:rPr>
+          <w:sz w:val="21"/>
+        </w:rPr>
+        <w:t>, que se ejecuta de principio a fin con semilla fija (</w:t>
+      </w:r>
+      <w:r>
+        <w:rPr>
+          <w:rFonts w:ascii="Consolas" w:hAnsi="Consolas"/>
+          <w:sz w:val="19"/>
+        </w:rPr>
+        <w:t>RANDOM_STATE = 42</w:t>
+      </w:r>
+      <w:r>
+        <w:rPr>
+          <w:sz w:val="21"/>
+        </w:rPr>
+        <w:t xml:space="preserve">). Las dependencias están en </w:t>
+      </w:r>
+      <w:r>
+        <w:rPr>
+          <w:rFonts w:ascii="Consolas" w:hAnsi="Consolas"/>
+          <w:sz w:val="19"/>
+        </w:rPr>
+        <w:t>requirements.txt</w:t>
+      </w:r>
+      <w:r>
+        <w:rPr>
+          <w:sz w:val="21"/>
+        </w:rPr>
+        <w:t xml:space="preserve"> (pandas, </w:t>
+      </w:r>
+      <w:proofErr w:type="spellStart"/>
+      <w:r>
+        <w:rPr>
+          <w:sz w:val="21"/>
+        </w:rPr>
+        <w:t>numpy</w:t>
+      </w:r>
+      <w:proofErr w:type="spellEnd"/>
+      <w:r>
+        <w:rPr>
+          <w:sz w:val="21"/>
+        </w:rPr>
+        <w:t xml:space="preserve">, </w:t>
+      </w:r>
+      <w:proofErr w:type="spellStart"/>
+      <w:r>
+        <w:rPr>
+          <w:sz w:val="21"/>
+        </w:rPr>
+        <w:t>scipy</w:t>
+      </w:r>
+      <w:proofErr w:type="spellEnd"/>
+      <w:r>
+        <w:rPr>
+          <w:sz w:val="21"/>
+        </w:rPr>
+        <w:t xml:space="preserve">, </w:t>
+      </w:r>
+      <w:proofErr w:type="spellStart"/>
+      <w:r>
+        <w:rPr>
+          <w:sz w:val="21"/>
+        </w:rPr>
+        <w:t>matplotlib</w:t>
+      </w:r>
+      <w:proofErr w:type="spellEnd"/>
+      <w:r>
+        <w:rPr>
+          <w:sz w:val="21"/>
+        </w:rPr>
+        <w:t xml:space="preserve">, </w:t>
+      </w:r>
+      <w:proofErr w:type="spellStart"/>
+      <w:r>
+        <w:rPr>
+          <w:sz w:val="21"/>
+        </w:rPr>
+        <w:t>seaborn</w:t>
+      </w:r>
+      <w:proofErr w:type="spellEnd"/>
+      <w:r>
+        <w:rPr>
+          <w:sz w:val="21"/>
+        </w:rPr>
+        <w:t xml:space="preserve">, </w:t>
+      </w:r>
+      <w:proofErr w:type="spellStart"/>
+      <w:r>
+        <w:rPr>
+          <w:sz w:val="21"/>
+        </w:rPr>
+        <w:t>jupyter</w:t>
+      </w:r>
+      <w:proofErr w:type="spellEnd"/>
+      <w:r>
+        <w:rPr>
+          <w:sz w:val="21"/>
+        </w:rPr>
+        <w:t>). Las secciones 10 y 11 del notebook corresponden a las secciones 3 y 4 de este informe.</w:t>
+      </w:r>
+    </w:p>
+    <w:p>
+      <w:pPr>
+        <w:spacing w:after="80" w:line="264" w:lineRule="auto"/>
+        <w:jc w:val="both"/>
+      </w:pPr>
+      <w:r>
+        <w:rPr>
+          <w:sz w:val="21"/>
+        </w:rPr>
+        <w:t>Repositorio: https://github.com/vedurancisterna-alt/Estadistica_Computacional</w:t>
+      </w:r>
+    </w:p>
+    <w:p>
+      <w:pPr>
+        <w:spacing w:after="80" w:line="264" w:lineRule="auto"/>
+        <w:jc w:val="both"/>
+      </w:pPr>
+      <w:r>
+        <w:rPr>
+          <w:sz w:val="21"/>
+        </w:rPr>
+        <w:t xml:space="preserve">El análisis se realizó en Python con pandas (McKinney, 2022) y </w:t>
+      </w:r>
+      <w:proofErr w:type="spellStart"/>
+      <w:r>
+        <w:rPr>
+          <w:sz w:val="21"/>
+        </w:rPr>
+        <w:t>SciPy</w:t>
+      </w:r>
+      <w:proofErr w:type="spellEnd"/>
+      <w:r>
+        <w:rPr>
+          <w:sz w:val="21"/>
+        </w:rPr>
+        <w:t xml:space="preserve"> (</w:t>
+      </w:r>
+      <w:proofErr w:type="spellStart"/>
+      <w:r>
+        <w:rPr>
+          <w:sz w:val="21"/>
+        </w:rPr>
+        <w:t>Virtanen</w:t>
+      </w:r>
+      <w:proofErr w:type="spellEnd"/>
+      <w:r>
+        <w:rPr>
+          <w:sz w:val="21"/>
+        </w:rPr>
+        <w:t xml:space="preserve"> et al., 2020).</w:t>
       </w:r>
     </w:p>
     <w:p>
@@ -6522,221 +6373,15 @@
         <w:pStyle w:val="Ttulo1"/>
         <w:jc w:val="both"/>
       </w:pPr>
-      <w:bookmarkStart w:id="6" w:name="_Toc242557119"/>
-      <w:r>
-        <w:t>6. Notebook y repositorio GitHub</w:t>
-      </w:r>
-      <w:bookmarkEnd w:id="6"/>
-    </w:p>
-    <w:p>
-      <w:pPr>
-        <w:spacing w:after="80" w:line="264" w:lineRule="auto"/>
-        <w:jc w:val="both"/>
-      </w:pPr>
-      <w:r>
-        <w:rPr>
-          <w:sz w:val="21"/>
-        </w:rPr>
-        <w:t xml:space="preserve">Todo el análisis de este informe es reproducible en el notebook </w:t>
-      </w:r>
-      <w:r>
-        <w:rPr>
-          <w:rFonts w:ascii="Consolas" w:hAnsi="Consolas"/>
-          <w:sz w:val="19"/>
-        </w:rPr>
-        <w:t>notebooks/01_exploracion_inicial.ipynb</w:t>
-      </w:r>
-      <w:r>
-        <w:rPr>
-          <w:sz w:val="21"/>
-        </w:rPr>
-        <w:t>, que se ejecuta de principio a fin con semilla fija (</w:t>
-      </w:r>
-      <w:r>
-        <w:rPr>
-          <w:rFonts w:ascii="Consolas" w:hAnsi="Consolas"/>
-          <w:sz w:val="19"/>
-        </w:rPr>
-        <w:t>RANDOM_STATE = 42</w:t>
-      </w:r>
-      <w:r>
-        <w:rPr>
-          <w:sz w:val="21"/>
-        </w:rPr>
-        <w:t xml:space="preserve">). Las dependencias están en </w:t>
-      </w:r>
-      <w:r>
-        <w:rPr>
-          <w:rFonts w:ascii="Consolas" w:hAnsi="Consolas"/>
-          <w:sz w:val="19"/>
-        </w:rPr>
-        <w:t>requirements.txt</w:t>
-      </w:r>
-      <w:r>
-        <w:rPr>
-          <w:sz w:val="21"/>
-        </w:rPr>
-        <w:t xml:space="preserve"> (</w:t>
-      </w:r>
-      <w:r>
-        <w:rPr>
-          <w:sz w:val="21"/>
-        </w:rPr>
-        <w:t xml:space="preserve">pandas, </w:t>
-      </w:r>
-      <w:proofErr w:type="spellStart"/>
-      <w:r>
-        <w:rPr>
-          <w:sz w:val="21"/>
-        </w:rPr>
-        <w:t>numpy</w:t>
-      </w:r>
-      <w:proofErr w:type="spellEnd"/>
-      <w:r>
-        <w:rPr>
-          <w:sz w:val="21"/>
-        </w:rPr>
-        <w:t xml:space="preserve">, </w:t>
-      </w:r>
-      <w:proofErr w:type="spellStart"/>
-      <w:r>
-        <w:rPr>
-          <w:sz w:val="21"/>
-        </w:rPr>
-        <w:t>scipy</w:t>
-      </w:r>
-      <w:proofErr w:type="spellEnd"/>
-      <w:r>
-        <w:rPr>
-          <w:sz w:val="21"/>
-        </w:rPr>
-        <w:t xml:space="preserve">, </w:t>
-      </w:r>
-      <w:proofErr w:type="spellStart"/>
-      <w:r>
-        <w:rPr>
-          <w:sz w:val="21"/>
-        </w:rPr>
-        <w:t>matplotlib</w:t>
-      </w:r>
-      <w:proofErr w:type="spellEnd"/>
-      <w:r>
-        <w:rPr>
-          <w:sz w:val="21"/>
-        </w:rPr>
-        <w:t xml:space="preserve">, </w:t>
-      </w:r>
-      <w:proofErr w:type="spellStart"/>
-      <w:r>
-        <w:rPr>
-          <w:sz w:val="21"/>
-        </w:rPr>
-        <w:t>seaborn</w:t>
-      </w:r>
-      <w:proofErr w:type="spellEnd"/>
-      <w:r>
-        <w:rPr>
-          <w:sz w:val="21"/>
-        </w:rPr>
-        <w:t xml:space="preserve">, </w:t>
-      </w:r>
-      <w:proofErr w:type="spellStart"/>
-      <w:r>
-        <w:rPr>
-          <w:sz w:val="21"/>
-        </w:rPr>
-        <w:t>jupyter</w:t>
-      </w:r>
-      <w:proofErr w:type="spellEnd"/>
-      <w:r>
-        <w:rPr>
-          <w:sz w:val="21"/>
-        </w:rPr>
-        <w:t>). Las secciones 10 y 11 del notebook corresponden a las secciones 3 y 4 de este informe.</w:t>
-      </w:r>
-    </w:p>
-    <w:p>
-      <w:pPr>
-        <w:spacing w:after="80" w:line="264" w:lineRule="auto"/>
-        <w:jc w:val="both"/>
-      </w:pPr>
-      <w:r>
-        <w:rPr>
-          <w:sz w:val="21"/>
-        </w:rPr>
-        <w:t>Repositorio: https://github.com/vedurancisterna-alt/Estadistica_Computacional</w:t>
-      </w:r>
-    </w:p>
-    <w:p>
-      <w:pPr>
-        <w:spacing w:after="80" w:line="264" w:lineRule="auto"/>
-        <w:jc w:val="both"/>
-      </w:pPr>
-      <w:r>
-        <w:rPr>
-          <w:sz w:val="21"/>
-        </w:rPr>
-        <w:t>El análisis se realizó en Python con p</w:t>
-      </w:r>
-      <w:r>
-        <w:rPr>
-          <w:sz w:val="21"/>
-        </w:rPr>
-        <w:t>andas (</w:t>
-      </w:r>
-      <w:proofErr w:type="spellStart"/>
-      <w:r>
-        <w:rPr>
-          <w:sz w:val="21"/>
-        </w:rPr>
-        <w:t>McKinney</w:t>
-      </w:r>
-      <w:proofErr w:type="spellEnd"/>
-      <w:r>
-        <w:rPr>
-          <w:sz w:val="21"/>
-        </w:rPr>
-        <w:t xml:space="preserve">, 2022) y </w:t>
-      </w:r>
-      <w:proofErr w:type="spellStart"/>
-      <w:r>
-        <w:rPr>
-          <w:sz w:val="21"/>
-        </w:rPr>
-        <w:t>SciPy</w:t>
-      </w:r>
-      <w:proofErr w:type="spellEnd"/>
-      <w:r>
-        <w:rPr>
-          <w:sz w:val="21"/>
-        </w:rPr>
-        <w:t xml:space="preserve"> (</w:t>
-      </w:r>
-      <w:proofErr w:type="spellStart"/>
-      <w:r>
-        <w:rPr>
-          <w:sz w:val="21"/>
-        </w:rPr>
-        <w:t>Virtanen</w:t>
-      </w:r>
-      <w:proofErr w:type="spellEnd"/>
-      <w:r>
-        <w:rPr>
-          <w:sz w:val="21"/>
-        </w:rPr>
-        <w:t xml:space="preserve"> et al., 2020).</w:t>
-      </w:r>
-    </w:p>
-    <w:p>
-      <w:pPr>
-        <w:pStyle w:val="Ttulo1"/>
-        <w:jc w:val="both"/>
-      </w:pPr>
-      <w:bookmarkStart w:id="7" w:name="_Toc242557120"/>
+      <w:bookmarkStart w:id="18" w:name="_Toc242557120"/>
+      <w:bookmarkStart w:id="19" w:name="_Toc242598250"/>
+      <w:bookmarkStart w:id="20" w:name="_Toc242598461"/>
       <w:r>
         <w:t>7. Bibliografía (APA 7)</w:t>
       </w:r>
-      <w:bookmarkEnd w:id="7"/>
+      <w:bookmarkEnd w:id="18"/>
+      <w:bookmarkEnd w:id="19"/>
+      <w:bookmarkEnd w:id="20"/>
     </w:p>
     <w:p>
       <w:pPr>
@@ -6744,19 +6389,11 @@
         <w:ind w:left="567" w:hanging="567"/>
         <w:jc w:val="both"/>
       </w:pPr>
-      <w:proofErr w:type="spellStart"/>
-      <w:r>
-        <w:rPr>
-          <w:sz w:val="20"/>
-        </w:rPr>
-        <w:t>Efron</w:t>
-      </w:r>
-      <w:proofErr w:type="spellEnd"/>
-      <w:r>
-        <w:rPr>
-          <w:sz w:val="20"/>
-        </w:rPr>
-        <w:t xml:space="preserve">, B., &amp; </w:t>
+      <w:r>
+        <w:rPr>
+          <w:sz w:val="20"/>
+        </w:rPr>
+        <w:t xml:space="preserve">Efron, B., &amp; </w:t>
       </w:r>
       <w:proofErr w:type="spellStart"/>
       <w:r>
@@ -6907,6 +6544,20 @@
         <w:rPr>
           <w:sz w:val="20"/>
         </w:rPr>
+        <w:t xml:space="preserve"> one </w:t>
+      </w:r>
+      <w:proofErr w:type="spellStart"/>
+      <w:r>
+        <w:rPr>
+          <w:sz w:val="20"/>
+        </w:rPr>
+        <w:t>of</w:t>
+      </w:r>
+      <w:proofErr w:type="spellEnd"/>
+      <w:r>
+        <w:rPr>
+          <w:sz w:val="20"/>
+        </w:rPr>
         <w:t xml:space="preserve"> </w:t>
       </w:r>
       <w:proofErr w:type="spellStart"/>
@@ -6914,7 +6565,7 @@
         <w:rPr>
           <w:sz w:val="20"/>
         </w:rPr>
-        <w:t>one</w:t>
+        <w:t>two</w:t>
       </w:r>
       <w:proofErr w:type="spellEnd"/>
       <w:r>
@@ -6928,11 +6579,134 @@
         <w:rPr>
           <w:sz w:val="20"/>
         </w:rPr>
+        <w:t>random</w:t>
+      </w:r>
+      <w:proofErr w:type="spellEnd"/>
+      <w:r>
+        <w:rPr>
+          <w:sz w:val="20"/>
+        </w:rPr>
+        <w:t xml:space="preserve"> variables </w:t>
+      </w:r>
+      <w:proofErr w:type="spellStart"/>
+      <w:r>
+        <w:rPr>
+          <w:sz w:val="20"/>
+        </w:rPr>
+        <w:t>is</w:t>
+      </w:r>
+      <w:proofErr w:type="spellEnd"/>
+      <w:r>
+        <w:rPr>
+          <w:sz w:val="20"/>
+        </w:rPr>
+        <w:t xml:space="preserve"> </w:t>
+      </w:r>
+      <w:proofErr w:type="spellStart"/>
+      <w:r>
+        <w:rPr>
+          <w:sz w:val="20"/>
+        </w:rPr>
+        <w:t>stochastically</w:t>
+      </w:r>
+      <w:proofErr w:type="spellEnd"/>
+      <w:r>
+        <w:rPr>
+          <w:sz w:val="20"/>
+        </w:rPr>
+        <w:t xml:space="preserve"> </w:t>
+      </w:r>
+      <w:proofErr w:type="spellStart"/>
+      <w:r>
+        <w:rPr>
+          <w:sz w:val="20"/>
+        </w:rPr>
+        <w:t>larger</w:t>
+      </w:r>
+      <w:proofErr w:type="spellEnd"/>
+      <w:r>
+        <w:rPr>
+          <w:sz w:val="20"/>
+        </w:rPr>
+        <w:t xml:space="preserve"> </w:t>
+      </w:r>
+      <w:proofErr w:type="spellStart"/>
+      <w:r>
+        <w:rPr>
+          <w:sz w:val="20"/>
+        </w:rPr>
+        <w:t>than</w:t>
+      </w:r>
+      <w:proofErr w:type="spellEnd"/>
+      <w:r>
+        <w:rPr>
+          <w:sz w:val="20"/>
+        </w:rPr>
+        <w:t xml:space="preserve"> </w:t>
+      </w:r>
+      <w:proofErr w:type="spellStart"/>
+      <w:r>
+        <w:rPr>
+          <w:sz w:val="20"/>
+        </w:rPr>
+        <w:t>the</w:t>
+      </w:r>
+      <w:proofErr w:type="spellEnd"/>
+      <w:r>
+        <w:rPr>
+          <w:sz w:val="20"/>
+        </w:rPr>
+        <w:t xml:space="preserve"> </w:t>
+      </w:r>
+      <w:proofErr w:type="spellStart"/>
+      <w:r>
+        <w:rPr>
+          <w:sz w:val="20"/>
+        </w:rPr>
+        <w:t>other</w:t>
+      </w:r>
+      <w:proofErr w:type="spellEnd"/>
+      <w:r>
+        <w:rPr>
+          <w:sz w:val="20"/>
+        </w:rPr>
+        <w:t xml:space="preserve">. </w:t>
+      </w:r>
+      <w:r>
+        <w:rPr>
+          <w:i/>
+          <w:sz w:val="20"/>
+        </w:rPr>
+        <w:t xml:space="preserve">The </w:t>
+      </w:r>
+      <w:proofErr w:type="spellStart"/>
+      <w:r>
+        <w:rPr>
+          <w:i/>
+          <w:sz w:val="20"/>
+        </w:rPr>
+        <w:t>Annals</w:t>
+      </w:r>
+      <w:proofErr w:type="spellEnd"/>
+      <w:r>
+        <w:rPr>
+          <w:i/>
+          <w:sz w:val="20"/>
+        </w:rPr>
+        <w:t xml:space="preserve"> </w:t>
+      </w:r>
+      <w:proofErr w:type="spellStart"/>
+      <w:r>
+        <w:rPr>
+          <w:i/>
+          <w:sz w:val="20"/>
+        </w:rPr>
         <w:t>of</w:t>
       </w:r>
       <w:proofErr w:type="spellEnd"/>
       <w:r>
         <w:rPr>
+          <w:i/>
           <w:sz w:val="20"/>
         </w:rPr>
         <w:t xml:space="preserve"> </w:t>
@@ -6940,13 +6714,15 @@
       <w:proofErr w:type="spellStart"/>
       <w:r>
         <w:rPr>
-          <w:sz w:val="20"/>
-        </w:rPr>
-        <w:t>two</w:t>
-      </w:r>
-      <w:proofErr w:type="spellEnd"/>
-      <w:r>
-        <w:rPr>
+          <w:i/>
+          <w:sz w:val="20"/>
+        </w:rPr>
+        <w:t>Mathematical</w:t>
+      </w:r>
+      <w:proofErr w:type="spellEnd"/>
+      <w:r>
+        <w:rPr>
+          <w:i/>
           <w:sz w:val="20"/>
         </w:rPr>
         <w:t xml:space="preserve"> </w:t>
@@ -6954,114 +6730,10 @@
       <w:proofErr w:type="spellStart"/>
       <w:r>
         <w:rPr>
-          <w:sz w:val="20"/>
-        </w:rPr>
-        <w:t>random</w:t>
-      </w:r>
-      <w:proofErr w:type="spellEnd"/>
-      <w:r>
-        <w:rPr>
-          <w:sz w:val="20"/>
-        </w:rPr>
-        <w:t xml:space="preserve"> variab</w:t>
-      </w:r>
-      <w:r>
-        <w:rPr>
-          <w:sz w:val="20"/>
-        </w:rPr>
-        <w:t xml:space="preserve">les </w:t>
-      </w:r>
-      <w:proofErr w:type="spellStart"/>
-      <w:r>
-        <w:rPr>
-          <w:sz w:val="20"/>
-        </w:rPr>
-        <w:t>is</w:t>
-      </w:r>
-      <w:proofErr w:type="spellEnd"/>
-      <w:r>
-        <w:rPr>
-          <w:sz w:val="20"/>
-        </w:rPr>
-        <w:t xml:space="preserve"> </w:t>
-      </w:r>
-      <w:proofErr w:type="spellStart"/>
-      <w:r>
-        <w:rPr>
-          <w:sz w:val="20"/>
-        </w:rPr>
-        <w:t>stochastically</w:t>
-      </w:r>
-      <w:proofErr w:type="spellEnd"/>
-      <w:r>
-        <w:rPr>
-          <w:sz w:val="20"/>
-        </w:rPr>
-        <w:t xml:space="preserve"> </w:t>
-      </w:r>
-      <w:proofErr w:type="spellStart"/>
-      <w:r>
-        <w:rPr>
-          <w:sz w:val="20"/>
-        </w:rPr>
-        <w:t>larger</w:t>
-      </w:r>
-      <w:proofErr w:type="spellEnd"/>
-      <w:r>
-        <w:rPr>
-          <w:sz w:val="20"/>
-        </w:rPr>
-        <w:t xml:space="preserve"> </w:t>
-      </w:r>
-      <w:proofErr w:type="spellStart"/>
-      <w:r>
-        <w:rPr>
-          <w:sz w:val="20"/>
-        </w:rPr>
-        <w:t>than</w:t>
-      </w:r>
-      <w:proofErr w:type="spellEnd"/>
-      <w:r>
-        <w:rPr>
-          <w:sz w:val="20"/>
-        </w:rPr>
-        <w:t xml:space="preserve"> </w:t>
-      </w:r>
-      <w:proofErr w:type="spellStart"/>
-      <w:r>
-        <w:rPr>
-          <w:sz w:val="20"/>
-        </w:rPr>
-        <w:t>the</w:t>
-      </w:r>
-      <w:proofErr w:type="spellEnd"/>
-      <w:r>
-        <w:rPr>
-          <w:sz w:val="20"/>
-        </w:rPr>
-        <w:t xml:space="preserve"> </w:t>
-      </w:r>
-      <w:proofErr w:type="spellStart"/>
-      <w:r>
-        <w:rPr>
-          <w:sz w:val="20"/>
-        </w:rPr>
-        <w:t>other</w:t>
-      </w:r>
-      <w:proofErr w:type="spellEnd"/>
-      <w:r>
-        <w:rPr>
-          <w:sz w:val="20"/>
-        </w:rPr>
-        <w:t xml:space="preserve">. </w:t>
-      </w:r>
-      <w:proofErr w:type="spellStart"/>
-      <w:r>
-        <w:rPr>
           <w:i/>
           <w:sz w:val="20"/>
         </w:rPr>
-        <w:t>The</w:t>
+        <w:t>Statistics</w:t>
       </w:r>
       <w:proofErr w:type="spellEnd"/>
       <w:r>
@@ -7069,70 +6741,6 @@
           <w:i/>
           <w:sz w:val="20"/>
         </w:rPr>
-        <w:t xml:space="preserve"> </w:t>
-      </w:r>
-      <w:proofErr w:type="spellStart"/>
-      <w:r>
-        <w:rPr>
-          <w:i/>
-          <w:sz w:val="20"/>
-        </w:rPr>
-        <w:t>Annals</w:t>
-      </w:r>
-      <w:proofErr w:type="spellEnd"/>
-      <w:r>
-        <w:rPr>
-          <w:i/>
-          <w:sz w:val="20"/>
-        </w:rPr>
-        <w:t xml:space="preserve"> </w:t>
-      </w:r>
-      <w:proofErr w:type="spellStart"/>
-      <w:r>
-        <w:rPr>
-          <w:i/>
-          <w:sz w:val="20"/>
-        </w:rPr>
-        <w:t>of</w:t>
-      </w:r>
-      <w:proofErr w:type="spellEnd"/>
-      <w:r>
-        <w:rPr>
-          <w:i/>
-          <w:sz w:val="20"/>
-        </w:rPr>
-        <w:t xml:space="preserve"> </w:t>
-      </w:r>
-      <w:proofErr w:type="spellStart"/>
-      <w:r>
-        <w:rPr>
-          <w:i/>
-          <w:sz w:val="20"/>
-        </w:rPr>
-        <w:t>Mathematical</w:t>
-      </w:r>
-      <w:proofErr w:type="spellEnd"/>
-      <w:r>
-        <w:rPr>
-          <w:i/>
-          <w:sz w:val="20"/>
-        </w:rPr>
-        <w:t xml:space="preserve"> </w:t>
-      </w:r>
-      <w:proofErr w:type="spellStart"/>
-      <w:r>
-        <w:rPr>
-          <w:i/>
-          <w:sz w:val="20"/>
-        </w:rPr>
-        <w:t>Statistics</w:t>
-      </w:r>
-      <w:proofErr w:type="spellEnd"/>
-      <w:r>
-        <w:rPr>
-          <w:i/>
-          <w:sz w:val="20"/>
-        </w:rPr>
         <w:t>, 18</w:t>
       </w:r>
       <w:r>
@@ -7141,7 +6749,7 @@
         </w:rPr>
         <w:t xml:space="preserve">(1), 50–60. </w:t>
       </w:r>
-      <w:hyperlink r:id="rId21" w:history="1">
+      <w:hyperlink r:id="rId22" w:history="1">
         <w:r>
           <w:rPr>
             <w:rStyle w:val="Hipervnculo"/>
@@ -7157,19 +6765,11 @@
         <w:ind w:left="567" w:hanging="567"/>
         <w:jc w:val="both"/>
       </w:pPr>
-      <w:proofErr w:type="spellStart"/>
-      <w:r>
-        <w:rPr>
-          <w:sz w:val="20"/>
-        </w:rPr>
-        <w:t>McKinney</w:t>
-      </w:r>
-      <w:proofErr w:type="spellEnd"/>
-      <w:r>
-        <w:rPr>
-          <w:sz w:val="20"/>
-        </w:rPr>
-        <w:t xml:space="preserve">, W. (2022). </w:t>
+      <w:r>
+        <w:rPr>
+          <w:sz w:val="20"/>
+        </w:rPr>
+        <w:t xml:space="preserve">McKinney, W. (2022). </w:t>
       </w:r>
       <w:r>
         <w:rPr>
@@ -7219,19 +6819,11 @@
           <w:sz w:val="20"/>
         </w:rPr>
       </w:pPr>
-      <w:proofErr w:type="spellStart"/>
-      <w:r>
-        <w:rPr>
-          <w:sz w:val="20"/>
-        </w:rPr>
-        <w:t>Sakar</w:t>
-      </w:r>
-      <w:proofErr w:type="spellEnd"/>
-      <w:r>
-        <w:rPr>
-          <w:sz w:val="20"/>
-        </w:rPr>
-        <w:t xml:space="preserve">, C. O., &amp; </w:t>
+      <w:r>
+        <w:rPr>
+          <w:sz w:val="20"/>
+        </w:rPr>
+        <w:t xml:space="preserve">Sakar, C. O., &amp; </w:t>
       </w:r>
       <w:proofErr w:type="spellStart"/>
       <w:r>
@@ -7260,21 +6852,30 @@
           <w:i/>
           <w:sz w:val="20"/>
         </w:rPr>
-        <w:t>sho</w:t>
-      </w:r>
+        <w:t>shoppers</w:t>
+      </w:r>
+      <w:proofErr w:type="spellEnd"/>
       <w:r>
         <w:rPr>
           <w:i/>
           <w:sz w:val="20"/>
         </w:rPr>
-        <w:t>ppers</w:t>
-      </w:r>
-      <w:proofErr w:type="spellEnd"/>
+        <w:t xml:space="preserve"> </w:t>
+      </w:r>
+      <w:proofErr w:type="spellStart"/>
       <w:r>
         <w:rPr>
           <w:i/>
           <w:sz w:val="20"/>
         </w:rPr>
+        <w:t>purchasing</w:t>
+      </w:r>
+      <w:proofErr w:type="spellEnd"/>
+      <w:r>
+        <w:rPr>
+          <w:i/>
+          <w:sz w:val="20"/>
+        </w:rPr>
         <w:t xml:space="preserve"> </w:t>
       </w:r>
       <w:proofErr w:type="spellStart"/>
@@ -7283,7 +6884,7 @@
           <w:i/>
           <w:sz w:val="20"/>
         </w:rPr>
-        <w:t>purchasing</w:t>
+        <w:t>intention</w:t>
       </w:r>
       <w:proofErr w:type="spellEnd"/>
       <w:r>
@@ -7299,12 +6900,25 @@
           <w:i/>
           <w:sz w:val="20"/>
         </w:rPr>
-        <w:t>intention</w:t>
-      </w:r>
-      <w:proofErr w:type="spellEnd"/>
-      <w:r>
-        <w:rPr>
-          <w:i/>
+        <w:t>dataset</w:t>
+      </w:r>
+      <w:proofErr w:type="spellEnd"/>
+      <w:r>
+        <w:rPr>
+          <w:sz w:val="20"/>
+        </w:rPr>
+        <w:t xml:space="preserve"> [Data set]. UCI Machine </w:t>
+      </w:r>
+      <w:proofErr w:type="spellStart"/>
+      <w:r>
+        <w:rPr>
+          <w:sz w:val="20"/>
+        </w:rPr>
+        <w:t>Learning</w:t>
+      </w:r>
+      <w:proofErr w:type="spellEnd"/>
+      <w:r>
+        <w:rPr>
           <w:sz w:val="20"/>
         </w:rPr>
         <w:t xml:space="preserve"> </w:t>
@@ -7312,35 +6926,6 @@
       <w:proofErr w:type="spellStart"/>
       <w:r>
         <w:rPr>
-          <w:i/>
-          <w:sz w:val="20"/>
-        </w:rPr>
-        <w:t>dataset</w:t>
-      </w:r>
-      <w:proofErr w:type="spellEnd"/>
-      <w:r>
-        <w:rPr>
-          <w:sz w:val="20"/>
-        </w:rPr>
-        <w:t xml:space="preserve"> [Data set]. UCI Machine </w:t>
-      </w:r>
-      <w:proofErr w:type="spellStart"/>
-      <w:r>
-        <w:rPr>
-          <w:sz w:val="20"/>
-        </w:rPr>
-        <w:t>Learning</w:t>
-      </w:r>
-      <w:proofErr w:type="spellEnd"/>
-      <w:r>
-        <w:rPr>
-          <w:sz w:val="20"/>
-        </w:rPr>
-        <w:t xml:space="preserve"> </w:t>
-      </w:r>
-      <w:proofErr w:type="spellStart"/>
-      <w:r>
-        <w:rPr>
           <w:sz w:val="20"/>
         </w:rPr>
         <w:t>Repository</w:t>
@@ -7352,7 +6937,7 @@
         </w:rPr>
         <w:t xml:space="preserve">. </w:t>
       </w:r>
-      <w:hyperlink r:id="rId22" w:history="1">
+      <w:hyperlink r:id="rId23" w:history="1">
         <w:r>
           <w:rPr>
             <w:rStyle w:val="Hipervnculo"/>
@@ -7371,33 +6956,12 @@
           <w:sz w:val="20"/>
         </w:rPr>
       </w:pPr>
-      <w:proofErr w:type="spellStart"/>
-      <w:r>
-        <w:rPr>
-          <w:sz w:val="20"/>
-        </w:rPr>
-        <w:t>Sakar</w:t>
-      </w:r>
-      <w:proofErr w:type="spellEnd"/>
-      <w:r>
-        <w:rPr>
-          <w:sz w:val="20"/>
-        </w:rPr>
-        <w:t xml:space="preserve">, C. O., </w:t>
-      </w:r>
-      <w:proofErr w:type="spellStart"/>
-      <w:r>
-        <w:rPr>
-          <w:sz w:val="20"/>
-        </w:rPr>
-        <w:t>Polat</w:t>
-      </w:r>
-      <w:proofErr w:type="spellEnd"/>
-      <w:r>
-        <w:rPr>
-          <w:sz w:val="20"/>
-        </w:rPr>
-        <w:t xml:space="preserve">, S. O., </w:t>
+      <w:r>
+        <w:rPr>
+          <w:sz w:val="20"/>
+        </w:rPr>
+        <w:lastRenderedPageBreak/>
+        <w:t xml:space="preserve">Sakar, C. O., Polat, S. O., </w:t>
       </w:r>
       <w:proofErr w:type="spellStart"/>
       <w:r>
@@ -7596,7 +7160,7 @@
         </w:rPr>
         <w:t xml:space="preserve">(10), 6893–6908. </w:t>
       </w:r>
-      <w:hyperlink r:id="rId23" w:history="1">
+      <w:hyperlink r:id="rId24" w:history="1">
         <w:r>
           <w:rPr>
             <w:rStyle w:val="Hipervnculo"/>
@@ -7641,21 +7205,7 @@
         <w:rPr>
           <w:sz w:val="20"/>
         </w:rPr>
-        <w:t xml:space="preserve">, R., </w:t>
-      </w:r>
-      <w:proofErr w:type="spellStart"/>
-      <w:r>
-        <w:rPr>
-          <w:sz w:val="20"/>
-        </w:rPr>
-        <w:t>Oliphant</w:t>
-      </w:r>
-      <w:proofErr w:type="spellEnd"/>
-      <w:r>
-        <w:rPr>
-          <w:sz w:val="20"/>
-        </w:rPr>
-        <w:t xml:space="preserve">, T. E., et al. (2020). </w:t>
+        <w:t xml:space="preserve">, R., Oliphant, T. E., et al. (2020). </w:t>
       </w:r>
       <w:proofErr w:type="spellStart"/>
       <w:r>
@@ -7727,36 +7277,27 @@
         </w:rPr>
         <w:t xml:space="preserve"> in Python. </w:t>
       </w:r>
-      <w:proofErr w:type="spellStart"/>
       <w:r>
         <w:rPr>
           <w:i/>
           <w:sz w:val="20"/>
         </w:rPr>
-        <w:t>Nature</w:t>
-      </w:r>
-      <w:proofErr w:type="spellEnd"/>
+        <w:t xml:space="preserve">Nature </w:t>
+      </w:r>
+      <w:proofErr w:type="spellStart"/>
       <w:r>
         <w:rPr>
           <w:i/>
           <w:sz w:val="20"/>
         </w:rPr>
-        <w:t xml:space="preserve"> </w:t>
-      </w:r>
-      <w:proofErr w:type="spellStart"/>
+        <w:t>Methods</w:t>
+      </w:r>
+      <w:proofErr w:type="spellEnd"/>
       <w:r>
         <w:rPr>
           <w:i/>
           <w:sz w:val="20"/>
         </w:rPr>
-        <w:t>Methods</w:t>
-      </w:r>
-      <w:proofErr w:type="spellEnd"/>
-      <w:r>
-        <w:rPr>
-          <w:i/>
-          <w:sz w:val="20"/>
-        </w:rPr>
         <w:t>, 17</w:t>
       </w:r>
       <w:r>
@@ -7765,7 +7306,7 @@
         </w:rPr>
         <w:t xml:space="preserve">, 261–272. </w:t>
       </w:r>
-      <w:hyperlink r:id="rId24" w:history="1">
+      <w:hyperlink r:id="rId25" w:history="1">
         <w:r>
           <w:rPr>
             <w:rStyle w:val="Hipervnculo"/>
@@ -7783,7 +7324,7 @@
       </w:pPr>
     </w:p>
     <w:sectPr>
-      <w:footerReference w:type="default" r:id="rId25"/>
+      <w:footerReference w:type="default" r:id="rId26"/>
       <w:pgSz w:w="11906" w:h="16838"/>
       <w:pgMar w:top="1417" w:right="1417" w:bottom="1417" w:left="1417" w:header="708" w:footer="708" w:gutter="0"/>
       <w:cols w:space="720"/>
@@ -7794,7 +7335,7 @@
 </file>
 
 <file path=word/endnotes.xml><?xml version="1.0" encoding="utf-8"?>
-<w:endnotes xmlns:wpc="http://schemas.microsoft.com/office/word/2010/wordprocessingCanvas" xmlns:cx="http://schemas.microsoft.com/office/drawing/2014/chartex" xmlns:cx1="http://schemas.microsoft.com/office/drawing/2015/9/8/chartex" xmlns:cx2="http://schemas.microsoft.com/office/drawing/2015/10/21/chartex" xmlns:cx3="http://schemas.microsoft.com/office/drawing/2016/5/9/chartex" xmlns:cx4="http://schemas.microsoft.com/office/drawing/2016/5/10/chartex" xmlns:cx5="http://schemas.microsoft.com/office/drawing/2016/5/11/chartex" xmlns:cx6="http://schemas.microsoft.com/office/drawing/2016/5/12/chartex" xmlns:cx7="http://schemas.microsoft.com/office/drawing/2016/5/13/chartex" xmlns:cx8="http://schemas.microsoft.com/office/drawing/2016/5/14/chartex" xmlns:mc="http://schemas.openxmlformats.org/markup-compatibility/2006" xmlns:aink="http://schemas.microsoft.com/office/drawing/2016/ink" xmlns:am3d="http://schemas.microsoft.com/office/drawing/2017/model3d" xmlns:o="urn:schemas-microsoft-com:office:office" xmlns:r="http://schemas.openxmlformats.org/officeDocument/2006/relationships" xmlns:m="http://schemas.openxmlformats.org/officeDocument/2006/math" xmlns:v="urn:schemas-microsoft-com:vml" xmlns:wp14="http://schemas.microsoft.com/office/word/2010/wordprocessingDrawing" xmlns:wp="http://schemas.openxmlformats.org/drawingml/2006/wordprocessingDrawing" xmlns:w10="urn:schemas-microsoft-com:office:word" xmlns:w="http://schemas.openxmlformats.org/wordprocessingml/2006/main" xmlns:w14="http://schemas.microsoft.com/office/word/2010/wordml" xmlns:w15="http://schemas.microsoft.com/office/word/2012/wordml" xmlns:w16cex="http://schemas.microsoft.com/office/word/2018/wordml/cex" xmlns:w16cid="http://schemas.microsoft.com/office/word/2016/wordml/cid" xmlns:w16="http://schemas.microsoft.com/office/word/2018/wordml" xmlns:w16sdtdh="http://schemas.microsoft.com/office/word/2020/wordml/sdtdatahash" xmlns:w16se="http://schemas.microsoft.com/office/word/2015/wordml/symex" xmlns:wpg="http://schemas.microsoft.com/office/word/2010/wordprocessingGroup" xmlns:wpi="http://schemas.microsoft.com/office/word/2010/wordprocessingInk" xmlns:wne="http://schemas.microsoft.com/office/word/2006/wordml" xmlns:wps="http://schemas.microsoft.com/office/word/2010/wordprocessingShape" mc:Ignorable="w14 w15 w16se w16cid w16 w16cex w16sdtdh wp14">
+<w:endnotes xmlns:wpc="http://schemas.microsoft.com/office/word/2010/wordprocessingCanvas" xmlns:cx="http://schemas.microsoft.com/office/drawing/2014/chartex" xmlns:cx1="http://schemas.microsoft.com/office/drawing/2015/9/8/chartex" xmlns:cx2="http://schemas.microsoft.com/office/drawing/2015/10/21/chartex" xmlns:cx3="http://schemas.microsoft.com/office/drawing/2016/5/9/chartex" xmlns:cx4="http://schemas.microsoft.com/office/drawing/2016/5/10/chartex" xmlns:cx5="http://schemas.microsoft.com/office/drawing/2016/5/11/chartex" xmlns:cx6="http://schemas.microsoft.com/office/drawing/2016/5/12/chartex" xmlns:cx7="http://schemas.microsoft.com/office/drawing/2016/5/13/chartex" xmlns:cx8="http://schemas.microsoft.com/office/drawing/2016/5/14/chartex" xmlns:mc="http://schemas.openxmlformats.org/markup-compatibility/2006" xmlns:aink="http://schemas.microsoft.com/office/drawing/2016/ink" xmlns:am3d="http://schemas.microsoft.com/office/drawing/2017/model3d" xmlns:o="urn:schemas-microsoft-com:office:office" xmlns:oel="http://schemas.microsoft.com/office/2019/extlst" xmlns:r="http://schemas.openxmlformats.org/officeDocument/2006/relationships" xmlns:m="http://schemas.openxmlformats.org/officeDocument/2006/math" xmlns:v="urn:schemas-microsoft-com:vml" xmlns:wp14="http://schemas.microsoft.com/office/word/2010/wordprocessingDrawing" xmlns:wp="http://schemas.openxmlformats.org/drawingml/2006/wordprocessingDrawing" xmlns:w10="urn:schemas-microsoft-com:office:word" xmlns:w="http://schemas.openxmlformats.org/wordprocessingml/2006/main" xmlns:w14="http://schemas.microsoft.com/office/word/2010/wordml" xmlns:w15="http://schemas.microsoft.com/office/word/2012/wordml" xmlns:w16cex="http://schemas.microsoft.com/office/word/2018/wordml/cex" xmlns:w16cid="http://schemas.microsoft.com/office/word/2016/wordml/cid" xmlns:w16="http://schemas.microsoft.com/office/word/2018/wordml" xmlns:w16du="http://schemas.microsoft.com/office/word/2023/wordml/word16du" xmlns:w16sdtdh="http://schemas.microsoft.com/office/word/2020/wordml/sdtdatahash" xmlns:w16sdtfl="http://schemas.microsoft.com/office/word/2024/wordml/sdtformatlock" xmlns:w16se="http://schemas.microsoft.com/office/word/2015/wordml/symex" xmlns:wpg="http://schemas.microsoft.com/office/word/2010/wordprocessingGroup" xmlns:wpi="http://schemas.microsoft.com/office/word/2010/wordprocessingInk" xmlns:wne="http://schemas.microsoft.com/office/word/2006/wordml" xmlns:wps="http://schemas.microsoft.com/office/word/2010/wordprocessingShape" mc:Ignorable="w14 w15 w16se w16cid w16 w16cex w16sdtdh w16sdtfl w16du wp14">
   <w:endnote w:type="separator" w:id="-1">
     <w:p>
       <w:r>
@@ -7813,7 +7354,7 @@
 </file>
 
 <file path=word/footer1.xml><?xml version="1.0" encoding="utf-8"?>
-<w:ftr xmlns:wpc="http://schemas.microsoft.com/office/word/2010/wordprocessingCanvas" xmlns:cx="http://schemas.microsoft.com/office/drawing/2014/chartex" xmlns:cx1="http://schemas.microsoft.com/office/drawing/2015/9/8/chartex" xmlns:cx2="http://schemas.microsoft.com/office/drawing/2015/10/21/chartex" xmlns:cx3="http://schemas.microsoft.com/office/drawing/2016/5/9/chartex" xmlns:cx4="http://schemas.microsoft.com/office/drawing/2016/5/10/chartex" xmlns:cx5="http://schemas.microsoft.com/office/drawing/2016/5/11/chartex" xmlns:cx6="http://schemas.microsoft.com/office/drawing/2016/5/12/chartex" xmlns:cx7="http://schemas.microsoft.com/office/drawing/2016/5/13/chartex" xmlns:cx8="http://schemas.microsoft.com/office/drawing/2016/5/14/chartex" xmlns:mc="http://schemas.openxmlformats.org/markup-compatibility/2006" xmlns:aink="http://schemas.microsoft.com/office/drawing/2016/ink" xmlns:am3d="http://schemas.microsoft.com/office/drawing/2017/model3d" xmlns:o="urn:schemas-microsoft-com:office:office" xmlns:r="http://schemas.openxmlformats.org/officeDocument/2006/relationships" xmlns:m="http://schemas.openxmlformats.org/officeDocument/2006/math" xmlns:v="urn:schemas-microsoft-com:vml" xmlns:wp14="http://schemas.microsoft.com/office/word/2010/wordprocessingDrawing" xmlns:wp="http://schemas.openxmlformats.org/drawingml/2006/wordprocessingDrawing" xmlns:w10="urn:schemas-microsoft-com:office:word" xmlns:w="http://schemas.openxmlformats.org/wordprocessingml/2006/main" xmlns:w14="http://schemas.microsoft.com/office/word/2010/wordml" xmlns:w15="http://schemas.microsoft.com/office/word/2012/wordml" xmlns:w16cex="http://schemas.microsoft.com/office/word/2018/wordml/cex" xmlns:w16cid="http://schemas.microsoft.com/office/word/2016/wordml/cid" xmlns:w16="http://schemas.microsoft.com/office/word/2018/wordml" xmlns:w16sdtdh="http://schemas.microsoft.com/office/word/2020/wordml/sdtdatahash" xmlns:w16se="http://schemas.microsoft.com/office/word/2015/wordml/symex" xmlns:wpg="http://schemas.microsoft.com/office/word/2010/wordprocessingGroup" xmlns:wpi="http://schemas.microsoft.com/office/word/2010/wordprocessingInk" xmlns:wne="http://schemas.microsoft.com/office/word/2006/wordml" xmlns:wps="http://schemas.microsoft.com/office/word/2010/wordprocessingShape" mc:Ignorable="w14 w15 w16se w16cid w16 w16cex w16sdtdh wp14">
+<w:ftr xmlns:wpc="http://schemas.microsoft.com/office/word/2010/wordprocessingCanvas" xmlns:cx="http://schemas.microsoft.com/office/drawing/2014/chartex" xmlns:cx1="http://schemas.microsoft.com/office/drawing/2015/9/8/chartex" xmlns:cx2="http://schemas.microsoft.com/office/drawing/2015/10/21/chartex" xmlns:cx3="http://schemas.microsoft.com/office/drawing/2016/5/9/chartex" xmlns:cx4="http://schemas.microsoft.com/office/drawing/2016/5/10/chartex" xmlns:cx5="http://schemas.microsoft.com/office/drawing/2016/5/11/chartex" xmlns:cx6="http://schemas.microsoft.com/office/drawing/2016/5/12/chartex" xmlns:cx7="http://schemas.microsoft.com/office/drawing/2016/5/13/chartex" xmlns:cx8="http://schemas.microsoft.com/office/drawing/2016/5/14/chartex" xmlns:mc="http://schemas.openxmlformats.org/markup-compatibility/2006" xmlns:aink="http://schemas.microsoft.com/office/drawing/2016/ink" xmlns:am3d="http://schemas.microsoft.com/office/drawing/2017/model3d" xmlns:o="urn:schemas-microsoft-com:office:office" xmlns:oel="http://schemas.microsoft.com/office/2019/extlst" xmlns:r="http://schemas.openxmlformats.org/officeDocument/2006/relationships" xmlns:m="http://schemas.openxmlformats.org/officeDocument/2006/math" xmlns:v="urn:schemas-microsoft-com:vml" xmlns:wp14="http://schemas.microsoft.com/office/word/2010/wordprocessingDrawing" xmlns:wp="http://schemas.openxmlformats.org/drawingml/2006/wordprocessingDrawing" xmlns:w10="urn:schemas-microsoft-com:office:word" xmlns:w="http://schemas.openxmlformats.org/wordprocessingml/2006/main" xmlns:w14="http://schemas.microsoft.com/office/word/2010/wordml" xmlns:w15="http://schemas.microsoft.com/office/word/2012/wordml" xmlns:w16cex="http://schemas.microsoft.com/office/word/2018/wordml/cex" xmlns:w16cid="http://schemas.microsoft.com/office/word/2016/wordml/cid" xmlns:w16="http://schemas.microsoft.com/office/word/2018/wordml" xmlns:w16du="http://schemas.microsoft.com/office/word/2023/wordml/word16du" xmlns:w16sdtdh="http://schemas.microsoft.com/office/word/2020/wordml/sdtdatahash" xmlns:w16sdtfl="http://schemas.microsoft.com/office/word/2024/wordml/sdtformatlock" xmlns:w16se="http://schemas.microsoft.com/office/word/2015/wordml/symex" xmlns:wpg="http://schemas.microsoft.com/office/word/2010/wordprocessingGroup" xmlns:wpi="http://schemas.microsoft.com/office/word/2010/wordprocessingInk" xmlns:wne="http://schemas.microsoft.com/office/word/2006/wordml" xmlns:wps="http://schemas.microsoft.com/office/word/2010/wordprocessingShape" mc:Ignorable="w14 w15 w16se w16cid w16 w16cex w16sdtdh w16sdtfl w16du wp14">
   <w:p>
     <w:pPr>
       <w:pBdr>
@@ -7829,15 +7370,7 @@
         <w:sz w:val="16"/>
         <w:szCs w:val="16"/>
       </w:rPr>
-      <w:t>Magíste</w:t>
-    </w:r>
-    <w:r>
-      <w:rPr>
-        <w:color w:val="5A5A5A"/>
-        <w:sz w:val="16"/>
-        <w:szCs w:val="16"/>
-      </w:rPr>
-      <w:t>r en Ciencia de Datos e Inteligencia Artificial</w:t>
+      <w:t>Magíster en Ciencia de Datos e Inteligencia Artificial</w:t>
     </w:r>
     <w:r>
       <w:tab/>
@@ -7888,7 +7421,7 @@
 </file>
 
 <file path=word/footnotes.xml><?xml version="1.0" encoding="utf-8"?>
-<w:footnotes xmlns:wpc="http://schemas.microsoft.com/office/word/2010/wordprocessingCanvas" xmlns:cx="http://schemas.microsoft.com/office/drawing/2014/chartex" xmlns:cx1="http://schemas.microsoft.com/office/drawing/2015/9/8/chartex" xmlns:cx2="http://schemas.microsoft.com/office/drawing/2015/10/21/chartex" xmlns:cx3="http://schemas.microsoft.com/office/drawing/2016/5/9/chartex" xmlns:cx4="http://schemas.microsoft.com/office/drawing/2016/5/10/chartex" xmlns:cx5="http://schemas.microsoft.com/office/drawing/2016/5/11/chartex" xmlns:cx6="http://schemas.microsoft.com/office/drawing/2016/5/12/chartex" xmlns:cx7="http://schemas.microsoft.com/office/drawing/2016/5/13/chartex" xmlns:cx8="http://schemas.microsoft.com/office/drawing/2016/5/14/chartex" xmlns:mc="http://schemas.openxmlformats.org/markup-compatibility/2006" xmlns:aink="http://schemas.microsoft.com/office/drawing/2016/ink" xmlns:am3d="http://schemas.microsoft.com/office/drawing/2017/model3d" xmlns:o="urn:schemas-microsoft-com:office:office" xmlns:r="http://schemas.openxmlformats.org/officeDocument/2006/relationships" xmlns:m="http://schemas.openxmlformats.org/officeDocument/2006/math" xmlns:v="urn:schemas-microsoft-com:vml" xmlns:wp14="http://schemas.microsoft.com/office/word/2010/wordprocessingDrawing" xmlns:wp="http://schemas.openxmlformats.org/drawingml/2006/wordprocessingDrawing" xmlns:w10="urn:schemas-microsoft-com:office:word" xmlns:w="http://schemas.openxmlformats.org/wordprocessingml/2006/main" xmlns:w14="http://schemas.microsoft.com/office/word/2010/wordml" xmlns:w15="http://schemas.microsoft.com/office/word/2012/wordml" xmlns:w16cex="http://schemas.microsoft.com/office/word/2018/wordml/cex" xmlns:w16cid="http://schemas.microsoft.com/office/word/2016/wordml/cid" xmlns:w16="http://schemas.microsoft.com/office/word/2018/wordml" xmlns:w16sdtdh="http://schemas.microsoft.com/office/word/2020/wordml/sdtdatahash" xmlns:w16se="http://schemas.microsoft.com/office/word/2015/wordml/symex" xmlns:wpg="http://schemas.microsoft.com/office/word/2010/wordprocessingGroup" xmlns:wpi="http://schemas.microsoft.com/office/word/2010/wordprocessingInk" xmlns:wne="http://schemas.microsoft.com/office/word/2006/wordml" xmlns:wps="http://schemas.microsoft.com/office/word/2010/wordprocessingShape" mc:Ignorable="w14 w15 w16se w16cid w16 w16cex w16sdtdh wp14">
+<w:footnotes xmlns:wpc="http://schemas.microsoft.com/office/word/2010/wordprocessingCanvas" xmlns:cx="http://schemas.microsoft.com/office/drawing/2014/chartex" xmlns:cx1="http://schemas.microsoft.com/office/drawing/2015/9/8/chartex" xmlns:cx2="http://schemas.microsoft.com/office/drawing/2015/10/21/chartex" xmlns:cx3="http://schemas.microsoft.com/office/drawing/2016/5/9/chartex" xmlns:cx4="http://schemas.microsoft.com/office/drawing/2016/5/10/chartex" xmlns:cx5="http://schemas.microsoft.com/office/drawing/2016/5/11/chartex" xmlns:cx6="http://schemas.microsoft.com/office/drawing/2016/5/12/chartex" xmlns:cx7="http://schemas.microsoft.com/office/drawing/2016/5/13/chartex" xmlns:cx8="http://schemas.microsoft.com/office/drawing/2016/5/14/chartex" xmlns:mc="http://schemas.openxmlformats.org/markup-compatibility/2006" xmlns:aink="http://schemas.microsoft.com/office/drawing/2016/ink" xmlns:am3d="http://schemas.microsoft.com/office/drawing/2017/model3d" xmlns:o="urn:schemas-microsoft-com:office:office" xmlns:oel="http://schemas.microsoft.com/office/2019/extlst" xmlns:r="http://schemas.openxmlformats.org/officeDocument/2006/relationships" xmlns:m="http://schemas.openxmlformats.org/officeDocument/2006/math" xmlns:v="urn:schemas-microsoft-com:vml" xmlns:wp14="http://schemas.microsoft.com/office/word/2010/wordprocessingDrawing" xmlns:wp="http://schemas.openxmlformats.org/drawingml/2006/wordprocessingDrawing" xmlns:w10="urn:schemas-microsoft-com:office:word" xmlns:w="http://schemas.openxmlformats.org/wordprocessingml/2006/main" xmlns:w14="http://schemas.microsoft.com/office/word/2010/wordml" xmlns:w15="http://schemas.microsoft.com/office/word/2012/wordml" xmlns:w16cex="http://schemas.microsoft.com/office/word/2018/wordml/cex" xmlns:w16cid="http://schemas.microsoft.com/office/word/2016/wordml/cid" xmlns:w16="http://schemas.microsoft.com/office/word/2018/wordml" xmlns:w16du="http://schemas.microsoft.com/office/word/2023/wordml/word16du" xmlns:w16sdtdh="http://schemas.microsoft.com/office/word/2020/wordml/sdtdatahash" xmlns:w16sdtfl="http://schemas.microsoft.com/office/word/2024/wordml/sdtformatlock" xmlns:w16se="http://schemas.microsoft.com/office/word/2015/wordml/symex" xmlns:wpg="http://schemas.microsoft.com/office/word/2010/wordprocessingGroup" xmlns:wpi="http://schemas.microsoft.com/office/word/2010/wordprocessingInk" xmlns:wne="http://schemas.microsoft.com/office/word/2006/wordml" xmlns:wps="http://schemas.microsoft.com/office/word/2010/wordprocessingShape" mc:Ignorable="w14 w15 w16se w16cid w16 w16cex w16sdtdh w16sdtfl w16du wp14">
   <w:footnote w:type="separator" w:id="-1">
     <w:p>
       <w:r>
@@ -7907,7 +7440,7 @@
 </file>
 
 <file path=word/numbering.xml><?xml version="1.0" encoding="utf-8"?>
-<w:numbering xmlns:wpc="http://schemas.microsoft.com/office/word/2010/wordprocessingCanvas" xmlns:cx="http://schemas.microsoft.com/office/drawing/2014/chartex" xmlns:cx1="http://schemas.microsoft.com/office/drawing/2015/9/8/chartex" xmlns:cx2="http://schemas.microsoft.com/office/drawing/2015/10/21/chartex" xmlns:cx3="http://schemas.microsoft.com/office/drawing/2016/5/9/chartex" xmlns:cx4="http://schemas.microsoft.com/office/drawing/2016/5/10/chartex" xmlns:cx5="http://schemas.microsoft.com/office/drawing/2016/5/11/chartex" xmlns:cx6="http://schemas.microsoft.com/office/drawing/2016/5/12/chartex" xmlns:cx7="http://schemas.microsoft.com/office/drawing/2016/5/13/chartex" xmlns:cx8="http://schemas.microsoft.com/office/drawing/2016/5/14/chartex" xmlns:mc="http://schemas.openxmlformats.org/markup-compatibility/2006" xmlns:aink="http://schemas.microsoft.com/office/drawing/2016/ink" xmlns:am3d="http://schemas.microsoft.com/office/drawing/2017/model3d" xmlns:o="urn:schemas-microsoft-com:office:office" xmlns:r="http://schemas.openxmlformats.org/officeDocument/2006/relationships" xmlns:m="http://schemas.openxmlformats.org/officeDocument/2006/math" xmlns:v="urn:schemas-microsoft-com:vml" xmlns:wp14="http://schemas.microsoft.com/office/word/2010/wordprocessingDrawing" xmlns:wp="http://schemas.openxmlformats.org/drawingml/2006/wordprocessingDrawing" xmlns:w10="urn:schemas-microsoft-com:office:word" xmlns:w="http://schemas.openxmlformats.org/wordprocessingml/2006/main" xmlns:w14="http://schemas.microsoft.com/office/word/2010/wordml" xmlns:w15="http://schemas.microsoft.com/office/word/2012/wordml" xmlns:w16cex="http://schemas.microsoft.com/office/word/2018/wordml/cex" xmlns:w16cid="http://schemas.microsoft.com/office/word/2016/wordml/cid" xmlns:w16="http://schemas.microsoft.com/office/word/2018/wordml" xmlns:w16sdtdh="http://schemas.microsoft.com/office/word/2020/wordml/sdtdatahash" xmlns:w16se="http://schemas.microsoft.com/office/word/2015/wordml/symex" xmlns:wpg="http://schemas.microsoft.com/office/word/2010/wordprocessingGroup" xmlns:wpi="http://schemas.microsoft.com/office/word/2010/wordprocessingInk" xmlns:wne="http://schemas.microsoft.com/office/word/2006/wordml" xmlns:wps="http://schemas.microsoft.com/office/word/2010/wordprocessingShape" mc:Ignorable="w14 w15 w16se w16cid w16 w16cex w16sdtdh wp14">
+<w:numbering xmlns:wpc="http://schemas.microsoft.com/office/word/2010/wordprocessingCanvas" xmlns:cx="http://schemas.microsoft.com/office/drawing/2014/chartex" xmlns:cx1="http://schemas.microsoft.com/office/drawing/2015/9/8/chartex" xmlns:cx2="http://schemas.microsoft.com/office/drawing/2015/10/21/chartex" xmlns:cx3="http://schemas.microsoft.com/office/drawing/2016/5/9/chartex" xmlns:cx4="http://schemas.microsoft.com/office/drawing/2016/5/10/chartex" xmlns:cx5="http://schemas.microsoft.com/office/drawing/2016/5/11/chartex" xmlns:cx6="http://schemas.microsoft.com/office/drawing/2016/5/12/chartex" xmlns:cx7="http://schemas.microsoft.com/office/drawing/2016/5/13/chartex" xmlns:cx8="http://schemas.microsoft.com/office/drawing/2016/5/14/chartex" xmlns:mc="http://schemas.openxmlformats.org/markup-compatibility/2006" xmlns:aink="http://schemas.microsoft.com/office/drawing/2016/ink" xmlns:am3d="http://schemas.microsoft.com/office/drawing/2017/model3d" xmlns:o="urn:schemas-microsoft-com:office:office" xmlns:oel="http://schemas.microsoft.com/office/2019/extlst" xmlns:r="http://schemas.openxmlformats.org/officeDocument/2006/relationships" xmlns:m="http://schemas.openxmlformats.org/officeDocument/2006/math" xmlns:v="urn:schemas-microsoft-com:vml" xmlns:wp14="http://schemas.microsoft.com/office/word/2010/wordprocessingDrawing" xmlns:wp="http://schemas.openxmlformats.org/drawingml/2006/wordprocessingDrawing" xmlns:w10="urn:schemas-microsoft-com:office:word" xmlns:w="http://schemas.openxmlformats.org/wordprocessingml/2006/main" xmlns:w14="http://schemas.microsoft.com/office/word/2010/wordml" xmlns:w15="http://schemas.microsoft.com/office/word/2012/wordml" xmlns:w16cex="http://schemas.microsoft.com/office/word/2018/wordml/cex" xmlns:w16cid="http://schemas.microsoft.com/office/word/2016/wordml/cid" xmlns:w16="http://schemas.microsoft.com/office/word/2018/wordml" xmlns:w16du="http://schemas.microsoft.com/office/word/2023/wordml/word16du" xmlns:w16sdtdh="http://schemas.microsoft.com/office/word/2020/wordml/sdtdatahash" xmlns:w16sdtfl="http://schemas.microsoft.com/office/word/2024/wordml/sdtformatlock" xmlns:w16se="http://schemas.microsoft.com/office/word/2015/wordml/symex" xmlns:wpg="http://schemas.microsoft.com/office/word/2010/wordprocessingGroup" xmlns:wpi="http://schemas.microsoft.com/office/word/2010/wordprocessingInk" xmlns:wne="http://schemas.microsoft.com/office/word/2006/wordml" xmlns:wps="http://schemas.microsoft.com/office/word/2010/wordprocessingShape" mc:Ignorable="w14 w15 w16se w16cid w16 w16cex w16sdtdh w16sdtfl w16du wp14">
   <w:abstractNum w:abstractNumId="0" w15:restartNumberingAfterBreak="0">
     <w:nsid w:val="449E1B9F"/>
     <w:multiLevelType w:val="hybridMultilevel"/>
@@ -8048,7 +7581,7 @@
       </w:pPr>
     </w:lvl>
   </w:abstractNum>
-  <w:num w:numId="1">
+  <w:num w:numId="1" w16cid:durableId="1188834127">
     <w:abstractNumId w:val="1"/>
     <w:lvlOverride w:ilvl="0">
       <w:startOverride w:val="1"/>
@@ -8058,7 +7591,7 @@
 </file>
 
 <file path=word/styles.xml><?xml version="1.0" encoding="utf-8"?>
-<w:styles xmlns:mc="http://schemas.openxmlformats.org/markup-compatibility/2006" xmlns:r="http://schemas.openxmlformats.org/officeDocument/2006/relationships" xmlns:w="http://schemas.openxmlformats.org/wordprocessingml/2006/main" xmlns:w14="http://schemas.microsoft.com/office/word/2010/wordml" xmlns:w15="http://schemas.microsoft.com/office/word/2012/wordml" xmlns:w16cex="http://schemas.microsoft.com/office/word/2018/wordml/cex" xmlns:w16cid="http://schemas.microsoft.com/office/word/2016/wordml/cid" xmlns:w16="http://schemas.microsoft.com/office/word/2018/wordml" xmlns:w16sdtdh="http://schemas.microsoft.com/office/word/2020/wordml/sdtdatahash" xmlns:w16se="http://schemas.microsoft.com/office/word/2015/wordml/symex" mc:Ignorable="w14 w15 w16se w16cid w16 w16cex w16sdtdh">
+<w:styles xmlns:mc="http://schemas.openxmlformats.org/markup-compatibility/2006" xmlns:r="http://schemas.openxmlformats.org/officeDocument/2006/relationships" xmlns:w="http://schemas.openxmlformats.org/wordprocessingml/2006/main" xmlns:w14="http://schemas.microsoft.com/office/word/2010/wordml" xmlns:w15="http://schemas.microsoft.com/office/word/2012/wordml" xmlns:w16cex="http://schemas.microsoft.com/office/word/2018/wordml/cex" xmlns:w16cid="http://schemas.microsoft.com/office/word/2016/wordml/cid" xmlns:w16="http://schemas.microsoft.com/office/word/2018/wordml" xmlns:w16du="http://schemas.microsoft.com/office/word/2023/wordml/word16du" xmlns:w16sdtdh="http://schemas.microsoft.com/office/word/2020/wordml/sdtdatahash" xmlns:w16sdtfl="http://schemas.microsoft.com/office/word/2024/wordml/sdtformatlock" xmlns:w16se="http://schemas.microsoft.com/office/word/2015/wordml/symex" mc:Ignorable="w14 w15 w16se w16cid w16 w16cex w16sdtdh w16sdtfl w16du">
   <w:docDefaults>
     <w:rPrDefault>
       <w:rPr>
@@ -8714,6 +8247,42 @@
       <w:shd w:val="clear" w:color="auto" w:fill="E1DFDD"/>
     </w:rPr>
   </w:style>
+  <w:style w:type="paragraph" w:styleId="TtuloTDC">
+    <w:name w:val="TOC Heading"/>
+    <w:basedOn w:val="Ttulo1"/>
+    <w:next w:val="Normal"/>
+    <w:uiPriority w:val="39"/>
+    <w:unhideWhenUsed/>
+    <w:qFormat/>
+    <w:rsid w:val="00A54805"/>
+    <w:pPr>
+      <w:keepNext/>
+      <w:keepLines/>
+      <w:spacing w:before="240" w:after="0" w:line="259" w:lineRule="auto"/>
+      <w:outlineLvl w:val="9"/>
+    </w:pPr>
+    <w:rPr>
+      <w:rFonts w:asciiTheme="majorHAnsi" w:eastAsiaTheme="majorEastAsia" w:hAnsiTheme="majorHAnsi" w:cstheme="majorBidi"/>
+      <w:b w:val="0"/>
+      <w:bCs w:val="0"/>
+      <w:color w:val="2F5496" w:themeColor="accent1" w:themeShade="BF"/>
+      <w:sz w:val="32"/>
+      <w:szCs w:val="32"/>
+    </w:rPr>
+  </w:style>
+  <w:style w:type="paragraph" w:styleId="ndice1">
+    <w:name w:val="index 1"/>
+    <w:basedOn w:val="Normal"/>
+    <w:next w:val="Normal"/>
+    <w:autoRedefine/>
+    <w:uiPriority w:val="99"/>
+    <w:semiHidden/>
+    <w:unhideWhenUsed/>
+    <w:rsid w:val="00A54805"/>
+    <w:pPr>
+      <w:ind w:left="220" w:hanging="220"/>
+    </w:pPr>
+  </w:style>
 </w:styles>
 </file>
 
@@ -9010,4 +8579,16 @@
     </a:ext>
   </a:extLst>
 </a:theme>
+</file>
+
+<file path=customXml/item1.xml><?xml version="1.0" encoding="utf-8"?>
+<b:Sources xmlns:b="http://schemas.openxmlformats.org/officeDocument/2006/bibliography" xmlns="http://schemas.openxmlformats.org/officeDocument/2006/bibliography" SelectedStyle="\APASixthEditionOfficeOnline.xsl" StyleName="APA" Version="6"/>
+</file>
+
+<file path=customXml/itemProps1.xml><?xml version="1.0" encoding="utf-8"?>
+<ds:datastoreItem xmlns:ds="http://schemas.openxmlformats.org/officeDocument/2006/customXml" ds:itemID="{E5187B08-C242-4931-998F-EEA63B3EFB08}">
+  <ds:schemaRefs>
+    <ds:schemaRef ds:uri="http://schemas.openxmlformats.org/officeDocument/2006/bibliography"/>
+  </ds:schemaRefs>
+</ds:datastoreItem>
 </file>
</xml_diff>

<commit_message>
Corrige rutas del notebook (F2/) en README e informe
</commit_message>
<xml_diff>
--- a/docs/informe_sumativa1_grupo2.docx
+++ b/docs/informe_sumativa1_grupo2.docx
@@ -2038,7 +2038,7 @@
           <w:rFonts w:ascii="Consolas" w:hAnsi="Consolas"/>
           <w:sz w:val="19"/>
         </w:rPr>
-        <w:t>notebooks/</w:t>
+        <w:t>F2/</w:t>
       </w:r>
       <w:r>
         <w:rPr>
@@ -6211,7 +6211,7 @@
           <w:rFonts w:ascii="Consolas" w:hAnsi="Consolas"/>
           <w:sz w:val="19"/>
         </w:rPr>
-        <w:t>notebooks/01_exploracion_inicial.ipynb</w:t>
+        <w:t>F2/01_exploracion_inicial.ipynb</w:t>
       </w:r>
       <w:r>
         <w:rPr>

</xml_diff>

<commit_message>
Ajusta salto de página de la bibliografía
</commit_message>
<xml_diff>
--- a/docs/informe_sumativa1_grupo2.docx
+++ b/docs/informe_sumativa1_grupo2.docx
@@ -1995,20 +1995,89 @@
         <w:rPr>
           <w:sz w:val="21"/>
         </w:rPr>
-        <w:t xml:space="preserve">El dataset </w:t>
-      </w:r>
-      <w:r>
-        <w:rPr>
-          <w:b/>
-          <w:sz w:val="21"/>
-        </w:rPr>
-        <w:t>Online Shoppers Purchasing Intention</w:t>
-      </w:r>
-      <w:r>
-        <w:rPr>
-          <w:sz w:val="21"/>
-        </w:rPr>
-        <w:t xml:space="preserve"> (Sakar &amp; Kastro, 2018) se cargó en Python con pandas desde </w:t>
+        <w:t xml:space="preserve">El </w:t>
+      </w:r>
+      <w:proofErr w:type="spellStart"/>
+      <w:r>
+        <w:rPr>
+          <w:sz w:val="21"/>
+        </w:rPr>
+        <w:t>dataset</w:t>
+      </w:r>
+      <w:proofErr w:type="spellEnd"/>
+      <w:r>
+        <w:rPr>
+          <w:sz w:val="21"/>
+        </w:rPr>
+        <w:t xml:space="preserve"> </w:t>
+      </w:r>
+      <w:r>
+        <w:rPr>
+          <w:b/>
+          <w:sz w:val="21"/>
+        </w:rPr>
+        <w:t xml:space="preserve">Online </w:t>
+      </w:r>
+      <w:proofErr w:type="spellStart"/>
+      <w:r>
+        <w:rPr>
+          <w:b/>
+          <w:sz w:val="21"/>
+        </w:rPr>
+        <w:t>Shoppers</w:t>
+      </w:r>
+      <w:proofErr w:type="spellEnd"/>
+      <w:r>
+        <w:rPr>
+          <w:b/>
+          <w:sz w:val="21"/>
+        </w:rPr>
+        <w:t xml:space="preserve"> </w:t>
+      </w:r>
+      <w:proofErr w:type="spellStart"/>
+      <w:r>
+        <w:rPr>
+          <w:b/>
+          <w:sz w:val="21"/>
+        </w:rPr>
+        <w:t>Purchasing</w:t>
+      </w:r>
+      <w:proofErr w:type="spellEnd"/>
+      <w:r>
+        <w:rPr>
+          <w:b/>
+          <w:sz w:val="21"/>
+        </w:rPr>
+        <w:t xml:space="preserve"> </w:t>
+      </w:r>
+      <w:proofErr w:type="spellStart"/>
+      <w:r>
+        <w:rPr>
+          <w:b/>
+          <w:sz w:val="21"/>
+        </w:rPr>
+        <w:t>Intention</w:t>
+      </w:r>
+      <w:proofErr w:type="spellEnd"/>
+      <w:r>
+        <w:rPr>
+          <w:sz w:val="21"/>
+        </w:rPr>
+        <w:t xml:space="preserve"> (Sakar &amp; </w:t>
+      </w:r>
+      <w:proofErr w:type="spellStart"/>
+      <w:r>
+        <w:rPr>
+          <w:sz w:val="21"/>
+        </w:rPr>
+        <w:t>Kastro</w:t>
+      </w:r>
+      <w:proofErr w:type="spellEnd"/>
+      <w:r>
+        <w:rPr>
+          <w:sz w:val="21"/>
+        </w:rPr>
+        <w:t xml:space="preserve">, 2018) se cargó en Python con pandas desde </w:t>
       </w:r>
       <w:r>
         <w:rPr>
@@ -2062,6 +2131,7 @@
         </w:rPr>
         <w:t xml:space="preserve">: 10 cuantitativas de comportamiento de navegación (páginas visitadas, duración, tasas de rebote y salida, valor de página y proximidad a fechas especiales), 7 cualitativas (mes, sistema operativo, navegador, región, tipo de tráfico, tipo de visitante y fin de semana) y la variable de resultado </w:t>
       </w:r>
+      <w:proofErr w:type="spellStart"/>
       <w:r>
         <w:rPr>
           <w:rFonts w:ascii="Consolas" w:hAnsi="Consolas"/>
@@ -2069,6 +2139,7 @@
         </w:rPr>
         <w:t>Revenue</w:t>
       </w:r>
+      <w:proofErr w:type="spellEnd"/>
       <w:r>
         <w:rPr>
           <w:b/>
@@ -2095,6 +2166,7 @@
         </w:rPr>
         <w:t xml:space="preserve"> La clasificación se hizo según el significado de cada variable y no solo por su </w:t>
       </w:r>
+      <w:proofErr w:type="spellStart"/>
       <w:r>
         <w:rPr>
           <w:rFonts w:ascii="Consolas" w:hAnsi="Consolas"/>
@@ -2102,12 +2174,14 @@
         </w:rPr>
         <w:t>dtype</w:t>
       </w:r>
+      <w:proofErr w:type="spellEnd"/>
       <w:r>
         <w:rPr>
           <w:sz w:val="21"/>
         </w:rPr>
         <w:t xml:space="preserve">: </w:t>
       </w:r>
+      <w:proofErr w:type="spellStart"/>
       <w:r>
         <w:rPr>
           <w:rFonts w:ascii="Consolas" w:hAnsi="Consolas"/>
@@ -2115,6 +2189,7 @@
         </w:rPr>
         <w:t>OperatingSystems</w:t>
       </w:r>
+      <w:proofErr w:type="spellEnd"/>
       <w:r>
         <w:rPr>
           <w:sz w:val="21"/>
@@ -2134,6 +2209,7 @@
         </w:rPr>
         <w:t xml:space="preserve">, </w:t>
       </w:r>
+      <w:proofErr w:type="spellStart"/>
       <w:r>
         <w:rPr>
           <w:rFonts w:ascii="Consolas" w:hAnsi="Consolas"/>
@@ -2141,12 +2217,14 @@
         </w:rPr>
         <w:t>Region</w:t>
       </w:r>
+      <w:proofErr w:type="spellEnd"/>
       <w:r>
         <w:rPr>
           <w:sz w:val="21"/>
         </w:rPr>
         <w:t xml:space="preserve"> y </w:t>
       </w:r>
+      <w:proofErr w:type="spellStart"/>
       <w:r>
         <w:rPr>
           <w:rFonts w:ascii="Consolas" w:hAnsi="Consolas"/>
@@ -2154,12 +2232,14 @@
         </w:rPr>
         <w:t>TrafficType</w:t>
       </w:r>
+      <w:proofErr w:type="spellEnd"/>
       <w:r>
         <w:rPr>
           <w:sz w:val="21"/>
         </w:rPr>
         <w:t xml:space="preserve"> están almacenadas como enteros, pero son códigos de categorías (cualitativas nominales), por lo que no se les calcula media. </w:t>
       </w:r>
+      <w:proofErr w:type="spellStart"/>
       <w:r>
         <w:rPr>
           <w:rFonts w:ascii="Consolas" w:hAnsi="Consolas"/>
@@ -2167,12 +2247,14 @@
         </w:rPr>
         <w:t>Month</w:t>
       </w:r>
+      <w:proofErr w:type="spellEnd"/>
       <w:r>
         <w:rPr>
           <w:sz w:val="21"/>
         </w:rPr>
         <w:t xml:space="preserve"> se trató como cualitativa temporal y </w:t>
       </w:r>
+      <w:proofErr w:type="spellStart"/>
       <w:r>
         <w:rPr>
           <w:rFonts w:ascii="Consolas" w:hAnsi="Consolas"/>
@@ -2180,6 +2262,7 @@
         </w:rPr>
         <w:t>SpecialDay</w:t>
       </w:r>
+      <w:proofErr w:type="spellEnd"/>
       <w:r>
         <w:rPr>
           <w:sz w:val="21"/>
@@ -2492,7 +2575,21 @@
               <w:rPr>
                 <w:sz w:val="17"/>
               </w:rPr>
-              <w:t>Sin valores negativos; tasas en [0 ; 0,2]</w:t>
+              <w:t>Sin valores negativos; tasas en [</w:t>
+            </w:r>
+            <w:proofErr w:type="gramStart"/>
+            <w:r>
+              <w:rPr>
+                <w:sz w:val="17"/>
+              </w:rPr>
+              <w:t>0 ;</w:t>
+            </w:r>
+            <w:proofErr w:type="gramEnd"/>
+            <w:r>
+              <w:rPr>
+                <w:sz w:val="17"/>
+              </w:rPr>
+              <w:t xml:space="preserve"> 0,2]</w:t>
             </w:r>
           </w:p>
         </w:tc>
@@ -2590,7 +2687,21 @@
               <w:rPr>
                 <w:sz w:val="17"/>
               </w:rPr>
-              <w:t>Plausible: Google Analytics no mide el tiempo en la última página de la sesión; se conservan</w:t>
+              <w:t xml:space="preserve">Plausible: Google </w:t>
+            </w:r>
+            <w:proofErr w:type="spellStart"/>
+            <w:r>
+              <w:rPr>
+                <w:sz w:val="17"/>
+              </w:rPr>
+              <w:t>Analytics</w:t>
+            </w:r>
+            <w:proofErr w:type="spellEnd"/>
+            <w:r>
+              <w:rPr>
+                <w:sz w:val="17"/>
+              </w:rPr>
+              <w:t xml:space="preserve"> no mide el tiempo en la última página de la sesión; se conservan</w:t>
             </w:r>
           </w:p>
         </w:tc>
@@ -2615,12 +2726,28 @@
               <w:keepNext/>
               <w:jc w:val="both"/>
             </w:pPr>
+            <w:proofErr w:type="spellStart"/>
             <w:r>
               <w:rPr>
                 <w:sz w:val="17"/>
               </w:rPr>
-              <w:t>BounceRates mayor que ExitRates</w:t>
-            </w:r>
+              <w:t>BounceRates</w:t>
+            </w:r>
+            <w:proofErr w:type="spellEnd"/>
+            <w:r>
+              <w:rPr>
+                <w:sz w:val="17"/>
+              </w:rPr>
+              <w:t xml:space="preserve"> mayor que </w:t>
+            </w:r>
+            <w:proofErr w:type="spellStart"/>
+            <w:r>
+              <w:rPr>
+                <w:sz w:val="17"/>
+              </w:rPr>
+              <w:t>ExitRates</w:t>
+            </w:r>
+            <w:proofErr w:type="spellEnd"/>
           </w:p>
         </w:tc>
         <w:tc>
@@ -2771,7 +2898,21 @@
         <w:rPr>
           <w:sz w:val="21"/>
         </w:rPr>
-        <w:t xml:space="preserve"> porque el dataset no tiene un identificador de sesión o usuario que permita demostrar que son errores y no sesiones distintas con iguales características. No se aplicaron otras transformaciones; el archivo original se conserva sin modificar en </w:t>
+        <w:t xml:space="preserve"> porque el </w:t>
+      </w:r>
+      <w:proofErr w:type="spellStart"/>
+      <w:r>
+        <w:rPr>
+          <w:sz w:val="21"/>
+        </w:rPr>
+        <w:t>dataset</w:t>
+      </w:r>
+      <w:proofErr w:type="spellEnd"/>
+      <w:r>
+        <w:rPr>
+          <w:sz w:val="21"/>
+        </w:rPr>
+        <w:t xml:space="preserve"> no tiene un identificador de sesión o usuario que permita demostrar que son errores y no sesiones distintas con iguales características. No se aplicaron otras transformaciones; el archivo original se conserva sin modificar en </w:t>
       </w:r>
       <w:r>
         <w:rPr>
@@ -2833,6 +2974,7 @@
         </w:rPr>
         <w:t xml:space="preserve"> terminaron en compra: </w:t>
       </w:r>
+      <w:proofErr w:type="spellStart"/>
       <w:r>
         <w:rPr>
           <w:rFonts w:ascii="Consolas" w:hAnsi="Consolas"/>
@@ -2840,6 +2982,7 @@
         </w:rPr>
         <w:t>Revenue</w:t>
       </w:r>
+      <w:proofErr w:type="spellEnd"/>
       <w:r>
         <w:rPr>
           <w:sz w:val="21"/>
@@ -2904,6 +3047,7 @@
         </w:rPr>
         <w:t>) a 7,58 (</w:t>
       </w:r>
+      <w:proofErr w:type="spellStart"/>
       <w:r>
         <w:rPr>
           <w:rFonts w:ascii="Consolas" w:hAnsi="Consolas"/>
@@ -2911,6 +3055,7 @@
         </w:rPr>
         <w:t>Informational_Duration</w:t>
       </w:r>
+      <w:proofErr w:type="spellEnd"/>
       <w:r>
         <w:rPr>
           <w:sz w:val="21"/>
@@ -2924,6 +3069,7 @@
         <w:lastRenderedPageBreak/>
         <w:t>distribución normal, va de 4,02 a 137,17 (</w:t>
       </w:r>
+      <w:proofErr w:type="spellStart"/>
       <w:r>
         <w:rPr>
           <w:rFonts w:ascii="Consolas" w:hAnsi="Consolas"/>
@@ -2931,6 +3077,7 @@
         </w:rPr>
         <w:t>ProductRelated_Duration</w:t>
       </w:r>
+      <w:proofErr w:type="spellEnd"/>
       <w:r>
         <w:rPr>
           <w:sz w:val="21"/>
@@ -3065,12 +3212,37 @@
               <w:keepNext/>
               <w:jc w:val="both"/>
             </w:pPr>
+            <w:proofErr w:type="spellStart"/>
             <w:r>
               <w:rPr>
                 <w:b/>
                 <w:sz w:val="16"/>
               </w:rPr>
-              <w:t>Desv. est.</w:t>
+              <w:t>Desv</w:t>
+            </w:r>
+            <w:proofErr w:type="spellEnd"/>
+            <w:r>
+              <w:rPr>
+                <w:b/>
+                <w:sz w:val="16"/>
+              </w:rPr>
+              <w:t xml:space="preserve">. </w:t>
+            </w:r>
+            <w:proofErr w:type="spellStart"/>
+            <w:r>
+              <w:rPr>
+                <w:b/>
+                <w:sz w:val="16"/>
+              </w:rPr>
+              <w:t>est</w:t>
+            </w:r>
+            <w:proofErr w:type="spellEnd"/>
+            <w:r>
+              <w:rPr>
+                <w:b/>
+                <w:sz w:val="16"/>
+              </w:rPr>
+              <w:t>.</w:t>
             </w:r>
           </w:p>
         </w:tc>
@@ -3381,12 +3553,14 @@
               <w:keepNext/>
               <w:jc w:val="both"/>
             </w:pPr>
+            <w:proofErr w:type="spellStart"/>
             <w:r>
               <w:rPr>
                 <w:sz w:val="16"/>
               </w:rPr>
               <w:t>Administrative_Duration</w:t>
             </w:r>
+            <w:proofErr w:type="spellEnd"/>
           </w:p>
         </w:tc>
         <w:tc>
@@ -3571,12 +3745,14 @@
               <w:keepNext/>
               <w:jc w:val="both"/>
             </w:pPr>
+            <w:proofErr w:type="spellStart"/>
             <w:r>
               <w:rPr>
                 <w:sz w:val="16"/>
               </w:rPr>
               <w:t>Informational</w:t>
             </w:r>
+            <w:proofErr w:type="spellEnd"/>
           </w:p>
         </w:tc>
         <w:tc>
@@ -3761,12 +3937,14 @@
               <w:keepNext/>
               <w:jc w:val="both"/>
             </w:pPr>
+            <w:proofErr w:type="spellStart"/>
             <w:r>
               <w:rPr>
                 <w:sz w:val="16"/>
               </w:rPr>
               <w:t>Informational_Duration</w:t>
             </w:r>
+            <w:proofErr w:type="spellEnd"/>
           </w:p>
         </w:tc>
         <w:tc>
@@ -3951,12 +4129,14 @@
               <w:keepNext/>
               <w:jc w:val="both"/>
             </w:pPr>
+            <w:proofErr w:type="spellStart"/>
             <w:r>
               <w:rPr>
                 <w:sz w:val="16"/>
               </w:rPr>
               <w:t>ProductRelated</w:t>
             </w:r>
+            <w:proofErr w:type="spellEnd"/>
           </w:p>
         </w:tc>
         <w:tc>
@@ -4141,12 +4321,14 @@
               <w:keepNext/>
               <w:jc w:val="both"/>
             </w:pPr>
+            <w:proofErr w:type="spellStart"/>
             <w:r>
               <w:rPr>
                 <w:sz w:val="16"/>
               </w:rPr>
               <w:t>ProductRelated_Duration</w:t>
             </w:r>
+            <w:proofErr w:type="spellEnd"/>
           </w:p>
         </w:tc>
         <w:tc>
@@ -4331,12 +4513,14 @@
               <w:keepNext/>
               <w:jc w:val="both"/>
             </w:pPr>
+            <w:proofErr w:type="spellStart"/>
             <w:r>
               <w:rPr>
                 <w:sz w:val="16"/>
               </w:rPr>
               <w:t>BounceRates</w:t>
             </w:r>
+            <w:proofErr w:type="spellEnd"/>
           </w:p>
         </w:tc>
         <w:tc>
@@ -4521,12 +4705,14 @@
               <w:keepNext/>
               <w:jc w:val="both"/>
             </w:pPr>
+            <w:proofErr w:type="spellStart"/>
             <w:r>
               <w:rPr>
                 <w:sz w:val="16"/>
               </w:rPr>
               <w:t>ExitRates</w:t>
             </w:r>
+            <w:proofErr w:type="spellEnd"/>
           </w:p>
         </w:tc>
         <w:tc>
@@ -4711,12 +4897,14 @@
               <w:keepNext/>
               <w:jc w:val="both"/>
             </w:pPr>
+            <w:proofErr w:type="spellStart"/>
             <w:r>
               <w:rPr>
                 <w:sz w:val="16"/>
               </w:rPr>
               <w:t>PageValues</w:t>
             </w:r>
+            <w:proofErr w:type="spellEnd"/>
           </w:p>
         </w:tc>
         <w:tc>
@@ -4900,12 +5088,14 @@
             <w:pPr>
               <w:jc w:val="both"/>
             </w:pPr>
+            <w:proofErr w:type="spellStart"/>
             <w:r>
               <w:rPr>
                 <w:sz w:val="16"/>
               </w:rPr>
               <w:t>SpecialDay</w:t>
             </w:r>
+            <w:proofErr w:type="spellEnd"/>
           </w:p>
         </w:tc>
         <w:tc>
@@ -5148,6 +5338,7 @@
         </w:rPr>
         <w:t xml:space="preserve"> La matriz de correlación muestra relaciones fuertes entre </w:t>
       </w:r>
+      <w:proofErr w:type="spellStart"/>
       <w:r>
         <w:rPr>
           <w:rFonts w:ascii="Consolas" w:hAnsi="Consolas"/>
@@ -5155,12 +5346,14 @@
         </w:rPr>
         <w:t>BounceRates</w:t>
       </w:r>
+      <w:proofErr w:type="spellEnd"/>
       <w:r>
         <w:rPr>
           <w:sz w:val="21"/>
         </w:rPr>
         <w:t xml:space="preserve"> y </w:t>
       </w:r>
+      <w:proofErr w:type="spellStart"/>
       <w:r>
         <w:rPr>
           <w:rFonts w:ascii="Consolas" w:hAnsi="Consolas"/>
@@ -5168,12 +5361,14 @@
         </w:rPr>
         <w:t>ExitRates</w:t>
       </w:r>
+      <w:proofErr w:type="spellEnd"/>
       <w:r>
         <w:rPr>
           <w:sz w:val="21"/>
         </w:rPr>
         <w:t xml:space="preserve"> (r = 0,913) y entre </w:t>
       </w:r>
+      <w:proofErr w:type="spellStart"/>
       <w:r>
         <w:rPr>
           <w:rFonts w:ascii="Consolas" w:hAnsi="Consolas"/>
@@ -5181,12 +5376,14 @@
         </w:rPr>
         <w:t>ProductRelated</w:t>
       </w:r>
+      <w:proofErr w:type="spellEnd"/>
       <w:r>
         <w:rPr>
           <w:sz w:val="21"/>
         </w:rPr>
         <w:t xml:space="preserve"> y </w:t>
       </w:r>
+      <w:proofErr w:type="spellStart"/>
       <w:r>
         <w:rPr>
           <w:rFonts w:ascii="Consolas" w:hAnsi="Consolas"/>
@@ -5194,12 +5391,14 @@
         </w:rPr>
         <w:t>ProductRelated_Duration</w:t>
       </w:r>
+      <w:proofErr w:type="spellEnd"/>
       <w:r>
         <w:rPr>
           <w:sz w:val="21"/>
         </w:rPr>
         <w:t xml:space="preserve"> (r = 0,861): cada par contiene información en gran parte redundante, lo que deberá considerarse por multicolinealidad al modelar. Respecto de </w:t>
       </w:r>
+      <w:proofErr w:type="spellStart"/>
       <w:r>
         <w:rPr>
           <w:rFonts w:ascii="Consolas" w:hAnsi="Consolas"/>
@@ -5207,12 +5406,14 @@
         </w:rPr>
         <w:t>Revenue</w:t>
       </w:r>
+      <w:proofErr w:type="spellEnd"/>
       <w:r>
         <w:rPr>
           <w:sz w:val="21"/>
         </w:rPr>
         <w:t xml:space="preserve">, la variable con mayor correlación es </w:t>
       </w:r>
+      <w:proofErr w:type="spellStart"/>
       <w:r>
         <w:rPr>
           <w:rFonts w:ascii="Consolas" w:hAnsi="Consolas"/>
@@ -5220,12 +5421,14 @@
         </w:rPr>
         <w:t>PageValues</w:t>
       </w:r>
+      <w:proofErr w:type="spellEnd"/>
       <w:r>
         <w:rPr>
           <w:sz w:val="21"/>
         </w:rPr>
         <w:t xml:space="preserve"> (r = 0,493), seguida de </w:t>
       </w:r>
+      <w:proofErr w:type="spellStart"/>
       <w:r>
         <w:rPr>
           <w:rFonts w:ascii="Consolas" w:hAnsi="Consolas"/>
@@ -5233,6 +5436,7 @@
         </w:rPr>
         <w:t>ExitRates</w:t>
       </w:r>
+      <w:proofErr w:type="spellEnd"/>
       <w:r>
         <w:rPr>
           <w:sz w:val="21"/>
@@ -5351,6 +5555,7 @@
         </w:rPr>
         <w:t xml:space="preserve">La Figura 3 muestra que las sesiones con compra tienen valores de </w:t>
       </w:r>
+      <w:proofErr w:type="spellStart"/>
       <w:r>
         <w:rPr>
           <w:rFonts w:ascii="Consolas" w:hAnsi="Consolas"/>
@@ -5358,6 +5563,7 @@
         </w:rPr>
         <w:t>PageValues</w:t>
       </w:r>
+      <w:proofErr w:type="spellEnd"/>
       <w:r>
         <w:rPr>
           <w:sz w:val="21"/>
@@ -5423,7 +5629,43 @@
           <w:color w:val="404040"/>
           <w:sz w:val="18"/>
         </w:rPr>
-        <w:t>Figura 3. Distribución de PageValues (escala log(1+x)) y ExitRates según resultado de la sesión.</w:t>
+        <w:t xml:space="preserve">Figura 3. Distribución de </w:t>
+      </w:r>
+      <w:proofErr w:type="spellStart"/>
+      <w:r>
+        <w:rPr>
+          <w:i/>
+          <w:color w:val="404040"/>
+          <w:sz w:val="18"/>
+        </w:rPr>
+        <w:t>PageValues</w:t>
+      </w:r>
+      <w:proofErr w:type="spellEnd"/>
+      <w:r>
+        <w:rPr>
+          <w:i/>
+          <w:color w:val="404040"/>
+          <w:sz w:val="18"/>
+        </w:rPr>
+        <w:t xml:space="preserve"> (escala log(1+x)) y </w:t>
+      </w:r>
+      <w:proofErr w:type="spellStart"/>
+      <w:r>
+        <w:rPr>
+          <w:i/>
+          <w:color w:val="404040"/>
+          <w:sz w:val="18"/>
+        </w:rPr>
+        <w:t>ExitRates</w:t>
+      </w:r>
+      <w:proofErr w:type="spellEnd"/>
+      <w:r>
+        <w:rPr>
+          <w:i/>
+          <w:color w:val="404040"/>
+          <w:sz w:val="18"/>
+        </w:rPr>
+        <w:t xml:space="preserve"> según resultado de la sesión.</w:t>
       </w:r>
     </w:p>
     <w:p>
@@ -5465,6 +5707,7 @@
         </w:rPr>
         <w:t xml:space="preserve"> directamente ligadas al comportamiento de compra: el tiempo en páginas de producto (</w:t>
       </w:r>
+      <w:proofErr w:type="spellStart"/>
       <w:r>
         <w:rPr>
           <w:rFonts w:ascii="Consolas" w:hAnsi="Consolas"/>
@@ -5472,12 +5715,14 @@
         </w:rPr>
         <w:t>ProductRelated_Duration</w:t>
       </w:r>
+      <w:proofErr w:type="spellEnd"/>
       <w:r>
         <w:rPr>
           <w:sz w:val="21"/>
         </w:rPr>
         <w:t>, intensidad de exploración), el valor de página (</w:t>
       </w:r>
+      <w:proofErr w:type="spellStart"/>
       <w:r>
         <w:rPr>
           <w:rFonts w:ascii="Consolas" w:hAnsi="Consolas"/>
@@ -5485,12 +5730,28 @@
         </w:rPr>
         <w:t>PageValues</w:t>
       </w:r>
-      <w:r>
-        <w:rPr>
-          <w:sz w:val="21"/>
-        </w:rPr>
-        <w:t>, métrica de Google Analytics asociada a transacciones) y la tasa de salida (</w:t>
-      </w:r>
+      <w:proofErr w:type="spellEnd"/>
+      <w:r>
+        <w:rPr>
+          <w:sz w:val="21"/>
+        </w:rPr>
+        <w:t xml:space="preserve">, métrica de Google </w:t>
+      </w:r>
+      <w:proofErr w:type="spellStart"/>
+      <w:r>
+        <w:rPr>
+          <w:sz w:val="21"/>
+        </w:rPr>
+        <w:t>Analytics</w:t>
+      </w:r>
+      <w:proofErr w:type="spellEnd"/>
+      <w:r>
+        <w:rPr>
+          <w:sz w:val="21"/>
+        </w:rPr>
+        <w:t xml:space="preserve"> asociada a transacciones) y la tasa de salida (</w:t>
+      </w:r>
+      <w:proofErr w:type="spellStart"/>
       <w:r>
         <w:rPr>
           <w:rFonts w:ascii="Consolas" w:hAnsi="Consolas"/>
@@ -5498,6 +5759,7 @@
         </w:rPr>
         <w:t>ExitRates</w:t>
       </w:r>
+      <w:proofErr w:type="spellEnd"/>
       <w:r>
         <w:rPr>
           <w:sz w:val="21"/>
@@ -5515,7 +5777,35 @@
         <w:rPr>
           <w:sz w:val="21"/>
         </w:rPr>
-        <w:t>: x̄ ± t(0,975; n−1)·s/√n.</w:t>
+        <w:t xml:space="preserve">: x̄ ± </w:t>
+      </w:r>
+      <w:proofErr w:type="gramStart"/>
+      <w:r>
+        <w:rPr>
+          <w:sz w:val="21"/>
+        </w:rPr>
+        <w:t>t(</w:t>
+      </w:r>
+      <w:proofErr w:type="gramEnd"/>
+      <w:r>
+        <w:rPr>
+          <w:sz w:val="21"/>
+        </w:rPr>
+        <w:t>0,975; n−</w:t>
+      </w:r>
+      <w:proofErr w:type="gramStart"/>
+      <w:r>
+        <w:rPr>
+          <w:sz w:val="21"/>
+        </w:rPr>
+        <w:t>1)·</w:t>
+      </w:r>
+      <w:proofErr w:type="gramEnd"/>
+      <w:r>
+        <w:rPr>
+          <w:sz w:val="21"/>
+        </w:rPr>
+        <w:t>s/√n.</w:t>
       </w:r>
     </w:p>
     <w:p>
@@ -5554,13 +5844,43 @@
           <w:b/>
           <w:sz w:val="21"/>
         </w:rPr>
-        <w:t>IC bootstrap percentil</w:t>
-      </w:r>
-      <w:r>
-        <w:rPr>
-          <w:sz w:val="21"/>
-        </w:rPr>
-        <w:t xml:space="preserve"> (5.000 remuestreos, semilla 42; Efron &amp; Tibshirani, 1993), que no requiere asumir normalidad de la variable original. Los resultados se presentan en la Tabla 3.</w:t>
+        <w:t xml:space="preserve">IC </w:t>
+      </w:r>
+      <w:proofErr w:type="spellStart"/>
+      <w:r>
+        <w:rPr>
+          <w:b/>
+          <w:sz w:val="21"/>
+        </w:rPr>
+        <w:t>bootstrap</w:t>
+      </w:r>
+      <w:proofErr w:type="spellEnd"/>
+      <w:r>
+        <w:rPr>
+          <w:b/>
+          <w:sz w:val="21"/>
+        </w:rPr>
+        <w:t xml:space="preserve"> percentil</w:t>
+      </w:r>
+      <w:r>
+        <w:rPr>
+          <w:sz w:val="21"/>
+        </w:rPr>
+        <w:t xml:space="preserve"> (5.000 remuestreos, semilla 42; Efron &amp; </w:t>
+      </w:r>
+      <w:proofErr w:type="spellStart"/>
+      <w:r>
+        <w:rPr>
+          <w:sz w:val="21"/>
+        </w:rPr>
+        <w:t>Tibshirani</w:t>
+      </w:r>
+      <w:proofErr w:type="spellEnd"/>
+      <w:r>
+        <w:rPr>
+          <w:sz w:val="21"/>
+        </w:rPr>
+        <w:t>, 1993), que no requiere asumir normalidad de la variable original. Los resultados se presentan en la Tabla 3.</w:t>
       </w:r>
     </w:p>
     <w:p>
@@ -5716,7 +6036,23 @@
                 <w:b/>
                 <w:sz w:val="17"/>
               </w:rPr>
-              <w:t>IC 95 % (bootstrap)</w:t>
+              <w:t>IC 95 % (</w:t>
+            </w:r>
+            <w:proofErr w:type="spellStart"/>
+            <w:r>
+              <w:rPr>
+                <w:b/>
+                <w:sz w:val="17"/>
+              </w:rPr>
+              <w:t>bootstrap</w:t>
+            </w:r>
+            <w:proofErr w:type="spellEnd"/>
+            <w:r>
+              <w:rPr>
+                <w:b/>
+                <w:sz w:val="17"/>
+              </w:rPr>
+              <w:t>)</w:t>
             </w:r>
           </w:p>
         </w:tc>
@@ -5741,12 +6077,14 @@
               <w:keepNext/>
               <w:jc w:val="both"/>
             </w:pPr>
+            <w:proofErr w:type="spellStart"/>
             <w:r>
               <w:rPr>
                 <w:sz w:val="17"/>
               </w:rPr>
               <w:t>ProductRelated_Duration</w:t>
             </w:r>
+            <w:proofErr w:type="spellEnd"/>
           </w:p>
         </w:tc>
         <w:tc>
@@ -5814,7 +6152,21 @@
               <w:rPr>
                 <w:sz w:val="17"/>
               </w:rPr>
-              <w:t>[1.160,96 ; 1.228,53]</w:t>
+              <w:t>[1.160,</w:t>
+            </w:r>
+            <w:proofErr w:type="gramStart"/>
+            <w:r>
+              <w:rPr>
+                <w:sz w:val="17"/>
+              </w:rPr>
+              <w:t>96 ;</w:t>
+            </w:r>
+            <w:proofErr w:type="gramEnd"/>
+            <w:r>
+              <w:rPr>
+                <w:sz w:val="17"/>
+              </w:rPr>
+              <w:t xml:space="preserve"> 1.228,53]</w:t>
             </w:r>
           </w:p>
         </w:tc>
@@ -5837,7 +6189,21 @@
               <w:rPr>
                 <w:sz w:val="17"/>
               </w:rPr>
-              <w:t>[1.161,09 ; 1.229,04]</w:t>
+              <w:t>[1.161,</w:t>
+            </w:r>
+            <w:proofErr w:type="gramStart"/>
+            <w:r>
+              <w:rPr>
+                <w:sz w:val="17"/>
+              </w:rPr>
+              <w:t>09 ;</w:t>
+            </w:r>
+            <w:proofErr w:type="gramEnd"/>
+            <w:r>
+              <w:rPr>
+                <w:sz w:val="17"/>
+              </w:rPr>
+              <w:t xml:space="preserve"> 1.229,04]</w:t>
             </w:r>
           </w:p>
         </w:tc>
@@ -5862,12 +6228,14 @@
               <w:keepNext/>
               <w:jc w:val="both"/>
             </w:pPr>
+            <w:proofErr w:type="spellStart"/>
             <w:r>
               <w:rPr>
                 <w:sz w:val="17"/>
               </w:rPr>
               <w:t>PageValues</w:t>
             </w:r>
+            <w:proofErr w:type="spellEnd"/>
           </w:p>
         </w:tc>
         <w:tc>
@@ -5935,7 +6303,21 @@
               <w:rPr>
                 <w:sz w:val="17"/>
               </w:rPr>
-              <w:t>[5,561 ; 6,217]</w:t>
+              <w:t>[</w:t>
+            </w:r>
+            <w:proofErr w:type="gramStart"/>
+            <w:r>
+              <w:rPr>
+                <w:sz w:val="17"/>
+              </w:rPr>
+              <w:t>5,561 ;</w:t>
+            </w:r>
+            <w:proofErr w:type="gramEnd"/>
+            <w:r>
+              <w:rPr>
+                <w:sz w:val="17"/>
+              </w:rPr>
+              <w:t xml:space="preserve"> 6,217]</w:t>
             </w:r>
           </w:p>
         </w:tc>
@@ -5958,7 +6340,21 @@
               <w:rPr>
                 <w:sz w:val="17"/>
               </w:rPr>
-              <w:t>[5,572 ; 6,223]</w:t>
+              <w:t>[</w:t>
+            </w:r>
+            <w:proofErr w:type="gramStart"/>
+            <w:r>
+              <w:rPr>
+                <w:sz w:val="17"/>
+              </w:rPr>
+              <w:t>5,572 ;</w:t>
+            </w:r>
+            <w:proofErr w:type="gramEnd"/>
+            <w:r>
+              <w:rPr>
+                <w:sz w:val="17"/>
+              </w:rPr>
+              <w:t xml:space="preserve"> 6,223]</w:t>
             </w:r>
           </w:p>
         </w:tc>
@@ -5982,12 +6378,14 @@
             <w:pPr>
               <w:jc w:val="both"/>
             </w:pPr>
+            <w:proofErr w:type="spellStart"/>
             <w:r>
               <w:rPr>
                 <w:sz w:val="17"/>
               </w:rPr>
               <w:t>ExitRates</w:t>
             </w:r>
+            <w:proofErr w:type="spellEnd"/>
           </w:p>
         </w:tc>
         <w:tc>
@@ -6052,7 +6450,21 @@
               <w:rPr>
                 <w:sz w:val="17"/>
               </w:rPr>
-              <w:t>[0,0422 ; 0,0439]</w:t>
+              <w:t>[0,</w:t>
+            </w:r>
+            <w:proofErr w:type="gramStart"/>
+            <w:r>
+              <w:rPr>
+                <w:sz w:val="17"/>
+              </w:rPr>
+              <w:t>0422 ;</w:t>
+            </w:r>
+            <w:proofErr w:type="gramEnd"/>
+            <w:r>
+              <w:rPr>
+                <w:sz w:val="17"/>
+              </w:rPr>
+              <w:t xml:space="preserve"> 0,0439]</w:t>
             </w:r>
           </w:p>
         </w:tc>
@@ -6074,7 +6486,21 @@
               <w:rPr>
                 <w:sz w:val="17"/>
               </w:rPr>
-              <w:t>[0,0422 ; 0,0440]</w:t>
+              <w:t>[0,</w:t>
+            </w:r>
+            <w:proofErr w:type="gramStart"/>
+            <w:r>
+              <w:rPr>
+                <w:sz w:val="17"/>
+              </w:rPr>
+              <w:t>0422 ;</w:t>
+            </w:r>
+            <w:proofErr w:type="gramEnd"/>
+            <w:r>
+              <w:rPr>
+                <w:sz w:val="17"/>
+              </w:rPr>
+              <w:t xml:space="preserve"> 0,0440]</w:t>
             </w:r>
           </w:p>
         </w:tc>
@@ -6099,12 +6525,21 @@
         <w:lastRenderedPageBreak/>
         <w:t xml:space="preserve">• </w:t>
       </w:r>
-      <w:r>
-        <w:rPr>
-          <w:b/>
-          <w:sz w:val="21"/>
-        </w:rPr>
-        <w:t>ProductRelated_Duration:</w:t>
+      <w:proofErr w:type="spellStart"/>
+      <w:r>
+        <w:rPr>
+          <w:b/>
+          <w:sz w:val="21"/>
+        </w:rPr>
+        <w:t>ProductRelated_Duration</w:t>
+      </w:r>
+      <w:proofErr w:type="spellEnd"/>
+      <w:r>
+        <w:rPr>
+          <w:b/>
+          <w:sz w:val="21"/>
+        </w:rPr>
+        <w:t>:</w:t>
       </w:r>
       <w:r>
         <w:rPr>
@@ -6125,12 +6560,21 @@
         </w:rPr>
         <w:t xml:space="preserve">• </w:t>
       </w:r>
-      <w:r>
-        <w:rPr>
-          <w:b/>
-          <w:sz w:val="21"/>
-        </w:rPr>
-        <w:t>PageValues:</w:t>
+      <w:proofErr w:type="spellStart"/>
+      <w:r>
+        <w:rPr>
+          <w:b/>
+          <w:sz w:val="21"/>
+        </w:rPr>
+        <w:t>PageValues</w:t>
+      </w:r>
+      <w:proofErr w:type="spellEnd"/>
+      <w:r>
+        <w:rPr>
+          <w:b/>
+          <w:sz w:val="21"/>
+        </w:rPr>
+        <w:t>:</w:t>
       </w:r>
       <w:r>
         <w:rPr>
@@ -6151,12 +6595,21 @@
         </w:rPr>
         <w:t xml:space="preserve">• </w:t>
       </w:r>
-      <w:r>
-        <w:rPr>
-          <w:b/>
-          <w:sz w:val="21"/>
-        </w:rPr>
-        <w:t>ExitRates:</w:t>
+      <w:proofErr w:type="spellStart"/>
+      <w:r>
+        <w:rPr>
+          <w:b/>
+          <w:sz w:val="21"/>
+        </w:rPr>
+        <w:t>ExitRates</w:t>
+      </w:r>
+      <w:proofErr w:type="spellEnd"/>
+      <w:r>
+        <w:rPr>
+          <w:b/>
+          <w:sz w:val="21"/>
+        </w:rPr>
+        <w:t>:</w:t>
       </w:r>
       <w:r>
         <w:rPr>
@@ -6206,7 +6659,35 @@
         <w:rPr>
           <w:sz w:val="21"/>
         </w:rPr>
-        <w:t xml:space="preserve"> se estimó en p̂ = 15,47 %, con IC 95 % (aproximación normal) de [14,84 % ; 16,11 %]; las condiciones n·p̂ ≥ 10 y n·(1−p̂) ≥ 10 se cumplen ampliamente.</w:t>
+        <w:t xml:space="preserve"> se estimó en p̂ = 15,47 %, con IC 95 % (aproximación normal) de [14,84 </w:t>
+      </w:r>
+      <w:proofErr w:type="gramStart"/>
+      <w:r>
+        <w:rPr>
+          <w:sz w:val="21"/>
+        </w:rPr>
+        <w:t>% ;</w:t>
+      </w:r>
+      <w:proofErr w:type="gramEnd"/>
+      <w:r>
+        <w:rPr>
+          <w:sz w:val="21"/>
+        </w:rPr>
+        <w:t xml:space="preserve"> 16,11 %]; las condiciones </w:t>
+      </w:r>
+      <w:proofErr w:type="spellStart"/>
+      <w:r>
+        <w:rPr>
+          <w:sz w:val="21"/>
+        </w:rPr>
+        <w:t>n·p</w:t>
+      </w:r>
+      <w:proofErr w:type="spellEnd"/>
+      <w:r>
+        <w:rPr>
+          <w:sz w:val="21"/>
+        </w:rPr>
+        <w:t>̂ ≥ 10 y n·(1−p̂) ≥ 10 se cumplen ampliamente.</w:t>
       </w:r>
     </w:p>
     <w:p>
@@ -6218,7 +6699,21 @@
         <w:rPr>
           <w:sz w:val="21"/>
         </w:rPr>
-        <w:t xml:space="preserve">En las tres variables los intervalos t y bootstrap prácticamente coinciden, lo que respalda la estabilidad de las estimaciones. </w:t>
+        <w:t xml:space="preserve">En las tres variables los intervalos t y </w:t>
+      </w:r>
+      <w:proofErr w:type="spellStart"/>
+      <w:r>
+        <w:rPr>
+          <w:sz w:val="21"/>
+        </w:rPr>
+        <w:t>bootstrap</w:t>
+      </w:r>
+      <w:proofErr w:type="spellEnd"/>
+      <w:r>
+        <w:rPr>
+          <w:sz w:val="21"/>
+        </w:rPr>
+        <w:t xml:space="preserve"> prácticamente coinciden, lo que respalda la estabilidad de las estimaciones. </w:t>
       </w:r>
       <w:r>
         <w:rPr>
@@ -6231,7 +6726,21 @@
         <w:rPr>
           <w:sz w:val="21"/>
         </w:rPr>
-        <w:t xml:space="preserve"> (1) en distribuciones muy asimétricas la media no representa necesariamente a la sesión típica, por lo que se reporta también la mediana; (2) se supone independencia entre sesiones, aunque el dataset no identifica usuarios y contiene 125 duplicados; (3) la estrechez de los intervalos refleja el gran n y no implica relevancia práctica.</w:t>
+        <w:t xml:space="preserve"> (1) en distribuciones muy asimétricas la media no representa necesariamente a la sesión típica, por lo que se reporta también la mediana; (2) se supone independencia entre sesiones, aunque el </w:t>
+      </w:r>
+      <w:proofErr w:type="spellStart"/>
+      <w:r>
+        <w:rPr>
+          <w:sz w:val="21"/>
+        </w:rPr>
+        <w:t>dataset</w:t>
+      </w:r>
+      <w:proofErr w:type="spellEnd"/>
+      <w:r>
+        <w:rPr>
+          <w:sz w:val="21"/>
+        </w:rPr>
+        <w:t xml:space="preserve"> no identifica usuarios y contiene 125 duplicados; (3) la estrechez de los intervalos refleja el gran n y no implica relevancia práctica.</w:t>
       </w:r>
     </w:p>
     <w:p>
@@ -6305,6 +6814,7 @@
         </w:rPr>
         <w:t xml:space="preserve"> </w:t>
       </w:r>
+      <w:proofErr w:type="spellStart"/>
       <w:r>
         <w:rPr>
           <w:rFonts w:ascii="Consolas" w:hAnsi="Consolas"/>
@@ -6312,12 +6822,14 @@
         </w:rPr>
         <w:t>VisitorType</w:t>
       </w:r>
+      <w:proofErr w:type="spellEnd"/>
       <w:r>
         <w:rPr>
           <w:sz w:val="21"/>
         </w:rPr>
         <w:t xml:space="preserve"> y </w:t>
       </w:r>
+      <w:proofErr w:type="spellStart"/>
       <w:r>
         <w:rPr>
           <w:rFonts w:ascii="Consolas" w:hAnsi="Consolas"/>
@@ -6325,6 +6837,7 @@
         </w:rPr>
         <w:t>Revenue</w:t>
       </w:r>
+      <w:proofErr w:type="spellEnd"/>
       <w:r>
         <w:rPr>
           <w:sz w:val="21"/>
@@ -6387,7 +6900,21 @@
         <w:rPr>
           <w:sz w:val="21"/>
         </w:rPr>
-        <w:t xml:space="preserve"> χ² = 135,25, gl = 2, p &lt; 0,001 → se </w:t>
+        <w:t xml:space="preserve"> χ² = 135,25, </w:t>
+      </w:r>
+      <w:proofErr w:type="spellStart"/>
+      <w:r>
+        <w:rPr>
+          <w:sz w:val="21"/>
+        </w:rPr>
+        <w:t>gl</w:t>
+      </w:r>
+      <w:proofErr w:type="spellEnd"/>
+      <w:r>
+        <w:rPr>
+          <w:sz w:val="21"/>
+        </w:rPr>
+        <w:t xml:space="preserve"> = 2, p &lt; 0,001 → se </w:t>
       </w:r>
       <w:r>
         <w:rPr>
@@ -6407,7 +6934,23 @@
           <w:b/>
           <w:sz w:val="21"/>
         </w:rPr>
-        <w:t>V de Cramér = 0,105</w:t>
+        <w:t xml:space="preserve">V de </w:t>
+      </w:r>
+      <w:proofErr w:type="spellStart"/>
+      <w:r>
+        <w:rPr>
+          <w:b/>
+          <w:sz w:val="21"/>
+        </w:rPr>
+        <w:t>Cramér</w:t>
+      </w:r>
+      <w:proofErr w:type="spellEnd"/>
+      <w:r>
+        <w:rPr>
+          <w:b/>
+          <w:sz w:val="21"/>
+        </w:rPr>
+        <w:t xml:space="preserve"> = 0,105</w:t>
       </w:r>
       <w:r>
         <w:rPr>
@@ -6439,7 +6982,21 @@
         <w:rPr>
           <w:b/>
         </w:rPr>
-        <w:t>4.2 Prueba 2: diferencia en PageValues entre sesiones con y sin compra</w:t>
+        <w:t xml:space="preserve">4.2 Prueba 2: diferencia en </w:t>
+      </w:r>
+      <w:proofErr w:type="spellStart"/>
+      <w:r>
+        <w:rPr>
+          <w:b/>
+        </w:rPr>
+        <w:t>PageValues</w:t>
+      </w:r>
+      <w:proofErr w:type="spellEnd"/>
+      <w:r>
+        <w:rPr>
+          <w:b/>
+        </w:rPr>
+        <w:t xml:space="preserve"> entre sesiones con y sin compra</w:t>
       </w:r>
     </w:p>
     <w:p>
@@ -6460,6 +7017,7 @@
         </w:rPr>
         <w:t xml:space="preserve"> la distribución de </w:t>
       </w:r>
+      <w:proofErr w:type="spellStart"/>
       <w:r>
         <w:rPr>
           <w:rFonts w:ascii="Consolas" w:hAnsi="Consolas"/>
@@ -6467,6 +7025,7 @@
         </w:rPr>
         <w:t>PageValues</w:t>
       </w:r>
+      <w:proofErr w:type="spellEnd"/>
       <w:r>
         <w:rPr>
           <w:sz w:val="21"/>
@@ -6517,13 +7076,43 @@
           <w:b/>
           <w:sz w:val="21"/>
         </w:rPr>
-        <w:t>correlación biserial por rangos</w:t>
-      </w:r>
-      <w:r>
-        <w:rPr>
-          <w:sz w:val="21"/>
-        </w:rPr>
-        <w:t xml:space="preserve"> (r_rb) como tamaño del efecto, y la </w:t>
+        <w:t xml:space="preserve">correlación </w:t>
+      </w:r>
+      <w:proofErr w:type="spellStart"/>
+      <w:r>
+        <w:rPr>
+          <w:b/>
+          <w:sz w:val="21"/>
+        </w:rPr>
+        <w:t>biserial</w:t>
+      </w:r>
+      <w:proofErr w:type="spellEnd"/>
+      <w:r>
+        <w:rPr>
+          <w:b/>
+          <w:sz w:val="21"/>
+        </w:rPr>
+        <w:t xml:space="preserve"> por rangos</w:t>
+      </w:r>
+      <w:r>
+        <w:rPr>
+          <w:sz w:val="21"/>
+        </w:rPr>
+        <w:t xml:space="preserve"> (</w:t>
+      </w:r>
+      <w:proofErr w:type="spellStart"/>
+      <w:r>
+        <w:rPr>
+          <w:sz w:val="21"/>
+        </w:rPr>
+        <w:t>r_rb</w:t>
+      </w:r>
+      <w:proofErr w:type="spellEnd"/>
+      <w:r>
+        <w:rPr>
+          <w:sz w:val="21"/>
+        </w:rPr>
+        <w:t xml:space="preserve">) como tamaño del efecto, y la </w:t>
       </w:r>
       <w:r>
         <w:rPr>
@@ -6568,7 +7157,21 @@
         <w:rPr>
           <w:sz w:val="21"/>
         </w:rPr>
-        <w:t xml:space="preserve">. La t de Welch, usada como análisis de sensibilidad, también evidencia diferencia (t = 31,20; gl ≈ 1.954; p &lt; 0,001). El efecto es </w:t>
+        <w:t xml:space="preserve">. La t de Welch, usada como análisis de sensibilidad, también evidencia diferencia (t = 31,20; </w:t>
+      </w:r>
+      <w:proofErr w:type="spellStart"/>
+      <w:r>
+        <w:rPr>
+          <w:sz w:val="21"/>
+        </w:rPr>
+        <w:t>gl</w:t>
+      </w:r>
+      <w:proofErr w:type="spellEnd"/>
+      <w:r>
+        <w:rPr>
+          <w:sz w:val="21"/>
+        </w:rPr>
+        <w:t xml:space="preserve"> ≈ 1.954; p &lt; 0,001). El efecto es </w:t>
       </w:r>
       <w:r>
         <w:rPr>
@@ -6581,8 +7184,23 @@
         <w:rPr>
           <w:sz w:val="21"/>
         </w:rPr>
-        <w:t xml:space="preserve"> (r_rb = 0,727). Descriptivamente, la mediana de </w:t>
-      </w:r>
+        <w:t xml:space="preserve"> (</w:t>
+      </w:r>
+      <w:proofErr w:type="spellStart"/>
+      <w:r>
+        <w:rPr>
+          <w:sz w:val="21"/>
+        </w:rPr>
+        <w:t>r_rb</w:t>
+      </w:r>
+      <w:proofErr w:type="spellEnd"/>
+      <w:r>
+        <w:rPr>
+          <w:sz w:val="21"/>
+        </w:rPr>
+        <w:t xml:space="preserve"> = 0,727). Descriptivamente, la mediana de </w:t>
+      </w:r>
+      <w:proofErr w:type="spellStart"/>
       <w:r>
         <w:rPr>
           <w:rFonts w:ascii="Consolas" w:hAnsi="Consolas"/>
@@ -6590,6 +7208,7 @@
         </w:rPr>
         <w:t>PageValues</w:t>
       </w:r>
+      <w:proofErr w:type="spellEnd"/>
       <w:r>
         <w:rPr>
           <w:sz w:val="21"/>
@@ -6780,7 +7399,21 @@
               <w:rPr>
                 <w:sz w:val="17"/>
               </w:rPr>
-              <w:t>χ² independencia (VisitorType)</w:t>
+              <w:t>χ² independencia (</w:t>
+            </w:r>
+            <w:proofErr w:type="spellStart"/>
+            <w:r>
+              <w:rPr>
+                <w:sz w:val="17"/>
+              </w:rPr>
+              <w:t>VisitorType</w:t>
+            </w:r>
+            <w:proofErr w:type="spellEnd"/>
+            <w:r>
+              <w:rPr>
+                <w:sz w:val="17"/>
+              </w:rPr>
+              <w:t>)</w:t>
             </w:r>
           </w:p>
         </w:tc>
@@ -6900,7 +7533,21 @@
               <w:rPr>
                 <w:sz w:val="17"/>
               </w:rPr>
-              <w:t>U Mann-Whitney (PageValues)</w:t>
+              <w:t>U Mann-Whitney (</w:t>
+            </w:r>
+            <w:proofErr w:type="spellStart"/>
+            <w:r>
+              <w:rPr>
+                <w:sz w:val="17"/>
+              </w:rPr>
+              <w:t>PageValues</w:t>
+            </w:r>
+            <w:proofErr w:type="spellEnd"/>
+            <w:r>
+              <w:rPr>
+                <w:sz w:val="17"/>
+              </w:rPr>
+              <w:t>)</w:t>
             </w:r>
           </w:p>
         </w:tc>
@@ -6962,11 +7609,19 @@
             <w:pPr>
               <w:jc w:val="both"/>
             </w:pPr>
+            <w:proofErr w:type="spellStart"/>
             <w:r>
               <w:rPr>
                 <w:sz w:val="17"/>
               </w:rPr>
-              <w:t>r_rb = 0,727 (grande)</w:t>
+              <w:t>r_rb</w:t>
+            </w:r>
+            <w:proofErr w:type="spellEnd"/>
+            <w:r>
+              <w:rPr>
+                <w:sz w:val="17"/>
+              </w:rPr>
+              <w:t xml:space="preserve"> = 0,727 (grande)</w:t>
             </w:r>
           </w:p>
         </w:tc>
@@ -7018,6 +7673,7 @@
         </w:rPr>
         <w:t xml:space="preserve"> Ambas variables se asocian con la compra, pero con magnitudes muy distintas: </w:t>
       </w:r>
+      <w:proofErr w:type="spellStart"/>
       <w:r>
         <w:rPr>
           <w:rFonts w:ascii="Consolas" w:hAnsi="Consolas"/>
@@ -7025,6 +7681,7 @@
         </w:rPr>
         <w:t>PageValues</w:t>
       </w:r>
+      <w:proofErr w:type="spellEnd"/>
       <w:r>
         <w:rPr>
           <w:sz w:val="21"/>
@@ -7082,7 +7739,21 @@
         <w:rPr>
           <w:sz w:val="21"/>
         </w:rPr>
-        <w:t xml:space="preserve"> Revisión de calidad de datos; clasificación estadística de variables; estadística descriptiva y visualizaciones; correlaciones y tablas de contingencia; intervalos de confianza t, bootstrap y para proporciones; pruebas chi-cuadrado y U de Mann-Whitney con tamaños de efecto.</w:t>
+        <w:t xml:space="preserve"> Revisión de calidad de datos; clasificación estadística de variables; estadística descriptiva y visualizaciones; correlaciones y tablas de contingencia; intervalos de confianza t, </w:t>
+      </w:r>
+      <w:proofErr w:type="spellStart"/>
+      <w:r>
+        <w:rPr>
+          <w:sz w:val="21"/>
+        </w:rPr>
+        <w:t>bootstrap</w:t>
+      </w:r>
+      <w:proofErr w:type="spellEnd"/>
+      <w:r>
+        <w:rPr>
+          <w:sz w:val="21"/>
+        </w:rPr>
+        <w:t xml:space="preserve"> y para proporciones; pruebas chi-cuadrado y U de Mann-Whitney con tamaños de efecto.</w:t>
       </w:r>
     </w:p>
     <w:p>
@@ -7103,6 +7774,7 @@
         </w:rPr>
         <w:t xml:space="preserve"> La tasa de conversión es baja (15,5 %) y las clases están desbalanceadas. </w:t>
       </w:r>
+      <w:proofErr w:type="spellStart"/>
       <w:r>
         <w:rPr>
           <w:rFonts w:ascii="Consolas" w:hAnsi="Consolas"/>
@@ -7110,6 +7782,7 @@
         </w:rPr>
         <w:t>PageValues</w:t>
       </w:r>
+      <w:proofErr w:type="spellEnd"/>
       <w:r>
         <w:rPr>
           <w:sz w:val="21"/>
@@ -7187,6 +7860,7 @@
         </w:rPr>
         <w:t xml:space="preserve"> faltan enero y abril, de modo que el patrón mensual es incompleto. (5) </w:t>
       </w:r>
+      <w:proofErr w:type="spellStart"/>
       <w:r>
         <w:rPr>
           <w:rFonts w:ascii="Consolas" w:hAnsi="Consolas"/>
@@ -7194,6 +7868,7 @@
         </w:rPr>
         <w:t>PageValues</w:t>
       </w:r>
+      <w:proofErr w:type="spellEnd"/>
       <w:r>
         <w:rPr>
           <w:sz w:val="21"/>
@@ -7219,6 +7894,7 @@
         </w:rPr>
         <w:t xml:space="preserve"> (1) Evaluar la estabilidad de las estimaciones mediante simulación y remuestreo (S2); (2) tratar el desbalance de clases y la multicolinealidad; (3) construir y comparar modelos de regresión logística para predecir </w:t>
       </w:r>
+      <w:proofErr w:type="spellStart"/>
       <w:r>
         <w:rPr>
           <w:rFonts w:ascii="Consolas" w:hAnsi="Consolas"/>
@@ -7226,12 +7902,14 @@
         </w:rPr>
         <w:t>Revenue</w:t>
       </w:r>
+      <w:proofErr w:type="spellEnd"/>
       <w:r>
         <w:rPr>
           <w:sz w:val="21"/>
         </w:rPr>
         <w:t xml:space="preserve"> (S3), analizando con cuidado el uso de </w:t>
       </w:r>
+      <w:proofErr w:type="spellStart"/>
       <w:r>
         <w:rPr>
           <w:rFonts w:ascii="Consolas" w:hAnsi="Consolas"/>
@@ -7239,6 +7917,7 @@
         </w:rPr>
         <w:t>PageValues</w:t>
       </w:r>
+      <w:proofErr w:type="spellEnd"/>
       <w:r>
         <w:rPr>
           <w:sz w:val="21"/>
@@ -7309,7 +7988,77 @@
         <w:rPr>
           <w:sz w:val="21"/>
         </w:rPr>
-        <w:t xml:space="preserve"> (pandas, numpy, scipy, matplotlib, seaborn, jupyter). Las secciones 10 y 11 del notebook corresponden a las secciones 3 y 4 de este informe. La Tabla 2 proviene de la sección 6.1 del notebook y las Figuras 1 a 3 se generan con el mismo código en su sección 14.</w:t>
+        <w:t xml:space="preserve"> (pandas, </w:t>
+      </w:r>
+      <w:proofErr w:type="spellStart"/>
+      <w:r>
+        <w:rPr>
+          <w:sz w:val="21"/>
+        </w:rPr>
+        <w:t>numpy</w:t>
+      </w:r>
+      <w:proofErr w:type="spellEnd"/>
+      <w:r>
+        <w:rPr>
+          <w:sz w:val="21"/>
+        </w:rPr>
+        <w:t xml:space="preserve">, </w:t>
+      </w:r>
+      <w:proofErr w:type="spellStart"/>
+      <w:r>
+        <w:rPr>
+          <w:sz w:val="21"/>
+        </w:rPr>
+        <w:t>scipy</w:t>
+      </w:r>
+      <w:proofErr w:type="spellEnd"/>
+      <w:r>
+        <w:rPr>
+          <w:sz w:val="21"/>
+        </w:rPr>
+        <w:t xml:space="preserve">, </w:t>
+      </w:r>
+      <w:proofErr w:type="spellStart"/>
+      <w:r>
+        <w:rPr>
+          <w:sz w:val="21"/>
+        </w:rPr>
+        <w:t>matplotlib</w:t>
+      </w:r>
+      <w:proofErr w:type="spellEnd"/>
+      <w:r>
+        <w:rPr>
+          <w:sz w:val="21"/>
+        </w:rPr>
+        <w:t xml:space="preserve">, </w:t>
+      </w:r>
+      <w:proofErr w:type="spellStart"/>
+      <w:r>
+        <w:rPr>
+          <w:sz w:val="21"/>
+        </w:rPr>
+        <w:t>seaborn</w:t>
+      </w:r>
+      <w:proofErr w:type="spellEnd"/>
+      <w:r>
+        <w:rPr>
+          <w:sz w:val="21"/>
+        </w:rPr>
+        <w:t xml:space="preserve">, </w:t>
+      </w:r>
+      <w:proofErr w:type="spellStart"/>
+      <w:r>
+        <w:rPr>
+          <w:sz w:val="21"/>
+        </w:rPr>
+        <w:t>jupyter</w:t>
+      </w:r>
+      <w:proofErr w:type="spellEnd"/>
+      <w:r>
+        <w:rPr>
+          <w:sz w:val="21"/>
+        </w:rPr>
+        <w:t>). Las secciones 10 y 11 del notebook corresponden a las secciones 3 y 4 de este informe. La Tabla 2 proviene de la sección 6.1 del notebook y las Figuras 1 a 3 se generan con el mismo código en su sección 14.</w:t>
       </w:r>
     </w:p>
     <w:p>
@@ -7333,18 +8082,60 @@
         <w:rPr>
           <w:sz w:val="21"/>
         </w:rPr>
-        <w:t>El análisis se realizó en Python con pandas (McKinney, 2022) y SciPy (Virtanen et al., 2020).</w:t>
+        <w:t xml:space="preserve">El análisis se realizó en Python con pandas (McKinney, 2022) y </w:t>
+      </w:r>
+      <w:proofErr w:type="spellStart"/>
+      <w:r>
+        <w:rPr>
+          <w:sz w:val="21"/>
+        </w:rPr>
+        <w:t>SciPy</w:t>
+      </w:r>
+      <w:proofErr w:type="spellEnd"/>
+      <w:r>
+        <w:rPr>
+          <w:sz w:val="21"/>
+        </w:rPr>
+        <w:t xml:space="preserve"> (</w:t>
+      </w:r>
+      <w:proofErr w:type="spellStart"/>
+      <w:r>
+        <w:rPr>
+          <w:sz w:val="21"/>
+        </w:rPr>
+        <w:t>Virtanen</w:t>
+      </w:r>
+      <w:proofErr w:type="spellEnd"/>
+      <w:r>
+        <w:rPr>
+          <w:sz w:val="21"/>
+        </w:rPr>
+        <w:t xml:space="preserve"> et al., 2020).</w:t>
       </w:r>
     </w:p>
     <w:p>
       <w:pPr>
-        <w:pStyle w:val="Ttulo1"/>
-        <w:jc w:val="both"/>
+        <w:rPr>
+          <w:b/>
+          <w:bCs/>
+          <w:sz w:val="28"/>
+          <w:szCs w:val="28"/>
+        </w:rPr>
       </w:pPr>
       <w:bookmarkStart w:id="18" w:name="_Toc242557120"/>
       <w:bookmarkStart w:id="19" w:name="_Toc242598250"/>
       <w:bookmarkStart w:id="20" w:name="_Toc242598461"/>
       <w:r>
+        <w:br w:type="page"/>
+      </w:r>
+    </w:p>
+    <w:p>
+      <w:pPr>
+        <w:pStyle w:val="Ttulo1"/>
+        <w:jc w:val="both"/>
+      </w:pPr>
+      <w:r>
+        <w:lastRenderedPageBreak/>
         <w:t>7. Bibliografía (APA 7)</w:t>
       </w:r>
       <w:bookmarkEnd w:id="18"/>
@@ -7364,8 +8155,21 @@
         <w:rPr>
           <w:sz w:val="20"/>
         </w:rPr>
-        <w:lastRenderedPageBreak/>
-        <w:t xml:space="preserve">Efron, B., &amp; Tibshirani, R. J. (1993). </w:t>
+        <w:t xml:space="preserve">Efron, B., &amp; </w:t>
+      </w:r>
+      <w:proofErr w:type="spellStart"/>
+      <w:r>
+        <w:rPr>
+          <w:sz w:val="20"/>
+        </w:rPr>
+        <w:t>Tibshirani</w:t>
+      </w:r>
+      <w:proofErr w:type="spellEnd"/>
+      <w:r>
+        <w:rPr>
+          <w:sz w:val="20"/>
+        </w:rPr>
+        <w:t xml:space="preserve">, R. J. (1993). </w:t>
       </w:r>
       <w:r>
         <w:rPr>
@@ -7473,7 +8277,23 @@
           <w:sz w:val="20"/>
           <w:lang w:val="en-US"/>
         </w:rPr>
-        <w:t xml:space="preserve">Sakar, C. O., &amp; Kastro, Y. (2018). </w:t>
+        <w:t xml:space="preserve">Sakar, C. O., &amp; </w:t>
+      </w:r>
+      <w:proofErr w:type="spellStart"/>
+      <w:r>
+        <w:rPr>
+          <w:sz w:val="20"/>
+          <w:lang w:val="en-US"/>
+        </w:rPr>
+        <w:t>Kastro</w:t>
+      </w:r>
+      <w:proofErr w:type="spellEnd"/>
+      <w:r>
+        <w:rPr>
+          <w:sz w:val="20"/>
+          <w:lang w:val="en-US"/>
+        </w:rPr>
+        <w:t xml:space="preserve">, Y. (2018). </w:t>
       </w:r>
       <w:r>
         <w:rPr>
@@ -7516,7 +8336,55 @@
           <w:sz w:val="20"/>
           <w:lang w:val="en-US"/>
         </w:rPr>
-        <w:t xml:space="preserve">Sakar, C. O., Polat, S. O., Katircioglu, M., &amp; Kastro, Y. (2019). Real-time prediction of online shoppers' purchasing intention using multilayer perceptron and LSTM recurrent neural networks. </w:t>
+        <w:t xml:space="preserve">Sakar, C. O., Polat, S. O., </w:t>
+      </w:r>
+      <w:proofErr w:type="spellStart"/>
+      <w:r>
+        <w:rPr>
+          <w:sz w:val="20"/>
+          <w:lang w:val="en-US"/>
+        </w:rPr>
+        <w:t>Katircioglu</w:t>
+      </w:r>
+      <w:proofErr w:type="spellEnd"/>
+      <w:r>
+        <w:rPr>
+          <w:sz w:val="20"/>
+          <w:lang w:val="en-US"/>
+        </w:rPr>
+        <w:t xml:space="preserve">, M., &amp; </w:t>
+      </w:r>
+      <w:proofErr w:type="spellStart"/>
+      <w:r>
+        <w:rPr>
+          <w:sz w:val="20"/>
+          <w:lang w:val="en-US"/>
+        </w:rPr>
+        <w:t>Kastro</w:t>
+      </w:r>
+      <w:proofErr w:type="spellEnd"/>
+      <w:r>
+        <w:rPr>
+          <w:sz w:val="20"/>
+          <w:lang w:val="en-US"/>
+        </w:rPr>
+        <w:t xml:space="preserve">, Y. (2019). Real-time prediction of online shoppers' purchasing intention using multilayer </w:t>
+      </w:r>
+      <w:proofErr w:type="gramStart"/>
+      <w:r>
+        <w:rPr>
+          <w:sz w:val="20"/>
+          <w:lang w:val="en-US"/>
+        </w:rPr>
+        <w:t>perceptron</w:t>
+      </w:r>
+      <w:proofErr w:type="gramEnd"/>
+      <w:r>
+        <w:rPr>
+          <w:sz w:val="20"/>
+          <w:lang w:val="en-US"/>
+        </w:rPr>
+        <w:t xml:space="preserve"> and LSTM recurrent neural networks. </w:t>
       </w:r>
       <w:r>
         <w:rPr>
@@ -7558,14 +8426,46 @@
           <w:sz w:val="20"/>
           <w:lang w:val="en-US"/>
         </w:rPr>
-        <w:t xml:space="preserve">Virtanen, P., Gommers, R., Oliphant, T. E., et al. (2020). SciPy 1.0: Fundamental algorithms for scientific computing in Python. </w:t>
+        <w:t xml:space="preserve">Virtanen, P., </w:t>
+      </w:r>
+      <w:proofErr w:type="spellStart"/>
+      <w:r>
+        <w:rPr>
+          <w:sz w:val="20"/>
+          <w:lang w:val="en-US"/>
+        </w:rPr>
+        <w:t>Gommers</w:t>
+      </w:r>
+      <w:proofErr w:type="spellEnd"/>
+      <w:r>
+        <w:rPr>
+          <w:sz w:val="20"/>
+          <w:lang w:val="en-US"/>
+        </w:rPr>
+        <w:t xml:space="preserve">, R., Oliphant, T. E., et al. (2020). SciPy 1.0: Fundamental algorithms for scientific computing in Python. </w:t>
       </w:r>
       <w:r>
         <w:rPr>
           <w:i/>
           <w:sz w:val="20"/>
         </w:rPr>
-        <w:t>Nature Methods, 17</w:t>
+        <w:t xml:space="preserve">Nature </w:t>
+      </w:r>
+      <w:proofErr w:type="spellStart"/>
+      <w:r>
+        <w:rPr>
+          <w:i/>
+          <w:sz w:val="20"/>
+        </w:rPr>
+        <w:t>Methods</w:t>
+      </w:r>
+      <w:proofErr w:type="spellEnd"/>
+      <w:r>
+        <w:rPr>
+          <w:i/>
+          <w:sz w:val="20"/>
+        </w:rPr>
+        <w:t>, 17</w:t>
       </w:r>
       <w:r>
         <w:rPr>

</xml_diff>

<commit_message>
docs: alinea informe con supuestos metodologicos y corrige referencias APA7
</commit_message>
<xml_diff>
--- a/docs/informe_sumativa1_grupo2.docx
+++ b/docs/informe_sumativa1_grupo2.docx
@@ -1453,7 +1453,7 @@
           <w:r>
             <w:fldChar w:fldCharType="separate"/>
           </w:r>
-          <w:hyperlink w:anchor="_Toc242598455" w:history="1">
+          <w:hyperlink w:anchor="_Toc242715766" w:history="1">
             <w:r>
               <w:rPr>
                 <w:rStyle w:val="Hipervnculo"/>
@@ -1480,7 +1480,7 @@
                 <w:noProof/>
                 <w:webHidden/>
               </w:rPr>
-              <w:instrText xml:space="preserve"> PAGEREF _Toc242598455 \h </w:instrText>
+              <w:instrText xml:space="preserve"> PAGEREF _Toc242715766 \h </w:instrText>
             </w:r>
             <w:r>
               <w:rPr>
@@ -1527,7 +1527,7 @@
               <w14:ligatures w14:val="standardContextual"/>
             </w:rPr>
           </w:pPr>
-          <w:hyperlink w:anchor="_Toc242598456" w:history="1">
+          <w:hyperlink w:anchor="_Toc242715767" w:history="1">
             <w:r>
               <w:rPr>
                 <w:rStyle w:val="Hipervnculo"/>
@@ -1554,7 +1554,7 @@
                 <w:noProof/>
                 <w:webHidden/>
               </w:rPr>
-              <w:instrText xml:space="preserve"> PAGEREF _Toc242598456 \h </w:instrText>
+              <w:instrText xml:space="preserve"> PAGEREF _Toc242715767 \h </w:instrText>
             </w:r>
             <w:r>
               <w:rPr>
@@ -1601,7 +1601,7 @@
               <w14:ligatures w14:val="standardContextual"/>
             </w:rPr>
           </w:pPr>
-          <w:hyperlink w:anchor="_Toc242598457" w:history="1">
+          <w:hyperlink w:anchor="_Toc242715768" w:history="1">
             <w:r>
               <w:rPr>
                 <w:rStyle w:val="Hipervnculo"/>
@@ -1628,7 +1628,7 @@
                 <w:noProof/>
                 <w:webHidden/>
               </w:rPr>
-              <w:instrText xml:space="preserve"> PAGEREF _Toc242598457 \h </w:instrText>
+              <w:instrText xml:space="preserve"> PAGEREF _Toc242715768 \h </w:instrText>
             </w:r>
             <w:r>
               <w:rPr>
@@ -1675,7 +1675,7 @@
               <w14:ligatures w14:val="standardContextual"/>
             </w:rPr>
           </w:pPr>
-          <w:hyperlink w:anchor="_Toc242598458" w:history="1">
+          <w:hyperlink w:anchor="_Toc242715769" w:history="1">
             <w:r>
               <w:rPr>
                 <w:rStyle w:val="Hipervnculo"/>
@@ -1702,7 +1702,7 @@
                 <w:noProof/>
                 <w:webHidden/>
               </w:rPr>
-              <w:instrText xml:space="preserve"> PAGEREF _Toc242598458 \h </w:instrText>
+              <w:instrText xml:space="preserve"> PAGEREF _Toc242715769 \h </w:instrText>
             </w:r>
             <w:r>
               <w:rPr>
@@ -1749,7 +1749,7 @@
               <w14:ligatures w14:val="standardContextual"/>
             </w:rPr>
           </w:pPr>
-          <w:hyperlink w:anchor="_Toc242598459" w:history="1">
+          <w:hyperlink w:anchor="_Toc242715770" w:history="1">
             <w:r>
               <w:rPr>
                 <w:rStyle w:val="Hipervnculo"/>
@@ -1776,7 +1776,7 @@
                 <w:noProof/>
                 <w:webHidden/>
               </w:rPr>
-              <w:instrText xml:space="preserve"> PAGEREF _Toc242598459 \h </w:instrText>
+              <w:instrText xml:space="preserve"> PAGEREF _Toc242715770 \h </w:instrText>
             </w:r>
             <w:r>
               <w:rPr>
@@ -1823,7 +1823,7 @@
               <w14:ligatures w14:val="standardContextual"/>
             </w:rPr>
           </w:pPr>
-          <w:hyperlink w:anchor="_Toc242598460" w:history="1">
+          <w:hyperlink w:anchor="_Toc242715771" w:history="1">
             <w:r>
               <w:rPr>
                 <w:rStyle w:val="Hipervnculo"/>
@@ -1850,7 +1850,7 @@
                 <w:noProof/>
                 <w:webHidden/>
               </w:rPr>
-              <w:instrText xml:space="preserve"> PAGEREF _Toc242598460 \h </w:instrText>
+              <w:instrText xml:space="preserve"> PAGEREF _Toc242715771 \h </w:instrText>
             </w:r>
             <w:r>
               <w:rPr>
@@ -1897,7 +1897,7 @@
               <w14:ligatures w14:val="standardContextual"/>
             </w:rPr>
           </w:pPr>
-          <w:hyperlink w:anchor="_Toc242598461" w:history="1">
+          <w:hyperlink w:anchor="_Toc242715772" w:history="1">
             <w:r>
               <w:rPr>
                 <w:rStyle w:val="Hipervnculo"/>
@@ -1924,7 +1924,7 @@
                 <w:noProof/>
                 <w:webHidden/>
               </w:rPr>
-              <w:instrText xml:space="preserve"> PAGEREF _Toc242598461 \h </w:instrText>
+              <w:instrText xml:space="preserve"> PAGEREF _Toc242715772 \h </w:instrText>
             </w:r>
             <w:r>
               <w:rPr>
@@ -1944,7 +1944,7 @@
                 <w:noProof/>
                 <w:webHidden/>
               </w:rPr>
-              <w:t>6</w:t>
+              <w:t>7</w:t>
             </w:r>
             <w:r>
               <w:rPr>
@@ -1978,7 +1978,7 @@
       </w:pPr>
       <w:bookmarkStart w:id="0" w:name="_Toc242557114"/>
       <w:bookmarkStart w:id="1" w:name="_Toc242598244"/>
-      <w:bookmarkStart w:id="2" w:name="_Toc242598455"/>
+      <w:bookmarkStart w:id="2" w:name="_Toc242715766"/>
       <w:r>
         <w:t>1. Preparación y carga de datos</w:t>
       </w:r>
@@ -1995,21 +1995,7 @@
         <w:rPr>
           <w:sz w:val="21"/>
         </w:rPr>
-        <w:t xml:space="preserve">El </w:t>
-      </w:r>
-      <w:proofErr w:type="spellStart"/>
-      <w:r>
-        <w:rPr>
-          <w:sz w:val="21"/>
-        </w:rPr>
-        <w:t>dataset</w:t>
-      </w:r>
-      <w:proofErr w:type="spellEnd"/>
-      <w:r>
-        <w:rPr>
-          <w:sz w:val="21"/>
-        </w:rPr>
-        <w:t xml:space="preserve"> </w:t>
+        <w:t xml:space="preserve">El dataset </w:t>
       </w:r>
       <w:r>
         <w:rPr>
@@ -2575,21 +2561,7 @@
               <w:rPr>
                 <w:sz w:val="17"/>
               </w:rPr>
-              <w:t>Sin valores negativos; tasas en [</w:t>
-            </w:r>
-            <w:proofErr w:type="gramStart"/>
-            <w:r>
-              <w:rPr>
-                <w:sz w:val="17"/>
-              </w:rPr>
-              <w:t>0 ;</w:t>
-            </w:r>
-            <w:proofErr w:type="gramEnd"/>
-            <w:r>
-              <w:rPr>
-                <w:sz w:val="17"/>
-              </w:rPr>
-              <w:t xml:space="preserve"> 0,2]</w:t>
+              <w:t>Sin valores negativos; tasas en [0 ; 0,2]</w:t>
             </w:r>
           </w:p>
         </w:tc>
@@ -2880,39 +2852,47 @@
       <w:pPr>
         <w:spacing w:after="80" w:line="264" w:lineRule="auto"/>
         <w:jc w:val="both"/>
-      </w:pPr>
-      <w:r>
-        <w:rPr>
-          <w:sz w:val="21"/>
-        </w:rPr>
-        <w:t xml:space="preserve">Como resume la Tabla 1, no hay valores faltantes ni fuera de rango, y las anomalías detectadas son explicables por la forma en que se miden las métricas. Los duplicados </w:t>
-      </w:r>
-      <w:r>
-        <w:rPr>
-          <w:b/>
-          <w:sz w:val="21"/>
-        </w:rPr>
-        <w:t>no se eliminaron</w:t>
-      </w:r>
-      <w:r>
-        <w:rPr>
-          <w:sz w:val="21"/>
-        </w:rPr>
-        <w:t xml:space="preserve"> porque el </w:t>
+        <w:rPr>
+          <w:sz w:val="21"/>
+        </w:rPr>
+      </w:pPr>
+      <w:r>
+        <w:rPr>
+          <w:sz w:val="21"/>
+        </w:rPr>
+        <w:t xml:space="preserve">Como resume la Tabla 1, no hay valores faltantes ni fuera de rango, y las anomalías detectadas son explicables por la forma en que se miden las métricas. </w:t>
+      </w:r>
+      <w:r>
+        <w:rPr>
+          <w:sz w:val="21"/>
+        </w:rPr>
+        <w:t xml:space="preserve">Las 125 filas con valores idénticos (1,01 %) se conservaron, dado que la documentación original del dataset (Sakar &amp; </w:t>
       </w:r>
       <w:proofErr w:type="spellStart"/>
       <w:r>
         <w:rPr>
           <w:sz w:val="21"/>
         </w:rPr>
-        <w:t>dataset</w:t>
+        <w:t>Kastro</w:t>
       </w:r>
       <w:proofErr w:type="spellEnd"/>
       <w:r>
         <w:rPr>
           <w:sz w:val="21"/>
         </w:rPr>
-        <w:t xml:space="preserve"> no tiene un identificador de sesión o usuario que permita demostrar que son errores y no sesiones distintas con iguales características. No se aplicaron otras transformaciones; el archivo original se conserva sin modificar en </w:t>
+        <w:t>, 2018) establece que cada sesión corresponde a un usuario diferente. Por tanto, la coincidencia de atributos no demuestra que se trate de registros erróneos. Esta decisión evita excluir observaciones potencialmente válidas, aunque la existencia de usuarios diferentes no garantiza por sí sola la independencia estadística entre las sesiones.</w:t>
+      </w:r>
+      <w:r>
+        <w:rPr>
+          <w:sz w:val="21"/>
+        </w:rPr>
+        <w:t xml:space="preserve"> </w:t>
+      </w:r>
+      <w:r>
+        <w:rPr>
+          <w:sz w:val="21"/>
+        </w:rPr>
+        <w:t xml:space="preserve">No se aplicaron otras transformaciones; el archivo original se conserva sin modificar en </w:t>
       </w:r>
       <w:r>
         <w:rPr>
@@ -2935,7 +2915,7 @@
       </w:pPr>
       <w:bookmarkStart w:id="3" w:name="_Toc242557115"/>
       <w:bookmarkStart w:id="4" w:name="_Toc242598245"/>
-      <w:bookmarkStart w:id="5" w:name="_Toc242598456"/>
+      <w:bookmarkStart w:id="5" w:name="_Toc242715767"/>
       <w:r>
         <w:t>2. Análisis exploratorio de datos</w:t>
       </w:r>
@@ -3013,6 +2993,7 @@
           <w:b/>
           <w:sz w:val="21"/>
         </w:rPr>
+        <w:lastRenderedPageBreak/>
         <w:t>Variables numéricas.</w:t>
       </w:r>
       <w:r>
@@ -3060,14 +3041,7 @@
         <w:rPr>
           <w:sz w:val="21"/>
         </w:rPr>
-        <w:t xml:space="preserve">), y la curtosis en exceso, que vale 0 en una </w:t>
-      </w:r>
-      <w:r>
-        <w:rPr>
-          <w:sz w:val="21"/>
-        </w:rPr>
-        <w:lastRenderedPageBreak/>
-        <w:t>distribución normal, va de 4,02 a 137,17 (</w:t>
+        <w:t>), y la curtosis en exceso, que vale 0 en una distribución normal, va de 4,02 a 137,17 (</w:t>
       </w:r>
       <w:proofErr w:type="spellStart"/>
       <w:r>
@@ -5675,7 +5649,7 @@
       </w:pPr>
       <w:bookmarkStart w:id="6" w:name="_Toc242557116"/>
       <w:bookmarkStart w:id="7" w:name="_Toc242598246"/>
-      <w:bookmarkStart w:id="8" w:name="_Toc242598457"/>
+      <w:bookmarkStart w:id="8" w:name="_Toc242715768"/>
       <w:r>
         <w:t>3. Estimación de parámetros</w:t>
       </w:r>
@@ -5777,35 +5751,7 @@
         <w:rPr>
           <w:sz w:val="21"/>
         </w:rPr>
-        <w:t xml:space="preserve">: x̄ ± </w:t>
-      </w:r>
-      <w:proofErr w:type="gramStart"/>
-      <w:r>
-        <w:rPr>
-          <w:sz w:val="21"/>
-        </w:rPr>
-        <w:t>t(</w:t>
-      </w:r>
-      <w:proofErr w:type="gramEnd"/>
-      <w:r>
-        <w:rPr>
-          <w:sz w:val="21"/>
-        </w:rPr>
-        <w:t>0,975; n−</w:t>
-      </w:r>
-      <w:proofErr w:type="gramStart"/>
-      <w:r>
-        <w:rPr>
-          <w:sz w:val="21"/>
-        </w:rPr>
-        <w:t>1)·</w:t>
-      </w:r>
-      <w:proofErr w:type="gramEnd"/>
-      <w:r>
-        <w:rPr>
-          <w:sz w:val="21"/>
-        </w:rPr>
-        <w:t>s/√n.</w:t>
+        <w:t>: x̄ ± t(0,975; n−1)·s/√n.</w:t>
       </w:r>
     </w:p>
     <w:p>
@@ -6152,58 +6098,30 @@
               <w:rPr>
                 <w:sz w:val="17"/>
               </w:rPr>
-              <w:t>[1.160,</w:t>
-            </w:r>
-            <w:proofErr w:type="gramStart"/>
+              <w:t>[1.160,96 ; 1.228,53]</w:t>
+            </w:r>
+          </w:p>
+        </w:tc>
+        <w:tc>
+          <w:tcPr>
+            <w:tcW w:w="2154" w:type="dxa"/>
+            <w:tcBorders>
+              <w:top w:val="single" w:sz="4" w:space="0" w:color="000000"/>
+              <w:left w:val="nil"/>
+              <w:bottom w:val="nil"/>
+              <w:right w:val="nil"/>
+            </w:tcBorders>
+          </w:tcPr>
+          <w:p>
+            <w:pPr>
+              <w:keepNext/>
+              <w:jc w:val="both"/>
+            </w:pPr>
             <w:r>
               <w:rPr>
                 <w:sz w:val="17"/>
               </w:rPr>
-              <w:t>96 ;</w:t>
-            </w:r>
-            <w:proofErr w:type="gramEnd"/>
-            <w:r>
-              <w:rPr>
-                <w:sz w:val="17"/>
-              </w:rPr>
-              <w:t xml:space="preserve"> 1.228,53]</w:t>
-            </w:r>
-          </w:p>
-        </w:tc>
-        <w:tc>
-          <w:tcPr>
-            <w:tcW w:w="2154" w:type="dxa"/>
-            <w:tcBorders>
-              <w:top w:val="single" w:sz="4" w:space="0" w:color="000000"/>
-              <w:left w:val="nil"/>
-              <w:bottom w:val="nil"/>
-              <w:right w:val="nil"/>
-            </w:tcBorders>
-          </w:tcPr>
-          <w:p>
-            <w:pPr>
-              <w:keepNext/>
-              <w:jc w:val="both"/>
-            </w:pPr>
-            <w:r>
-              <w:rPr>
-                <w:sz w:val="17"/>
-              </w:rPr>
-              <w:t>[1.161,</w:t>
-            </w:r>
-            <w:proofErr w:type="gramStart"/>
-            <w:r>
-              <w:rPr>
-                <w:sz w:val="17"/>
-              </w:rPr>
-              <w:t>09 ;</w:t>
-            </w:r>
-            <w:proofErr w:type="gramEnd"/>
-            <w:r>
-              <w:rPr>
-                <w:sz w:val="17"/>
-              </w:rPr>
-              <w:t xml:space="preserve"> 1.229,04]</w:t>
+              <w:t>[1.161,09 ; 1.229,04]</w:t>
             </w:r>
           </w:p>
         </w:tc>
@@ -6303,58 +6221,30 @@
               <w:rPr>
                 <w:sz w:val="17"/>
               </w:rPr>
-              <w:t>[</w:t>
-            </w:r>
-            <w:proofErr w:type="gramStart"/>
+              <w:t>[5,561 ; 6,217]</w:t>
+            </w:r>
+          </w:p>
+        </w:tc>
+        <w:tc>
+          <w:tcPr>
+            <w:tcW w:w="2154" w:type="dxa"/>
+            <w:tcBorders>
+              <w:top w:val="nil"/>
+              <w:left w:val="nil"/>
+              <w:bottom w:val="nil"/>
+              <w:right w:val="nil"/>
+            </w:tcBorders>
+          </w:tcPr>
+          <w:p>
+            <w:pPr>
+              <w:keepNext/>
+              <w:jc w:val="both"/>
+            </w:pPr>
             <w:r>
               <w:rPr>
                 <w:sz w:val="17"/>
               </w:rPr>
-              <w:t>5,561 ;</w:t>
-            </w:r>
-            <w:proofErr w:type="gramEnd"/>
-            <w:r>
-              <w:rPr>
-                <w:sz w:val="17"/>
-              </w:rPr>
-              <w:t xml:space="preserve"> 6,217]</w:t>
-            </w:r>
-          </w:p>
-        </w:tc>
-        <w:tc>
-          <w:tcPr>
-            <w:tcW w:w="2154" w:type="dxa"/>
-            <w:tcBorders>
-              <w:top w:val="nil"/>
-              <w:left w:val="nil"/>
-              <w:bottom w:val="nil"/>
-              <w:right w:val="nil"/>
-            </w:tcBorders>
-          </w:tcPr>
-          <w:p>
-            <w:pPr>
-              <w:keepNext/>
-              <w:jc w:val="both"/>
-            </w:pPr>
-            <w:r>
-              <w:rPr>
-                <w:sz w:val="17"/>
-              </w:rPr>
-              <w:t>[</w:t>
-            </w:r>
-            <w:proofErr w:type="gramStart"/>
-            <w:r>
-              <w:rPr>
-                <w:sz w:val="17"/>
-              </w:rPr>
-              <w:t>5,572 ;</w:t>
-            </w:r>
-            <w:proofErr w:type="gramEnd"/>
-            <w:r>
-              <w:rPr>
-                <w:sz w:val="17"/>
-              </w:rPr>
-              <w:t xml:space="preserve"> 6,223]</w:t>
+              <w:t>[5,572 ; 6,223]</w:t>
             </w:r>
           </w:p>
         </w:tc>
@@ -6450,57 +6340,29 @@
               <w:rPr>
                 <w:sz w:val="17"/>
               </w:rPr>
-              <w:t>[0,</w:t>
-            </w:r>
-            <w:proofErr w:type="gramStart"/>
+              <w:t>[0,0422 ; 0,0439]</w:t>
+            </w:r>
+          </w:p>
+        </w:tc>
+        <w:tc>
+          <w:tcPr>
+            <w:tcW w:w="2154" w:type="dxa"/>
+            <w:tcBorders>
+              <w:top w:val="nil"/>
+              <w:left w:val="nil"/>
+              <w:bottom w:val="single" w:sz="8" w:space="0" w:color="000000"/>
+              <w:right w:val="nil"/>
+            </w:tcBorders>
+          </w:tcPr>
+          <w:p>
+            <w:pPr>
+              <w:jc w:val="both"/>
+            </w:pPr>
             <w:r>
               <w:rPr>
                 <w:sz w:val="17"/>
               </w:rPr>
-              <w:t>0422 ;</w:t>
-            </w:r>
-            <w:proofErr w:type="gramEnd"/>
-            <w:r>
-              <w:rPr>
-                <w:sz w:val="17"/>
-              </w:rPr>
-              <w:t xml:space="preserve"> 0,0439]</w:t>
-            </w:r>
-          </w:p>
-        </w:tc>
-        <w:tc>
-          <w:tcPr>
-            <w:tcW w:w="2154" w:type="dxa"/>
-            <w:tcBorders>
-              <w:top w:val="nil"/>
-              <w:left w:val="nil"/>
-              <w:bottom w:val="single" w:sz="8" w:space="0" w:color="000000"/>
-              <w:right w:val="nil"/>
-            </w:tcBorders>
-          </w:tcPr>
-          <w:p>
-            <w:pPr>
-              <w:jc w:val="both"/>
-            </w:pPr>
-            <w:r>
-              <w:rPr>
-                <w:sz w:val="17"/>
-              </w:rPr>
-              <w:t>[0,</w:t>
-            </w:r>
-            <w:proofErr w:type="gramStart"/>
-            <w:r>
-              <w:rPr>
-                <w:sz w:val="17"/>
-              </w:rPr>
-              <w:t>0422 ;</w:t>
-            </w:r>
-            <w:proofErr w:type="gramEnd"/>
-            <w:r>
-              <w:rPr>
-                <w:sz w:val="17"/>
-              </w:rPr>
-              <w:t xml:space="preserve"> 0,0440]</w:t>
+              <w:t>[0,0422 ; 0,0440]</w:t>
             </w:r>
           </w:p>
         </w:tc>
@@ -6659,21 +6521,7 @@
         <w:rPr>
           <w:sz w:val="21"/>
         </w:rPr>
-        <w:t xml:space="preserve"> se estimó en p̂ = 15,47 %, con IC 95 % (aproximación normal) de [14,84 </w:t>
-      </w:r>
-      <w:proofErr w:type="gramStart"/>
-      <w:r>
-        <w:rPr>
-          <w:sz w:val="21"/>
-        </w:rPr>
-        <w:t>% ;</w:t>
-      </w:r>
-      <w:proofErr w:type="gramEnd"/>
-      <w:r>
-        <w:rPr>
-          <w:sz w:val="21"/>
-        </w:rPr>
-        <w:t xml:space="preserve"> 16,11 %]; las condiciones </w:t>
+        <w:t xml:space="preserve"> se estimó en p̂ = 15,47 %, con IC 95 % (aproximación normal) de [14,84 % ; 16,11 %]; las condiciones </w:t>
       </w:r>
       <w:proofErr w:type="spellStart"/>
       <w:r>
@@ -6726,21 +6574,25 @@
         <w:rPr>
           <w:sz w:val="21"/>
         </w:rPr>
-        <w:t xml:space="preserve"> (1) en distribuciones muy asimétricas la media no representa necesariamente a la sesión típica, por lo que se reporta también la mediana; (2) se supone independencia entre sesiones, aunque el </w:t>
-      </w:r>
-      <w:proofErr w:type="spellStart"/>
-      <w:r>
-        <w:rPr>
-          <w:sz w:val="21"/>
-        </w:rPr>
-        <w:t>dataset</w:t>
-      </w:r>
-      <w:proofErr w:type="spellEnd"/>
-      <w:r>
-        <w:rPr>
-          <w:sz w:val="21"/>
-        </w:rPr>
-        <w:t xml:space="preserve"> no identifica usuarios y contiene 125 duplicados; (3) la estrechez de los intervalos refleja el gran n y no implica relevancia práctica.</w:t>
+        <w:t xml:space="preserve"> (1) en distribuciones muy asimétricas la media no representa necesariamente a la sesión típica, por lo que se reporta también la mediana; </w:t>
+      </w:r>
+      <w:r>
+        <w:rPr>
+          <w:sz w:val="21"/>
+        </w:rPr>
+        <w:t>(2) La documentación original indica que cada sesión corresponde a un usuario diferente, lo que respalda la conservación de las 125 filas con atributos idénticos. Sin embargo, esto no garantiza por sí solo la independencia estadística entre las observaciones;</w:t>
+      </w:r>
+      <w:r>
+        <w:rPr>
+          <w:sz w:val="21"/>
+        </w:rPr>
+        <w:t xml:space="preserve"> </w:t>
+      </w:r>
+      <w:r>
+        <w:rPr>
+          <w:sz w:val="21"/>
+        </w:rPr>
+        <w:t xml:space="preserve"> (3) la estrechez de los intervalos refleja el gran n y no implica relevancia práctica.</w:t>
       </w:r>
     </w:p>
     <w:p>
@@ -6750,7 +6602,7 @@
       </w:pPr>
       <w:bookmarkStart w:id="9" w:name="_Toc242557117"/>
       <w:bookmarkStart w:id="10" w:name="_Toc242598247"/>
-      <w:bookmarkStart w:id="11" w:name="_Toc242598458"/>
+      <w:bookmarkStart w:id="11" w:name="_Toc242715769"/>
       <w:r>
         <w:t>4. Pruebas de hipótesis</w:t>
       </w:r>
@@ -7696,7 +7548,7 @@
       </w:pPr>
       <w:bookmarkStart w:id="12" w:name="_Toc242557118"/>
       <w:bookmarkStart w:id="13" w:name="_Toc242598248"/>
-      <w:bookmarkStart w:id="14" w:name="_Toc242598459"/>
+      <w:bookmarkStart w:id="14" w:name="_Toc242715770"/>
       <w:r>
         <w:t>5. Informe de avance del proyecto</w:t>
       </w:r>
@@ -7832,11 +7684,24 @@
         <w:rPr>
           <w:sz w:val="21"/>
         </w:rPr>
-        <w:t xml:space="preserve"> solo el 15,47 % de las sesiones termina en compra, lo que exigirá métricas adecuadas a la clase minoritaria al modelar. (3) </w:t>
-      </w:r>
-      <w:r>
-        <w:rPr>
-          <w:b/>
+        <w:t xml:space="preserve"> solo el 15,47 % de las sesiones termina en compra, lo que exigirá métricas adecuadas a la clase minoritaria al modelar. </w:t>
+      </w:r>
+      <w:r>
+        <w:rPr>
+          <w:sz w:val="21"/>
+        </w:rPr>
+        <w:t>(</w:t>
+      </w:r>
+      <w:r>
+        <w:rPr>
+          <w:sz w:val="21"/>
+        </w:rPr>
+        <w:t xml:space="preserve">3) </w:t>
+      </w:r>
+      <w:r>
+        <w:rPr>
+          <w:b/>
+          <w:bCs/>
           <w:sz w:val="21"/>
         </w:rPr>
         <w:t>Filas idénticas:</w:t>
@@ -7845,7 +7710,19 @@
         <w:rPr>
           <w:sz w:val="21"/>
         </w:rPr>
-        <w:t xml:space="preserve"> hay 125 duplicados (1,01 %) y no existe identificador de usuario, por lo que la independencia entre sesiones no puede verificarse por completo. (4) </w:t>
+        <w:t xml:space="preserve"> se identificaron 125 registros con atributos coincidentes (1,01 %). Según la documentación original, corresponden a sesiones de usuarios diferentes, por lo que se conservaron. No obstante, esta información no permite garantizar independencia estadística absoluta entre las observaciones.</w:t>
+      </w:r>
+      <w:r>
+        <w:rPr>
+          <w:sz w:val="21"/>
+        </w:rPr>
+        <w:t xml:space="preserve"> </w:t>
+      </w:r>
+      <w:r>
+        <w:rPr>
+          <w:sz w:val="21"/>
+        </w:rPr>
+        <w:t xml:space="preserve"> (4) </w:t>
       </w:r>
       <w:r>
         <w:rPr>
@@ -7932,7 +7809,7 @@
       </w:pPr>
       <w:bookmarkStart w:id="15" w:name="_Toc242557119"/>
       <w:bookmarkStart w:id="16" w:name="_Toc242598249"/>
-      <w:bookmarkStart w:id="17" w:name="_Toc242598460"/>
+      <w:bookmarkStart w:id="17" w:name="_Toc242715771"/>
       <w:r>
         <w:t>6. Notebook y repositorio GitHub</w:t>
       </w:r>
@@ -8115,25 +7992,12 @@
     </w:p>
     <w:p>
       <w:pPr>
-        <w:rPr>
-          <w:b/>
-          <w:bCs/>
-          <w:sz w:val="28"/>
-          <w:szCs w:val="28"/>
-        </w:rPr>
+        <w:pStyle w:val="Ttulo1"/>
+        <w:jc w:val="both"/>
       </w:pPr>
       <w:bookmarkStart w:id="18" w:name="_Toc242557120"/>
       <w:bookmarkStart w:id="19" w:name="_Toc242598250"/>
-      <w:bookmarkStart w:id="20" w:name="_Toc242598461"/>
-      <w:r>
-        <w:br w:type="page"/>
-      </w:r>
-    </w:p>
-    <w:p>
-      <w:pPr>
-        <w:pStyle w:val="Ttulo1"/>
-        <w:jc w:val="both"/>
-      </w:pPr>
+      <w:bookmarkStart w:id="20" w:name="_Toc242715772"/>
       <w:r>
         <w:lastRenderedPageBreak/>
         <w:t>7. Bibliografía (APA 7)</w:t>
@@ -8368,23 +8232,7 @@
           <w:sz w:val="20"/>
           <w:lang w:val="en-US"/>
         </w:rPr>
-        <w:t xml:space="preserve">, Y. (2019). Real-time prediction of online shoppers' purchasing intention using multilayer </w:t>
-      </w:r>
-      <w:proofErr w:type="gramStart"/>
-      <w:r>
-        <w:rPr>
-          <w:sz w:val="20"/>
-          <w:lang w:val="en-US"/>
-        </w:rPr>
-        <w:t>perceptron</w:t>
-      </w:r>
-      <w:proofErr w:type="gramEnd"/>
-      <w:r>
-        <w:rPr>
-          <w:sz w:val="20"/>
-          <w:lang w:val="en-US"/>
-        </w:rPr>
-        <w:t xml:space="preserve"> and LSTM recurrent neural networks. </w:t>
+        <w:t xml:space="preserve">, Y. (2019). Real-time prediction of online shoppers' purchasing intention using multilayer perceptron and LSTM recurrent neural networks. </w:t>
       </w:r>
       <w:r>
         <w:rPr>
@@ -8417,61 +8265,13 @@
         <w:spacing w:after="80"/>
         <w:ind w:left="567" w:hanging="567"/>
         <w:jc w:val="both"/>
-        <w:rPr>
-          <w:sz w:val="20"/>
-        </w:rPr>
       </w:pPr>
       <w:r>
         <w:rPr>
           <w:sz w:val="20"/>
           <w:lang w:val="en-US"/>
         </w:rPr>
-        <w:t xml:space="preserve">Virtanen, P., </w:t>
-      </w:r>
-      <w:proofErr w:type="spellStart"/>
-      <w:r>
-        <w:rPr>
-          <w:sz w:val="20"/>
-          <w:lang w:val="en-US"/>
-        </w:rPr>
-        <w:t>Gommers</w:t>
-      </w:r>
-      <w:proofErr w:type="spellEnd"/>
-      <w:r>
-        <w:rPr>
-          <w:sz w:val="20"/>
-          <w:lang w:val="en-US"/>
-        </w:rPr>
-        <w:t xml:space="preserve">, R., Oliphant, T. E., et al. (2020). SciPy 1.0: Fundamental algorithms for scientific computing in Python. </w:t>
-      </w:r>
-      <w:r>
-        <w:rPr>
-          <w:i/>
-          <w:sz w:val="20"/>
-        </w:rPr>
-        <w:t xml:space="preserve">Nature </w:t>
-      </w:r>
-      <w:proofErr w:type="spellStart"/>
-      <w:r>
-        <w:rPr>
-          <w:i/>
-          <w:sz w:val="20"/>
-        </w:rPr>
-        <w:t>Methods</w:t>
-      </w:r>
-      <w:proofErr w:type="spellEnd"/>
-      <w:r>
-        <w:rPr>
-          <w:i/>
-          <w:sz w:val="20"/>
-        </w:rPr>
-        <w:t>, 17</w:t>
-      </w:r>
-      <w:r>
-        <w:rPr>
-          <w:sz w:val="20"/>
-        </w:rPr>
-        <w:t xml:space="preserve">, 261–272. </w:t>
+        <w:t xml:space="preserve">Virtanen, P., Gommers, R., Oliphant, T. E., Haberland, M., Reddy, T., Cournapeau, D., Burovski, E., Peterson, P., Weckesser, W., Bright, J., van der Walt, S. J., Brett, M., Wilson, J., Millman, K. J., Mayorov, N., Nelson, A. R. J., Jones, E., Kern, R., Larson, E., … van Mulbregt, P. (2020). SciPy 1.0: Fundamental algorithms for scientific computing in Python. Nature Methods, 17(3), 261–272. </w:t>
       </w:r>
       <w:hyperlink r:id="rId26" w:history="1">
         <w:r>
@@ -8482,13 +8282,6 @@
           <w:t>https://doi.org/10.1038/s41592-019-0686-2</w:t>
         </w:r>
       </w:hyperlink>
-    </w:p>
-    <w:p>
-      <w:pPr>
-        <w:spacing w:after="80"/>
-        <w:ind w:left="567" w:hanging="567"/>
-        <w:jc w:val="both"/>
-      </w:pPr>
     </w:p>
     <w:sectPr>
       <w:footerReference w:type="default" r:id="rId27"/>
@@ -9244,7 +9037,6 @@
   <w:style w:type="character" w:default="1" w:styleId="Fuentedeprrafopredeter">
     <w:name w:val="Default Paragraph Font"/>
     <w:uiPriority w:val="1"/>
-    <w:semiHidden/>
     <w:unhideWhenUsed/>
   </w:style>
   <w:style w:type="table" w:default="1" w:styleId="Tablanormal">
@@ -9449,6 +9241,19 @@
     <w:pPr>
       <w:ind w:left="220" w:hanging="220"/>
     </w:pPr>
+  </w:style>
+  <w:style w:type="paragraph" w:styleId="NormalWeb">
+    <w:name w:val="Normal (Web)"/>
+    <w:basedOn w:val="Normal"/>
+    <w:uiPriority w:val="99"/>
+    <w:semiHidden/>
+    <w:unhideWhenUsed/>
+    <w:rsid w:val="00F514B7"/>
+    <w:rPr>
+      <w:rFonts w:ascii="Times New Roman" w:hAnsi="Times New Roman" w:cs="Times New Roman"/>
+      <w:sz w:val="24"/>
+      <w:szCs w:val="24"/>
+    </w:rPr>
   </w:style>
 </w:styles>
 </file>

</xml_diff>

<commit_message>
docs: Corrige detalles de forma en informe_sumativa1_grupo2
</commit_message>
<xml_diff>
--- a/docs/informe_sumativa1_grupo2.docx
+++ b/docs/informe_sumativa1_grupo2.docx
@@ -1068,25 +1068,33 @@
     <w:p>
       <w:pPr>
         <w:pStyle w:val="Textoindependiente"/>
+        <w:jc w:val="both"/>
+        <w:rPr>
+          <w:b/>
+          <w:sz w:val="20"/>
+        </w:rPr>
+      </w:pPr>
+    </w:p>
+    <w:p>
+      <w:pPr>
+        <w:pStyle w:val="Textoindependiente"/>
         <w:spacing w:before="8"/>
         <w:jc w:val="both"/>
-      </w:pPr>
-      <w:r>
-        <w:rPr>
-          <w:b/>
-          <w:bCs/>
-        </w:rPr>
-        <w:t>Título del proyecto:</w:t>
-      </w:r>
-      <w:r>
-        <w:t xml:space="preserve"> </w:t>
-      </w:r>
-      <w:r>
         <w:rPr>
           <w:sz w:val="20"/>
           <w:szCs w:val="20"/>
-        </w:rPr>
-        <w:t>Comportamiento de navegación e intención de compra en un comercio electrónico</w:t>
+          <w:lang w:val="es-CL"/>
+        </w:rPr>
+      </w:pPr>
+      <w:r>
+        <w:rPr>
+          <w:b/>
+          <w:bCs/>
+        </w:rPr>
+        <w:t>Título del proyecto:</w:t>
+      </w:r>
+      <w:r>
+        <w:t xml:space="preserve"> </w:t>
       </w:r>
     </w:p>
     <w:p>
@@ -1094,13 +1102,51 @@
         <w:pStyle w:val="Textoindependiente"/>
         <w:spacing w:before="8"/>
         <w:jc w:val="both"/>
-      </w:pPr>
+        <w:rPr>
+          <w:sz w:val="20"/>
+          <w:szCs w:val="20"/>
+          <w:lang w:val="es-CL"/>
+        </w:rPr>
+      </w:pPr>
+      <w:r>
+        <w:rPr>
+          <w:sz w:val="20"/>
+          <w:szCs w:val="20"/>
+          <w:lang w:val="es-CL"/>
+        </w:rPr>
+        <w:t>Inferencia Estadística Computacional sobre Métricas de Sesión Web: Identificación de Factores Determinantes en la Decisión de Compra (</w:t>
+      </w:r>
+      <w:proofErr w:type="spellStart"/>
+      <w:r>
+        <w:rPr>
+          <w:sz w:val="20"/>
+          <w:szCs w:val="20"/>
+          <w:lang w:val="es-CL"/>
+        </w:rPr>
+        <w:t>Revenue</w:t>
+      </w:r>
+      <w:proofErr w:type="spellEnd"/>
+      <w:r>
+        <w:rPr>
+          <w:sz w:val="20"/>
+          <w:szCs w:val="20"/>
+          <w:lang w:val="es-CL"/>
+        </w:rPr>
+        <w:t>) en Comercio Electrónico</w:t>
+      </w:r>
     </w:p>
     <w:p>
       <w:pPr>
         <w:pStyle w:val="Textoindependiente"/>
         <w:spacing w:before="8"/>
         <w:jc w:val="both"/>
+      </w:pPr>
+    </w:p>
+    <w:p>
+      <w:pPr>
+        <w:pStyle w:val="Textoindependiente"/>
+        <w:spacing w:before="8"/>
+        <w:jc w:val="both"/>
         <w:rPr>
           <w:lang w:val="en-US"/>
         </w:rPr>
@@ -1119,6 +1165,16 @@
         </w:rPr>
         <w:t xml:space="preserve"> </w:t>
       </w:r>
+    </w:p>
+    <w:p>
+      <w:pPr>
+        <w:pStyle w:val="Textoindependiente"/>
+        <w:spacing w:before="8"/>
+        <w:jc w:val="both"/>
+        <w:rPr>
+          <w:lang w:val="en-US"/>
+        </w:rPr>
+      </w:pPr>
       <w:r>
         <w:rPr>
           <w:sz w:val="20"/>
@@ -1140,8 +1196,178 @@
     </w:p>
     <w:p>
       <w:pPr>
-        <w:spacing w:before="93"/>
-        <w:ind w:right="5811"/>
+        <w:pStyle w:val="Textoindependiente"/>
+        <w:spacing w:before="8"/>
+        <w:jc w:val="both"/>
+        <w:rPr>
+          <w:b/>
+        </w:rPr>
+      </w:pPr>
+      <w:proofErr w:type="spellStart"/>
+      <w:r>
+        <w:rPr>
+          <w:b/>
+          <w:bCs/>
+          <w:lang w:val="en-US"/>
+        </w:rPr>
+        <w:t>I</w:t>
+      </w:r>
+      <w:r>
+        <w:rPr>
+          <w:b/>
+          <w:bCs/>
+          <w:lang w:val="en-US"/>
+        </w:rPr>
+        <w:t>ntegrante</w:t>
+      </w:r>
+      <w:r>
+        <w:rPr>
+          <w:b/>
+          <w:bCs/>
+          <w:lang w:val="en-US"/>
+        </w:rPr>
+        <w:t>s</w:t>
+      </w:r>
+      <w:proofErr w:type="spellEnd"/>
+      <w:r>
+        <w:rPr>
+          <w:b/>
+          <w:bCs/>
+          <w:lang w:val="en-US"/>
+        </w:rPr>
+        <w:t>:</w:t>
+      </w:r>
+    </w:p>
+    <w:p>
+      <w:pPr>
+        <w:pStyle w:val="Textoindependiente"/>
+        <w:spacing w:before="8"/>
+        <w:jc w:val="both"/>
+      </w:pPr>
+      <w:r>
+        <w:t xml:space="preserve">Verónica Durán Cisterna </w:t>
+      </w:r>
+    </w:p>
+    <w:p>
+      <w:pPr>
+        <w:pStyle w:val="Textoindependiente"/>
+        <w:spacing w:before="8"/>
+        <w:jc w:val="both"/>
+      </w:pPr>
+      <w:r>
+        <w:t>Raúl Moya Arriagada</w:t>
+      </w:r>
+    </w:p>
+    <w:p>
+      <w:pPr>
+        <w:pStyle w:val="Textoindependiente"/>
+        <w:spacing w:before="8"/>
+        <w:jc w:val="both"/>
+      </w:pPr>
+      <w:r>
+        <w:t>Daniela Rojas Vilches</w:t>
+      </w:r>
+      <w:r>
+        <w:tab/>
+      </w:r>
+    </w:p>
+    <w:p>
+      <w:pPr>
+        <w:pStyle w:val="Textoindependiente"/>
+        <w:spacing w:before="8"/>
+        <w:jc w:val="both"/>
+      </w:pPr>
+      <w:r>
+        <w:t>Manuel Sánchez Cárcamo</w:t>
+      </w:r>
+    </w:p>
+    <w:p>
+      <w:pPr>
+        <w:pStyle w:val="Textoindependiente"/>
+        <w:spacing w:before="8"/>
+        <w:jc w:val="both"/>
+      </w:pPr>
+    </w:p>
+    <w:p>
+      <w:pPr>
+        <w:pStyle w:val="Textoindependiente"/>
+        <w:spacing w:before="8"/>
+        <w:jc w:val="both"/>
+      </w:pPr>
+      <w:r>
+        <w:rPr>
+          <w:b/>
+          <w:bCs/>
+        </w:rPr>
+        <w:t>Docente:</w:t>
+      </w:r>
+      <w:r>
+        <w:t xml:space="preserve"> </w:t>
+      </w:r>
+    </w:p>
+    <w:p>
+      <w:pPr>
+        <w:pStyle w:val="Textoindependiente"/>
+        <w:spacing w:before="8"/>
+        <w:jc w:val="both"/>
+      </w:pPr>
+      <w:r>
+        <w:t xml:space="preserve">Dr. </w:t>
+      </w:r>
+      <w:r>
+        <w:rPr>
+          <w:sz w:val="20"/>
+          <w:szCs w:val="20"/>
+        </w:rPr>
+        <w:t>J</w:t>
+      </w:r>
+      <w:r>
+        <w:rPr>
+          <w:sz w:val="20"/>
+          <w:szCs w:val="20"/>
+        </w:rPr>
+        <w:t>ean</w:t>
+      </w:r>
+      <w:r>
+        <w:rPr>
+          <w:sz w:val="20"/>
+          <w:szCs w:val="20"/>
+        </w:rPr>
+        <w:t xml:space="preserve"> Pa</w:t>
+      </w:r>
+      <w:r>
+        <w:rPr>
+          <w:sz w:val="20"/>
+          <w:szCs w:val="20"/>
+        </w:rPr>
+        <w:t>ul</w:t>
+      </w:r>
+      <w:r>
+        <w:rPr>
+          <w:sz w:val="20"/>
+          <w:szCs w:val="20"/>
+        </w:rPr>
+        <w:t xml:space="preserve"> Maidana</w:t>
+      </w:r>
+      <w:r>
+        <w:rPr>
+          <w:sz w:val="20"/>
+          <w:szCs w:val="20"/>
+        </w:rPr>
+        <w:t xml:space="preserve"> González</w:t>
+      </w:r>
+    </w:p>
+    <w:p>
+      <w:pPr>
+        <w:pStyle w:val="Textoindependiente"/>
+        <w:spacing w:before="8"/>
+        <w:jc w:val="both"/>
+      </w:pPr>
+    </w:p>
+    <w:p>
+      <w:pPr>
+        <w:pStyle w:val="Textoindependiente"/>
+        <w:spacing w:before="8"/>
         <w:jc w:val="both"/>
         <w:rPr>
           <w:b/>
@@ -1153,16 +1379,9 @@
         <w:rPr>
           <w:b/>
           <w:color w:val="231F20"/>
-        </w:rPr>
-        <w:t>Nombre</w:t>
-      </w:r>
-      <w:r>
-        <w:rPr>
-          <w:b/>
-          <w:color w:val="231F20"/>
-          <w:spacing w:val="-5"/>
-        </w:rPr>
-        <w:t xml:space="preserve"> </w:t>
+          <w:spacing w:val="-2"/>
+        </w:rPr>
+        <w:t>Curso:</w:t>
       </w:r>
       <w:r>
         <w:rPr>
@@ -1170,37 +1389,68 @@
           <w:color w:val="231F20"/>
           <w:spacing w:val="-2"/>
         </w:rPr>
-        <w:t>integrante:</w:t>
-      </w:r>
-    </w:p>
-    <w:p>
-      <w:pPr>
-        <w:spacing w:before="93"/>
-        <w:ind w:left="113" w:right="8051"/>
-        <w:jc w:val="both"/>
-        <w:rPr>
-          <w:b/>
-        </w:rPr>
-      </w:pPr>
+        <w:t xml:space="preserve">  </w:t>
+      </w:r>
     </w:p>
     <w:p>
       <w:pPr>
         <w:pStyle w:val="Textoindependiente"/>
         <w:spacing w:before="8"/>
         <w:jc w:val="both"/>
-      </w:pPr>
-      <w:r>
-        <w:t xml:space="preserve">Verónica Durán Cisterna </w:t>
-      </w:r>
+        <w:rPr>
+          <w:b/>
+          <w:sz w:val="19"/>
+        </w:rPr>
+      </w:pPr>
+      <w:r>
+        <w:t>MCDI501 - Estadística Computacional para la Toma de Decisiones</w:t>
+      </w:r>
+    </w:p>
+    <w:p>
+      <w:pPr>
+        <w:spacing w:line="252" w:lineRule="exact"/>
+        <w:jc w:val="both"/>
+        <w:rPr>
+          <w:b/>
+          <w:color w:val="231F20"/>
+          <w:spacing w:val="-2"/>
+        </w:rPr>
+      </w:pPr>
     </w:p>
     <w:p>
       <w:pPr>
         <w:pStyle w:val="Textoindependiente"/>
         <w:spacing w:before="8"/>
         <w:jc w:val="both"/>
-      </w:pPr>
-      <w:r>
-        <w:t>Raúl Moya Arriagada</w:t>
+        <w:rPr>
+          <w:b/>
+          <w:color w:val="231F20"/>
+          <w:spacing w:val="-2"/>
+        </w:rPr>
+      </w:pPr>
+      <w:r>
+        <w:rPr>
+          <w:b/>
+          <w:color w:val="231F20"/>
+          <w:spacing w:val="-2"/>
+        </w:rPr>
+        <w:t>Fecha:</w:t>
+      </w:r>
+      <w:r>
+        <w:rPr>
+          <w:b/>
+          <w:color w:val="231F20"/>
+          <w:spacing w:val="-2"/>
+        </w:rPr>
+        <w:t xml:space="preserve">  </w:t>
+      </w:r>
+      <w:r>
+        <w:rPr>
+          <w:b/>
+          <w:color w:val="231F20"/>
+          <w:spacing w:val="-2"/>
+        </w:rPr>
+        <w:t xml:space="preserve"> </w:t>
       </w:r>
     </w:p>
     <w:p>
@@ -1208,138 +1458,12 @@
         <w:pStyle w:val="Textoindependiente"/>
         <w:spacing w:before="8"/>
         <w:jc w:val="both"/>
-      </w:pPr>
-      <w:r>
-        <w:t>Daniela Rojas Vilches</w:t>
-      </w:r>
-      <w:r>
-        <w:tab/>
-      </w:r>
-    </w:p>
-    <w:p>
-      <w:pPr>
-        <w:pStyle w:val="Textoindependiente"/>
-        <w:spacing w:before="8"/>
-        <w:jc w:val="both"/>
-      </w:pPr>
-      <w:r>
-        <w:t>Manuel Sánchez Cárcamo</w:t>
-      </w:r>
-    </w:p>
-    <w:p>
-      <w:pPr>
-        <w:pStyle w:val="Textoindependiente"/>
-        <w:spacing w:before="8"/>
-        <w:jc w:val="both"/>
-      </w:pPr>
-    </w:p>
-    <w:p>
-      <w:pPr>
-        <w:pStyle w:val="Textoindependiente"/>
-        <w:spacing w:before="8"/>
-        <w:jc w:val="both"/>
-      </w:pPr>
-      <w:r>
-        <w:rPr>
-          <w:b/>
-          <w:bCs/>
-        </w:rPr>
-        <w:t>Docente:</w:t>
-      </w:r>
-      <w:r>
-        <w:t xml:space="preserve"> </w:t>
-      </w:r>
-      <w:r>
-        <w:rPr>
-          <w:sz w:val="20"/>
-          <w:szCs w:val="20"/>
-        </w:rPr>
-        <w:t>Juan Pablo Maidana</w:t>
-      </w:r>
-    </w:p>
-    <w:p>
-      <w:pPr>
-        <w:pStyle w:val="Textoindependiente"/>
-        <w:spacing w:before="8"/>
-        <w:jc w:val="both"/>
-      </w:pPr>
-    </w:p>
-    <w:p>
-      <w:pPr>
-        <w:pStyle w:val="Textoindependiente"/>
-        <w:spacing w:before="8"/>
-        <w:jc w:val="both"/>
-        <w:rPr>
-          <w:b/>
-          <w:sz w:val="19"/>
-        </w:rPr>
-      </w:pPr>
-      <w:r>
         <w:rPr>
           <w:b/>
           <w:color w:val="231F20"/>
           <w:spacing w:val="-2"/>
         </w:rPr>
-        <w:t>Curso:</w:t>
-      </w:r>
-      <w:r>
-        <w:rPr>
-          <w:b/>
-          <w:color w:val="231F20"/>
-          <w:spacing w:val="-2"/>
-        </w:rPr>
-        <w:t xml:space="preserve">  </w:t>
-      </w:r>
-      <w:r>
-        <w:t>MCDI501 - Estadística Computacional para la Toma de Decisiones</w:t>
-      </w:r>
-    </w:p>
-    <w:p>
-      <w:pPr>
-        <w:spacing w:line="252" w:lineRule="exact"/>
-        <w:jc w:val="both"/>
-        <w:rPr>
-          <w:b/>
-          <w:color w:val="231F20"/>
-          <w:spacing w:val="-2"/>
-        </w:rPr>
-      </w:pPr>
-    </w:p>
-    <w:p>
-      <w:pPr>
-        <w:pStyle w:val="Textoindependiente"/>
-        <w:spacing w:before="8"/>
-        <w:jc w:val="both"/>
-        <w:rPr>
-          <w:b/>
-          <w:color w:val="231F20"/>
-          <w:spacing w:val="-2"/>
-        </w:rPr>
-      </w:pPr>
-      <w:r>
-        <w:rPr>
-          <w:b/>
-          <w:color w:val="231F20"/>
-          <w:spacing w:val="-2"/>
-        </w:rPr>
-        <w:t>Fecha:</w:t>
-      </w:r>
-      <w:r>
-        <w:rPr>
-          <w:b/>
-          <w:color w:val="231F20"/>
-          <w:spacing w:val="-2"/>
-        </w:rPr>
-        <w:t xml:space="preserve">  </w:t>
-      </w:r>
-      <w:r>
-        <w:rPr>
-          <w:b/>
-          <w:color w:val="231F20"/>
-          <w:spacing w:val="-2"/>
-        </w:rPr>
-        <w:t xml:space="preserve"> </w:t>
-      </w:r>
+      </w:pPr>
       <w:r>
         <w:rPr>
           <w:bCs/>
@@ -1370,14 +1494,29 @@
       </w:pPr>
       <w:r>
         <w:rPr>
-          <w:b/>
-          <w:bCs/>
+          <w:rFonts w:ascii="Arial" w:eastAsia="Arial" w:hAnsi="Arial" w:cs="Arial"/>
+          <w:b/>
+          <w:color w:val="231F20"/>
+          <w:spacing w:val="-2"/>
+          <w:lang w:val="es-ES" w:eastAsia="en-US"/>
         </w:rPr>
         <w:t>Repositorio</w:t>
       </w:r>
       <w:r>
-        <w:t xml:space="preserve">:  </w:t>
-      </w:r>
+        <w:rPr>
+          <w:b/>
+        </w:rPr>
+        <w:t>:</w:t>
+      </w:r>
+      <w:r>
+        <w:t xml:space="preserve">  </w:t>
+      </w:r>
+    </w:p>
+    <w:p>
+      <w:pPr>
+        <w:spacing w:line="252" w:lineRule="exact"/>
+        <w:jc w:val="both"/>
+      </w:pPr>
       <w:hyperlink r:id="rId19" w:history="1">
         <w:r>
           <w:rPr>
@@ -1395,11 +1534,13 @@
         <w:br w:type="page"/>
       </w:r>
     </w:p>
+    <w:bookmarkStart w:id="0" w:name="_Toc242740187" w:displacedByCustomXml="next"/>
     <w:sdt>
       <w:sdtPr>
         <w:rPr>
-          <w:rFonts w:ascii="Calibri" w:eastAsia="Calibri" w:hAnsi="Calibri" w:cs="Calibri"/>
-          <w:color w:val="000000"/>
+          <w:b w:val="0"/>
+          <w:bCs w:val="0"/>
+          <w:color w:val="4472C4" w:themeColor="accent1"/>
           <w:sz w:val="22"/>
           <w:szCs w:val="22"/>
           <w:lang w:val="es-ES"/>
@@ -1412,21 +1553,25 @@
       </w:sdtPr>
       <w:sdtEndPr>
         <w:rPr>
-          <w:b/>
-          <w:bCs/>
+          <w:color w:val="000000"/>
         </w:rPr>
       </w:sdtEndPr>
       <w:sdtContent>
         <w:p>
           <w:pPr>
-            <w:pStyle w:val="TtuloTDC"/>
+            <w:pStyle w:val="Ttulo1"/>
+            <w:rPr>
+              <w:color w:val="4472C4" w:themeColor="accent1"/>
+            </w:rPr>
           </w:pPr>
           <w:r>
             <w:rPr>
+              <w:color w:val="4472C4" w:themeColor="accent1"/>
               <w:lang w:val="es-ES"/>
             </w:rPr>
-            <w:t>Contenido</w:t>
+            <w:t>Índice</w:t>
           </w:r>
+          <w:bookmarkEnd w:id="0"/>
         </w:p>
         <w:p>
           <w:pPr>
@@ -1453,13 +1598,14 @@
           <w:r>
             <w:fldChar w:fldCharType="separate"/>
           </w:r>
-          <w:hyperlink w:anchor="_Toc242715766" w:history="1">
+          <w:hyperlink w:anchor="_Toc242740187" w:history="1">
             <w:r>
               <w:rPr>
                 <w:rStyle w:val="Hipervnculo"/>
                 <w:noProof/>
-              </w:rPr>
-              <w:t>1. Preparación y carga de datos</w:t>
+                <w:lang w:val="es-ES"/>
+              </w:rPr>
+              <w:t>Índice</w:t>
             </w:r>
             <w:r>
               <w:rPr>
@@ -1480,7 +1626,7 @@
                 <w:noProof/>
                 <w:webHidden/>
               </w:rPr>
-              <w:instrText xml:space="preserve"> PAGEREF _Toc242715766 \h </w:instrText>
+              <w:instrText xml:space="preserve"> PAGEREF _Toc242740187 \h </w:instrText>
             </w:r>
             <w:r>
               <w:rPr>
@@ -1527,13 +1673,13 @@
               <w14:ligatures w14:val="standardContextual"/>
             </w:rPr>
           </w:pPr>
-          <w:hyperlink w:anchor="_Toc242715767" w:history="1">
+          <w:hyperlink w:anchor="_Toc242740188" w:history="1">
             <w:r>
               <w:rPr>
                 <w:rStyle w:val="Hipervnculo"/>
                 <w:noProof/>
               </w:rPr>
-              <w:t>2. Análisis exploratorio de datos</w:t>
+              <w:t>1. Preparación y carga de datos</w:t>
             </w:r>
             <w:r>
               <w:rPr>
@@ -1554,7 +1700,7 @@
                 <w:noProof/>
                 <w:webHidden/>
               </w:rPr>
-              <w:instrText xml:space="preserve"> PAGEREF _Toc242715767 \h </w:instrText>
+              <w:instrText xml:space="preserve"> PAGEREF _Toc242740188 \h </w:instrText>
             </w:r>
             <w:r>
               <w:rPr>
@@ -1574,7 +1720,7 @@
                 <w:noProof/>
                 <w:webHidden/>
               </w:rPr>
-              <w:t>2</w:t>
+              <w:t>3</w:t>
             </w:r>
             <w:r>
               <w:rPr>
@@ -1601,13 +1747,13 @@
               <w14:ligatures w14:val="standardContextual"/>
             </w:rPr>
           </w:pPr>
-          <w:hyperlink w:anchor="_Toc242715768" w:history="1">
+          <w:hyperlink w:anchor="_Toc242740189" w:history="1">
             <w:r>
               <w:rPr>
                 <w:rStyle w:val="Hipervnculo"/>
                 <w:noProof/>
               </w:rPr>
-              <w:t>3. Estimación de parámetros</w:t>
+              <w:t>2. Análisis exploratorio de datos</w:t>
             </w:r>
             <w:r>
               <w:rPr>
@@ -1628,7 +1774,7 @@
                 <w:noProof/>
                 <w:webHidden/>
               </w:rPr>
-              <w:instrText xml:space="preserve"> PAGEREF _Toc242715768 \h </w:instrText>
+              <w:instrText xml:space="preserve"> PAGEREF _Toc242740189 \h </w:instrText>
             </w:r>
             <w:r>
               <w:rPr>
@@ -1648,7 +1794,7 @@
                 <w:noProof/>
                 <w:webHidden/>
               </w:rPr>
-              <w:t>4</w:t>
+              <w:t>3</w:t>
             </w:r>
             <w:r>
               <w:rPr>
@@ -1675,13 +1821,13 @@
               <w14:ligatures w14:val="standardContextual"/>
             </w:rPr>
           </w:pPr>
-          <w:hyperlink w:anchor="_Toc242715769" w:history="1">
+          <w:hyperlink w:anchor="_Toc242740190" w:history="1">
             <w:r>
               <w:rPr>
                 <w:rStyle w:val="Hipervnculo"/>
                 <w:noProof/>
               </w:rPr>
-              <w:t>4. Pruebas de hipótesis</w:t>
+              <w:t>3. Estimación de parámetros</w:t>
             </w:r>
             <w:r>
               <w:rPr>
@@ -1702,7 +1848,7 @@
                 <w:noProof/>
                 <w:webHidden/>
               </w:rPr>
-              <w:instrText xml:space="preserve"> PAGEREF _Toc242715769 \h </w:instrText>
+              <w:instrText xml:space="preserve"> PAGEREF _Toc242740190 \h </w:instrText>
             </w:r>
             <w:r>
               <w:rPr>
@@ -1749,13 +1895,13 @@
               <w14:ligatures w14:val="standardContextual"/>
             </w:rPr>
           </w:pPr>
-          <w:hyperlink w:anchor="_Toc242715770" w:history="1">
+          <w:hyperlink w:anchor="_Toc242740191" w:history="1">
             <w:r>
               <w:rPr>
                 <w:rStyle w:val="Hipervnculo"/>
                 <w:noProof/>
               </w:rPr>
-              <w:t>5. Informe de avance del proyecto</w:t>
+              <w:t>4. Pruebas de hipótesis</w:t>
             </w:r>
             <w:r>
               <w:rPr>
@@ -1776,7 +1922,7 @@
                 <w:noProof/>
                 <w:webHidden/>
               </w:rPr>
-              <w:instrText xml:space="preserve"> PAGEREF _Toc242715770 \h </w:instrText>
+              <w:instrText xml:space="preserve"> PAGEREF _Toc242740191 \h </w:instrText>
             </w:r>
             <w:r>
               <w:rPr>
@@ -1823,13 +1969,13 @@
               <w14:ligatures w14:val="standardContextual"/>
             </w:rPr>
           </w:pPr>
-          <w:hyperlink w:anchor="_Toc242715771" w:history="1">
+          <w:hyperlink w:anchor="_Toc242740192" w:history="1">
             <w:r>
               <w:rPr>
                 <w:rStyle w:val="Hipervnculo"/>
                 <w:noProof/>
               </w:rPr>
-              <w:t>6. Notebook y repositorio GitHub</w:t>
+              <w:t>5. Informe de avance del proyecto</w:t>
             </w:r>
             <w:r>
               <w:rPr>
@@ -1850,7 +1996,7 @@
                 <w:noProof/>
                 <w:webHidden/>
               </w:rPr>
-              <w:instrText xml:space="preserve"> PAGEREF _Toc242715771 \h </w:instrText>
+              <w:instrText xml:space="preserve"> PAGEREF _Toc242740192 \h </w:instrText>
             </w:r>
             <w:r>
               <w:rPr>
@@ -1870,7 +2016,7 @@
                 <w:noProof/>
                 <w:webHidden/>
               </w:rPr>
-              <w:t>6</w:t>
+              <w:t>7</w:t>
             </w:r>
             <w:r>
               <w:rPr>
@@ -1897,13 +2043,13 @@
               <w14:ligatures w14:val="standardContextual"/>
             </w:rPr>
           </w:pPr>
-          <w:hyperlink w:anchor="_Toc242715772" w:history="1">
+          <w:hyperlink w:anchor="_Toc242740193" w:history="1">
             <w:r>
               <w:rPr>
                 <w:rStyle w:val="Hipervnculo"/>
                 <w:noProof/>
               </w:rPr>
-              <w:t>7. Bibliografía (APA 7)</w:t>
+              <w:t>6. Notebook y repositorio GitHub</w:t>
             </w:r>
             <w:r>
               <w:rPr>
@@ -1924,7 +2070,7 @@
                 <w:noProof/>
                 <w:webHidden/>
               </w:rPr>
-              <w:instrText xml:space="preserve"> PAGEREF _Toc242715772 \h </w:instrText>
+              <w:instrText xml:space="preserve"> PAGEREF _Toc242740193 \h </w:instrText>
             </w:r>
             <w:r>
               <w:rPr>
@@ -1945,6 +2091,80 @@
                 <w:webHidden/>
               </w:rPr>
               <w:t>7</w:t>
+            </w:r>
+            <w:r>
+              <w:rPr>
+                <w:noProof/>
+                <w:webHidden/>
+              </w:rPr>
+              <w:fldChar w:fldCharType="end"/>
+            </w:r>
+          </w:hyperlink>
+        </w:p>
+        <w:p>
+          <w:pPr>
+            <w:pStyle w:val="TDC1"/>
+            <w:tabs>
+              <w:tab w:val="right" w:leader="dot" w:pos="9062"/>
+            </w:tabs>
+            <w:rPr>
+              <w:rFonts w:asciiTheme="minorHAnsi" w:eastAsiaTheme="minorEastAsia" w:hAnsiTheme="minorHAnsi" w:cstheme="minorBidi"/>
+              <w:noProof/>
+              <w:color w:val="auto"/>
+              <w:kern w:val="2"/>
+              <w:sz w:val="24"/>
+              <w:szCs w:val="24"/>
+              <w14:ligatures w14:val="standardContextual"/>
+            </w:rPr>
+          </w:pPr>
+          <w:hyperlink w:anchor="_Toc242740194" w:history="1">
+            <w:r>
+              <w:rPr>
+                <w:rStyle w:val="Hipervnculo"/>
+                <w:noProof/>
+              </w:rPr>
+              <w:t>7. Bibliografía (APA 7)</w:t>
+            </w:r>
+            <w:r>
+              <w:rPr>
+                <w:noProof/>
+                <w:webHidden/>
+              </w:rPr>
+              <w:tab/>
+            </w:r>
+            <w:r>
+              <w:rPr>
+                <w:noProof/>
+                <w:webHidden/>
+              </w:rPr>
+              <w:fldChar w:fldCharType="begin"/>
+            </w:r>
+            <w:r>
+              <w:rPr>
+                <w:noProof/>
+                <w:webHidden/>
+              </w:rPr>
+              <w:instrText xml:space="preserve"> PAGEREF _Toc242740194 \h </w:instrText>
+            </w:r>
+            <w:r>
+              <w:rPr>
+                <w:noProof/>
+                <w:webHidden/>
+              </w:rPr>
+            </w:r>
+            <w:r>
+              <w:rPr>
+                <w:noProof/>
+                <w:webHidden/>
+              </w:rPr>
+              <w:fldChar w:fldCharType="separate"/>
+            </w:r>
+            <w:r>
+              <w:rPr>
+                <w:noProof/>
+                <w:webHidden/>
+              </w:rPr>
+              <w:t>8</w:t>
             </w:r>
             <w:r>
               <w:rPr>
@@ -1974,17 +2194,199 @@
     </w:p>
     <w:p>
       <w:pPr>
+        <w:jc w:val="both"/>
+      </w:pPr>
+    </w:p>
+    <w:p>
+      <w:pPr>
+        <w:jc w:val="both"/>
+      </w:pPr>
+    </w:p>
+    <w:p>
+      <w:pPr>
+        <w:jc w:val="both"/>
+      </w:pPr>
+    </w:p>
+    <w:p>
+      <w:pPr>
+        <w:jc w:val="both"/>
+      </w:pPr>
+    </w:p>
+    <w:p>
+      <w:pPr>
+        <w:jc w:val="both"/>
+      </w:pPr>
+    </w:p>
+    <w:p>
+      <w:pPr>
+        <w:jc w:val="both"/>
+      </w:pPr>
+    </w:p>
+    <w:p>
+      <w:pPr>
+        <w:jc w:val="both"/>
+      </w:pPr>
+    </w:p>
+    <w:p>
+      <w:pPr>
+        <w:jc w:val="both"/>
+      </w:pPr>
+    </w:p>
+    <w:p>
+      <w:pPr>
+        <w:jc w:val="both"/>
+      </w:pPr>
+    </w:p>
+    <w:p>
+      <w:pPr>
+        <w:jc w:val="both"/>
+      </w:pPr>
+    </w:p>
+    <w:p>
+      <w:pPr>
+        <w:jc w:val="both"/>
+      </w:pPr>
+    </w:p>
+    <w:p>
+      <w:pPr>
+        <w:jc w:val="both"/>
+      </w:pPr>
+    </w:p>
+    <w:p>
+      <w:pPr>
+        <w:jc w:val="both"/>
+      </w:pPr>
+    </w:p>
+    <w:p>
+      <w:pPr>
+        <w:jc w:val="both"/>
+      </w:pPr>
+    </w:p>
+    <w:p>
+      <w:pPr>
+        <w:jc w:val="both"/>
+      </w:pPr>
+    </w:p>
+    <w:p>
+      <w:pPr>
+        <w:jc w:val="both"/>
+      </w:pPr>
+    </w:p>
+    <w:p>
+      <w:pPr>
+        <w:jc w:val="both"/>
+      </w:pPr>
+    </w:p>
+    <w:p>
+      <w:pPr>
+        <w:jc w:val="both"/>
+      </w:pPr>
+    </w:p>
+    <w:p>
+      <w:pPr>
+        <w:jc w:val="both"/>
+      </w:pPr>
+    </w:p>
+    <w:p>
+      <w:pPr>
+        <w:jc w:val="both"/>
+      </w:pPr>
+    </w:p>
+    <w:p>
+      <w:pPr>
+        <w:jc w:val="both"/>
+      </w:pPr>
+    </w:p>
+    <w:p>
+      <w:pPr>
+        <w:jc w:val="both"/>
+      </w:pPr>
+    </w:p>
+    <w:p>
+      <w:pPr>
+        <w:jc w:val="both"/>
+      </w:pPr>
+    </w:p>
+    <w:p>
+      <w:pPr>
+        <w:jc w:val="both"/>
+      </w:pPr>
+    </w:p>
+    <w:p>
+      <w:pPr>
+        <w:jc w:val="both"/>
+      </w:pPr>
+    </w:p>
+    <w:p>
+      <w:pPr>
+        <w:jc w:val="both"/>
+      </w:pPr>
+    </w:p>
+    <w:p>
+      <w:pPr>
+        <w:jc w:val="both"/>
+      </w:pPr>
+    </w:p>
+    <w:p>
+      <w:pPr>
+        <w:jc w:val="both"/>
+      </w:pPr>
+    </w:p>
+    <w:p>
+      <w:pPr>
+        <w:jc w:val="both"/>
+      </w:pPr>
+    </w:p>
+    <w:p>
+      <w:pPr>
+        <w:jc w:val="both"/>
+      </w:pPr>
+    </w:p>
+    <w:p>
+      <w:pPr>
+        <w:jc w:val="both"/>
+      </w:pPr>
+    </w:p>
+    <w:p>
+      <w:pPr>
+        <w:jc w:val="both"/>
+      </w:pPr>
+    </w:p>
+    <w:p>
+      <w:pPr>
+        <w:jc w:val="both"/>
+      </w:pPr>
+    </w:p>
+    <w:p>
+      <w:pPr>
+        <w:jc w:val="both"/>
+      </w:pPr>
+    </w:p>
+    <w:p>
+      <w:pPr>
+        <w:jc w:val="both"/>
+      </w:pPr>
+    </w:p>
+    <w:p>
+      <w:pPr>
         <w:pStyle w:val="Ttulo1"/>
-      </w:pPr>
-      <w:bookmarkStart w:id="0" w:name="_Toc242557114"/>
-      <w:bookmarkStart w:id="1" w:name="_Toc242598244"/>
-      <w:bookmarkStart w:id="2" w:name="_Toc242715766"/>
-      <w:r>
+        <w:rPr>
+          <w:color w:val="4472C4" w:themeColor="accent1"/>
+        </w:rPr>
+      </w:pPr>
+      <w:bookmarkStart w:id="1" w:name="_Toc242557114"/>
+      <w:bookmarkStart w:id="2" w:name="_Toc242598244"/>
+      <w:bookmarkStart w:id="3" w:name="_Toc242740188"/>
+      <w:r>
+        <w:rPr>
+          <w:color w:val="4472C4" w:themeColor="accent1"/>
+        </w:rPr>
+        <w:lastRenderedPageBreak/>
         <w:t>1. Preparación y carga de datos</w:t>
       </w:r>
-      <w:bookmarkEnd w:id="0"/>
       <w:bookmarkEnd w:id="1"/>
       <w:bookmarkEnd w:id="2"/>
+      <w:bookmarkEnd w:id="3"/>
     </w:p>
     <w:p>
       <w:pPr>
@@ -1995,7 +2397,21 @@
         <w:rPr>
           <w:sz w:val="21"/>
         </w:rPr>
-        <w:t xml:space="preserve">El dataset </w:t>
+        <w:t xml:space="preserve">El </w:t>
+      </w:r>
+      <w:proofErr w:type="spellStart"/>
+      <w:r>
+        <w:rPr>
+          <w:sz w:val="21"/>
+        </w:rPr>
+        <w:t>dataset</w:t>
+      </w:r>
+      <w:proofErr w:type="spellEnd"/>
+      <w:r>
+        <w:rPr>
+          <w:sz w:val="21"/>
+        </w:rPr>
+        <w:t xml:space="preserve"> </w:t>
       </w:r>
       <w:r>
         <w:rPr>
@@ -2138,6 +2554,9 @@
       <w:pPr>
         <w:spacing w:after="80" w:line="264" w:lineRule="auto"/>
         <w:jc w:val="both"/>
+        <w:rPr>
+          <w:sz w:val="21"/>
+        </w:rPr>
       </w:pPr>
       <w:r>
         <w:rPr>
@@ -2258,16 +2677,102 @@
     </w:p>
     <w:p>
       <w:pPr>
-        <w:keepNext/>
-        <w:spacing w:after="40" w:line="264" w:lineRule="auto"/>
-        <w:jc w:val="both"/>
-      </w:pPr>
-      <w:r>
-        <w:rPr>
-          <w:b/>
-          <w:sz w:val="18"/>
-        </w:rPr>
-        <w:t>Tabla 1. Reporte inicial de calidad de los datos</w:t>
+        <w:spacing w:after="80" w:line="264" w:lineRule="auto"/>
+        <w:jc w:val="both"/>
+      </w:pPr>
+    </w:p>
+    <w:p>
+      <w:pPr>
+        <w:pStyle w:val="Descripcin"/>
+        <w:spacing w:after="0"/>
+        <w:rPr>
+          <w:b/>
+          <w:bCs/>
+          <w:i w:val="0"/>
+          <w:iCs w:val="0"/>
+          <w:color w:val="auto"/>
+        </w:rPr>
+      </w:pPr>
+      <w:r>
+        <w:rPr>
+          <w:b/>
+          <w:bCs/>
+          <w:i w:val="0"/>
+          <w:iCs w:val="0"/>
+          <w:color w:val="auto"/>
+        </w:rPr>
+        <w:t xml:space="preserve">     </w:t>
+      </w:r>
+      <w:r>
+        <w:rPr>
+          <w:b/>
+          <w:bCs/>
+          <w:i w:val="0"/>
+          <w:iCs w:val="0"/>
+          <w:color w:val="auto"/>
+        </w:rPr>
+        <w:t xml:space="preserve">Tabla </w:t>
+      </w:r>
+      <w:r>
+        <w:rPr>
+          <w:b/>
+          <w:bCs/>
+          <w:i w:val="0"/>
+          <w:iCs w:val="0"/>
+          <w:color w:val="auto"/>
+        </w:rPr>
+        <w:fldChar w:fldCharType="begin"/>
+      </w:r>
+      <w:r>
+        <w:rPr>
+          <w:b/>
+          <w:bCs/>
+          <w:i w:val="0"/>
+          <w:iCs w:val="0"/>
+          <w:color w:val="auto"/>
+        </w:rPr>
+        <w:instrText xml:space="preserve"> SEQ Tabla \* ARABIC </w:instrText>
+      </w:r>
+      <w:r>
+        <w:rPr>
+          <w:b/>
+          <w:bCs/>
+          <w:i w:val="0"/>
+          <w:iCs w:val="0"/>
+          <w:color w:val="auto"/>
+        </w:rPr>
+        <w:fldChar w:fldCharType="separate"/>
+      </w:r>
+      <w:r>
+        <w:rPr>
+          <w:b/>
+          <w:bCs/>
+          <w:i w:val="0"/>
+          <w:iCs w:val="0"/>
+          <w:noProof/>
+          <w:color w:val="auto"/>
+        </w:rPr>
+        <w:t>1</w:t>
+      </w:r>
+      <w:r>
+        <w:rPr>
+          <w:b/>
+          <w:bCs/>
+          <w:i w:val="0"/>
+          <w:iCs w:val="0"/>
+          <w:color w:val="auto"/>
+        </w:rPr>
+        <w:fldChar w:fldCharType="end"/>
+      </w:r>
+      <w:r>
+        <w:rPr>
+          <w:b/>
+          <w:bCs/>
+          <w:i w:val="0"/>
+          <w:iCs w:val="0"/>
+          <w:color w:val="auto"/>
+        </w:rPr>
+        <w:t>. Reporte inicial de calidad de los datos</w:t>
       </w:r>
     </w:p>
     <w:tbl>
@@ -2561,7 +3066,21 @@
               <w:rPr>
                 <w:sz w:val="17"/>
               </w:rPr>
-              <w:t>Sin valores negativos; tasas en [0 ; 0,2]</w:t>
+              <w:t>Sin valores negativos; tasas en [</w:t>
+            </w:r>
+            <w:proofErr w:type="gramStart"/>
+            <w:r>
+              <w:rPr>
+                <w:sz w:val="17"/>
+              </w:rPr>
+              <w:t>0 ;</w:t>
+            </w:r>
+            <w:proofErr w:type="gramEnd"/>
+            <w:r>
+              <w:rPr>
+                <w:sz w:val="17"/>
+              </w:rPr>
+              <w:t xml:space="preserve"> 0,2]</w:t>
             </w:r>
           </w:p>
         </w:tc>
@@ -2866,7 +3385,21 @@
         <w:rPr>
           <w:sz w:val="21"/>
         </w:rPr>
-        <w:t xml:space="preserve">Las 125 filas con valores idénticos (1,01 %) se conservaron, dado que la documentación original del dataset (Sakar &amp; </w:t>
+        <w:t xml:space="preserve">Las 125 filas con valores idénticos (1,01 %) se conservaron, dado que la documentación original del </w:t>
+      </w:r>
+      <w:proofErr w:type="spellStart"/>
+      <w:r>
+        <w:rPr>
+          <w:sz w:val="21"/>
+        </w:rPr>
+        <w:t>dataset</w:t>
+      </w:r>
+      <w:proofErr w:type="spellEnd"/>
+      <w:r>
+        <w:rPr>
+          <w:sz w:val="21"/>
+        </w:rPr>
+        <w:t xml:space="preserve"> (Sakar &amp; </w:t>
       </w:r>
       <w:proofErr w:type="spellStart"/>
       <w:r>
@@ -2912,16 +3445,22 @@
       <w:pPr>
         <w:pStyle w:val="Ttulo1"/>
         <w:jc w:val="both"/>
-      </w:pPr>
-      <w:bookmarkStart w:id="3" w:name="_Toc242557115"/>
-      <w:bookmarkStart w:id="4" w:name="_Toc242598245"/>
-      <w:bookmarkStart w:id="5" w:name="_Toc242715767"/>
-      <w:r>
+        <w:rPr>
+          <w:color w:val="4472C4" w:themeColor="accent1"/>
+        </w:rPr>
+      </w:pPr>
+      <w:bookmarkStart w:id="4" w:name="_Toc242557115"/>
+      <w:bookmarkStart w:id="5" w:name="_Toc242598245"/>
+      <w:bookmarkStart w:id="6" w:name="_Toc242740189"/>
+      <w:r>
+        <w:rPr>
+          <w:color w:val="4472C4" w:themeColor="accent1"/>
+        </w:rPr>
         <w:t>2. Análisis exploratorio de datos</w:t>
       </w:r>
-      <w:bookmarkEnd w:id="3"/>
       <w:bookmarkEnd w:id="4"/>
       <w:bookmarkEnd w:id="5"/>
+      <w:bookmarkEnd w:id="6"/>
     </w:p>
     <w:p>
       <w:pPr>
@@ -2993,7 +3532,6 @@
           <w:b/>
           <w:sz w:val="21"/>
         </w:rPr>
-        <w:lastRenderedPageBreak/>
         <w:t>Variables numéricas.</w:t>
       </w:r>
       <w:r>
@@ -3062,7 +3600,7 @@
     <w:p>
       <w:pPr>
         <w:keepNext/>
-        <w:spacing w:after="40" w:line="264" w:lineRule="auto"/>
+        <w:spacing w:line="264" w:lineRule="auto"/>
         <w:jc w:val="both"/>
       </w:pPr>
       <w:r>
@@ -3070,6 +3608,7 @@
           <w:b/>
           <w:sz w:val="18"/>
         </w:rPr>
+        <w:lastRenderedPageBreak/>
         <w:t>Tabla 2. Estadística descriptiva y forma de las variables numéricas (n = 12.330; mínimo = 0 en todas)</w:t>
       </w:r>
     </w:p>
@@ -3186,21 +3725,12 @@
               <w:keepNext/>
               <w:jc w:val="both"/>
             </w:pPr>
-            <w:proofErr w:type="spellStart"/>
             <w:r>
               <w:rPr>
                 <w:b/>
                 <w:sz w:val="16"/>
               </w:rPr>
-              <w:t>Desv</w:t>
-            </w:r>
-            <w:proofErr w:type="spellEnd"/>
-            <w:r>
-              <w:rPr>
-                <w:b/>
-                <w:sz w:val="16"/>
-              </w:rPr>
-              <w:t xml:space="preserve">. </w:t>
+              <w:t xml:space="preserve">Desv. </w:t>
             </w:r>
             <w:proofErr w:type="spellStart"/>
             <w:r>
@@ -5285,10 +5815,19 @@
       <w:pPr>
         <w:spacing w:after="160" w:line="264" w:lineRule="auto"/>
         <w:jc w:val="both"/>
-      </w:pPr>
-      <w:r>
-        <w:rPr>
-          <w:i/>
+        <w:rPr>
+          <w:b/>
+          <w:bCs/>
+          <w:iCs/>
+          <w:color w:val="auto"/>
+        </w:rPr>
+      </w:pPr>
+      <w:r>
+        <w:rPr>
+          <w:b/>
+          <w:bCs/>
+          <w:iCs/>
+          <w:color w:val="auto"/>
           <w:sz w:val="18"/>
         </w:rPr>
         <w:t>Figura 1. Variables numéricas según su tipo: barras para la discreta (a) e histogramas para las continuas (b–d). Línea discontinua: mediana. En (a), (b) y (d) el eje se recorta en el percentil 99 solo para visualizar.</w:t>
@@ -5508,10 +6047,17 @@
       <w:pPr>
         <w:spacing w:after="160" w:line="264" w:lineRule="auto"/>
         <w:jc w:val="both"/>
-      </w:pPr>
-      <w:r>
-        <w:rPr>
-          <w:i/>
+        <w:rPr>
+          <w:b/>
+          <w:bCs/>
+          <w:iCs/>
+        </w:rPr>
+      </w:pPr>
+      <w:r>
+        <w:rPr>
+          <w:b/>
+          <w:bCs/>
+          <w:iCs/>
           <w:color w:val="404040"/>
           <w:sz w:val="18"/>
         </w:rPr>
@@ -5596,10 +6142,17 @@
       <w:pPr>
         <w:spacing w:after="160" w:line="264" w:lineRule="auto"/>
         <w:jc w:val="both"/>
-      </w:pPr>
-      <w:r>
-        <w:rPr>
-          <w:i/>
+        <w:rPr>
+          <w:b/>
+          <w:bCs/>
+          <w:iCs/>
+        </w:rPr>
+      </w:pPr>
+      <w:r>
+        <w:rPr>
+          <w:b/>
+          <w:bCs/>
+          <w:iCs/>
           <w:color w:val="404040"/>
           <w:sz w:val="18"/>
         </w:rPr>
@@ -5608,7 +6161,9 @@
       <w:proofErr w:type="spellStart"/>
       <w:r>
         <w:rPr>
-          <w:i/>
+          <w:b/>
+          <w:bCs/>
+          <w:iCs/>
           <w:color w:val="404040"/>
           <w:sz w:val="18"/>
         </w:rPr>
@@ -5617,7 +6172,9 @@
       <w:proofErr w:type="spellEnd"/>
       <w:r>
         <w:rPr>
-          <w:i/>
+          <w:b/>
+          <w:bCs/>
+          <w:iCs/>
           <w:color w:val="404040"/>
           <w:sz w:val="18"/>
         </w:rPr>
@@ -5626,7 +6183,9 @@
       <w:proofErr w:type="spellStart"/>
       <w:r>
         <w:rPr>
-          <w:i/>
+          <w:b/>
+          <w:bCs/>
+          <w:iCs/>
           <w:color w:val="404040"/>
           <w:sz w:val="18"/>
         </w:rPr>
@@ -5635,7 +6194,9 @@
       <w:proofErr w:type="spellEnd"/>
       <w:r>
         <w:rPr>
-          <w:i/>
+          <w:b/>
+          <w:bCs/>
+          <w:iCs/>
           <w:color w:val="404040"/>
           <w:sz w:val="18"/>
         </w:rPr>
@@ -5646,16 +6207,22 @@
       <w:pPr>
         <w:pStyle w:val="Ttulo1"/>
         <w:jc w:val="both"/>
-      </w:pPr>
-      <w:bookmarkStart w:id="6" w:name="_Toc242557116"/>
-      <w:bookmarkStart w:id="7" w:name="_Toc242598246"/>
-      <w:bookmarkStart w:id="8" w:name="_Toc242715768"/>
-      <w:r>
+        <w:rPr>
+          <w:color w:val="4472C4" w:themeColor="accent1"/>
+        </w:rPr>
+      </w:pPr>
+      <w:bookmarkStart w:id="7" w:name="_Toc242557116"/>
+      <w:bookmarkStart w:id="8" w:name="_Toc242598246"/>
+      <w:bookmarkStart w:id="9" w:name="_Toc242740190"/>
+      <w:r>
+        <w:rPr>
+          <w:color w:val="4472C4" w:themeColor="accent1"/>
+        </w:rPr>
         <w:t>3. Estimación de parámetros</w:t>
       </w:r>
-      <w:bookmarkEnd w:id="6"/>
       <w:bookmarkEnd w:id="7"/>
       <w:bookmarkEnd w:id="8"/>
+      <w:bookmarkEnd w:id="9"/>
     </w:p>
     <w:p>
       <w:pPr>
@@ -5751,13 +6318,44 @@
         <w:rPr>
           <w:sz w:val="21"/>
         </w:rPr>
-        <w:t>: x̄ ± t(0,975; n−1)·s/√n.</w:t>
+        <w:t xml:space="preserve">: x̄ ± </w:t>
+      </w:r>
+      <w:proofErr w:type="gramStart"/>
+      <w:r>
+        <w:rPr>
+          <w:sz w:val="21"/>
+        </w:rPr>
+        <w:t>t(</w:t>
+      </w:r>
+      <w:proofErr w:type="gramEnd"/>
+      <w:r>
+        <w:rPr>
+          <w:sz w:val="21"/>
+        </w:rPr>
+        <w:t>0,975; n−</w:t>
+      </w:r>
+      <w:proofErr w:type="gramStart"/>
+      <w:r>
+        <w:rPr>
+          <w:sz w:val="21"/>
+        </w:rPr>
+        <w:t>1)·</w:t>
+      </w:r>
+      <w:proofErr w:type="gramEnd"/>
+      <w:r>
+        <w:rPr>
+          <w:sz w:val="21"/>
+        </w:rPr>
+        <w:t>s/√n.</w:t>
       </w:r>
     </w:p>
     <w:p>
       <w:pPr>
         <w:spacing w:after="80" w:line="264" w:lineRule="auto"/>
         <w:jc w:val="both"/>
+        <w:rPr>
+          <w:sz w:val="21"/>
+        </w:rPr>
       </w:pPr>
       <w:r>
         <w:rPr>
@@ -5812,13 +6410,27 @@
         <w:rPr>
           <w:sz w:val="21"/>
         </w:rPr>
-        <w:t xml:space="preserve"> (5.000 remuestreos, semilla 42; Efron &amp; </w:t>
+        <w:t xml:space="preserve"> (5.000 </w:t>
       </w:r>
       <w:proofErr w:type="spellStart"/>
       <w:r>
         <w:rPr>
           <w:sz w:val="21"/>
         </w:rPr>
+        <w:t>remuestreos</w:t>
+      </w:r>
+      <w:proofErr w:type="spellEnd"/>
+      <w:r>
+        <w:rPr>
+          <w:sz w:val="21"/>
+        </w:rPr>
+        <w:t xml:space="preserve">, semilla 42; Efron &amp; </w:t>
+      </w:r>
+      <w:proofErr w:type="spellStart"/>
+      <w:r>
+        <w:rPr>
+          <w:sz w:val="21"/>
+        </w:rPr>
         <w:t>Tibshirani</w:t>
       </w:r>
       <w:proofErr w:type="spellEnd"/>
@@ -5831,10 +6443,23 @@
     </w:p>
     <w:p>
       <w:pPr>
+        <w:spacing w:after="80" w:line="264" w:lineRule="auto"/>
+        <w:jc w:val="both"/>
+      </w:pPr>
+    </w:p>
+    <w:p>
+      <w:pPr>
         <w:keepNext/>
-        <w:spacing w:after="40" w:line="264" w:lineRule="auto"/>
-        <w:jc w:val="both"/>
-      </w:pPr>
+        <w:spacing w:line="264" w:lineRule="auto"/>
+        <w:jc w:val="both"/>
+      </w:pPr>
+      <w:r>
+        <w:rPr>
+          <w:b/>
+          <w:sz w:val="18"/>
+        </w:rPr>
+        <w:t xml:space="preserve">   </w:t>
+      </w:r>
       <w:r>
         <w:rPr>
           <w:b/>
@@ -6098,7 +6723,21 @@
               <w:rPr>
                 <w:sz w:val="17"/>
               </w:rPr>
-              <w:t>[1.160,96 ; 1.228,53]</w:t>
+              <w:t>[1.160,</w:t>
+            </w:r>
+            <w:proofErr w:type="gramStart"/>
+            <w:r>
+              <w:rPr>
+                <w:sz w:val="17"/>
+              </w:rPr>
+              <w:t>96 ;</w:t>
+            </w:r>
+            <w:proofErr w:type="gramEnd"/>
+            <w:r>
+              <w:rPr>
+                <w:sz w:val="17"/>
+              </w:rPr>
+              <w:t xml:space="preserve"> 1.228,53]</w:t>
             </w:r>
           </w:p>
         </w:tc>
@@ -6121,7 +6760,21 @@
               <w:rPr>
                 <w:sz w:val="17"/>
               </w:rPr>
-              <w:t>[1.161,09 ; 1.229,04]</w:t>
+              <w:t>[1.161,</w:t>
+            </w:r>
+            <w:proofErr w:type="gramStart"/>
+            <w:r>
+              <w:rPr>
+                <w:sz w:val="17"/>
+              </w:rPr>
+              <w:t>09 ;</w:t>
+            </w:r>
+            <w:proofErr w:type="gramEnd"/>
+            <w:r>
+              <w:rPr>
+                <w:sz w:val="17"/>
+              </w:rPr>
+              <w:t xml:space="preserve"> 1.229,04]</w:t>
             </w:r>
           </w:p>
         </w:tc>
@@ -6221,7 +6874,21 @@
               <w:rPr>
                 <w:sz w:val="17"/>
               </w:rPr>
-              <w:t>[5,561 ; 6,217]</w:t>
+              <w:t>[</w:t>
+            </w:r>
+            <w:proofErr w:type="gramStart"/>
+            <w:r>
+              <w:rPr>
+                <w:sz w:val="17"/>
+              </w:rPr>
+              <w:t>5,561 ;</w:t>
+            </w:r>
+            <w:proofErr w:type="gramEnd"/>
+            <w:r>
+              <w:rPr>
+                <w:sz w:val="17"/>
+              </w:rPr>
+              <w:t xml:space="preserve"> 6,217]</w:t>
             </w:r>
           </w:p>
         </w:tc>
@@ -6244,7 +6911,21 @@
               <w:rPr>
                 <w:sz w:val="17"/>
               </w:rPr>
-              <w:t>[5,572 ; 6,223]</w:t>
+              <w:t>[</w:t>
+            </w:r>
+            <w:proofErr w:type="gramStart"/>
+            <w:r>
+              <w:rPr>
+                <w:sz w:val="17"/>
+              </w:rPr>
+              <w:t>5,572 ;</w:t>
+            </w:r>
+            <w:proofErr w:type="gramEnd"/>
+            <w:r>
+              <w:rPr>
+                <w:sz w:val="17"/>
+              </w:rPr>
+              <w:t xml:space="preserve"> 6,223]</w:t>
             </w:r>
           </w:p>
         </w:tc>
@@ -6340,7 +7021,21 @@
               <w:rPr>
                 <w:sz w:val="17"/>
               </w:rPr>
-              <w:t>[0,0422 ; 0,0439]</w:t>
+              <w:t>[0,</w:t>
+            </w:r>
+            <w:proofErr w:type="gramStart"/>
+            <w:r>
+              <w:rPr>
+                <w:sz w:val="17"/>
+              </w:rPr>
+              <w:t>0422 ;</w:t>
+            </w:r>
+            <w:proofErr w:type="gramEnd"/>
+            <w:r>
+              <w:rPr>
+                <w:sz w:val="17"/>
+              </w:rPr>
+              <w:t xml:space="preserve"> 0,0439]</w:t>
             </w:r>
           </w:p>
         </w:tc>
@@ -6362,7 +7057,21 @@
               <w:rPr>
                 <w:sz w:val="17"/>
               </w:rPr>
-              <w:t>[0,0422 ; 0,0440]</w:t>
+              <w:t>[0,</w:t>
+            </w:r>
+            <w:proofErr w:type="gramStart"/>
+            <w:r>
+              <w:rPr>
+                <w:sz w:val="17"/>
+              </w:rPr>
+              <w:t>0422 ;</w:t>
+            </w:r>
+            <w:proofErr w:type="gramEnd"/>
+            <w:r>
+              <w:rPr>
+                <w:sz w:val="17"/>
+              </w:rPr>
+              <w:t xml:space="preserve"> 0,0440]</w:t>
             </w:r>
           </w:p>
         </w:tc>
@@ -6407,7 +7116,7 @@
         <w:rPr>
           <w:sz w:val="21"/>
         </w:rPr>
-        <w:t xml:space="preserve"> con 95 % de confianza, el tiempo medio en páginas de producto está entre 1.161 y 1.229 segundos (≈ 19,3 a 20,5 minutos por sesión).</w:t>
+        <w:t xml:space="preserve"> con 95% de confianza, el tiempo medio en páginas de producto está entre 1.161 y 1.229 segundos (≈ 19,3 a 20,5 minutos por sesión).</w:t>
       </w:r>
     </w:p>
     <w:p>
@@ -6442,7 +7151,7 @@
         <w:rPr>
           <w:sz w:val="21"/>
         </w:rPr>
-        <w:t xml:space="preserve"> el valor medio de página está entre 5,56 y 6,22. Sin embargo, la mediana es 0 y el 77,9 % de las sesiones tiene valor cero: la media está impulsada por una minoría de sesiones de alto valor.</w:t>
+        <w:t xml:space="preserve"> el valor medio de página está entre 5,56 y 6,22. Sin embargo, la mediana es 0 y el 77,9% de las sesiones tiene valor cero: la media está impulsada por una minoría de sesiones de alto valor.</w:t>
       </w:r>
     </w:p>
     <w:p>
@@ -6477,7 +7186,7 @@
         <w:rPr>
           <w:sz w:val="21"/>
         </w:rPr>
-        <w:t xml:space="preserve"> la tasa de salida media está entre 4,22 % y 4,39 %. El intervalo es estrecho principalmente por el gran tamaño muestral, que reduce el error estándar; esta precisión no implica baja variabilidad relativa.</w:t>
+        <w:t xml:space="preserve"> la tasa de salida media está entre 4,22% y 4,39%. El intervalo es estrecho principalmente por el gran tamaño muestral, que reduce el error estándar; esta precisión no implica baja variabilidad relativa.</w:t>
       </w:r>
     </w:p>
     <w:p>
@@ -6490,13 +7199,13 @@
           <w:b/>
           <w:sz w:val="21"/>
         </w:rPr>
-        <w:t>Interpretación del 95 %.</w:t>
-      </w:r>
-      <w:r>
-        <w:rPr>
-          <w:sz w:val="21"/>
-        </w:rPr>
-        <w:t xml:space="preserve"> El nivel de confianza describe el procedimiento, no un intervalo en particular: si se repitiera la obtención de la muestra muchas veces y en cada una se construyera el intervalo de la misma forma, cerca del 95 % de esos intervalos contendría la media poblacional. Un intervalo ya calculado contiene o no contiene el valor verdadero; por eso se habla de confianza en el método y no de una probabilidad del 95 % para este intervalo.</w:t>
+        <w:t>Interpretación del 95%.</w:t>
+      </w:r>
+      <w:r>
+        <w:rPr>
+          <w:sz w:val="21"/>
+        </w:rPr>
+        <w:t xml:space="preserve"> El nivel de confianza describe el procedimiento, no un intervalo en particular: si se repitiera la obtención de la muestra muchas veces y en cada una se construyera el intervalo de la misma forma, cerca del 95% de esos intervalos contendría la media poblacional. Un intervalo ya calculado contiene o no contiene el valor verdadero; por eso se habla de confianza en el método y no de una probabilidad del 95% para este intervalo.</w:t>
       </w:r>
     </w:p>
     <w:p>
@@ -6521,7 +7230,21 @@
         <w:rPr>
           <w:sz w:val="21"/>
         </w:rPr>
-        <w:t xml:space="preserve"> se estimó en p̂ = 15,47 %, con IC 95 % (aproximación normal) de [14,84 % ; 16,11 %]; las condiciones </w:t>
+        <w:t xml:space="preserve"> se estimó en p̂ = 15,47%, con IC 95% (aproximación normal) de [14,84</w:t>
+      </w:r>
+      <w:proofErr w:type="gramStart"/>
+      <w:r>
+        <w:rPr>
+          <w:sz w:val="21"/>
+        </w:rPr>
+        <w:t>% ;</w:t>
+      </w:r>
+      <w:proofErr w:type="gramEnd"/>
+      <w:r>
+        <w:rPr>
+          <w:sz w:val="21"/>
+        </w:rPr>
+        <w:t xml:space="preserve"> 16,11%]; las condiciones </w:t>
       </w:r>
       <w:proofErr w:type="spellStart"/>
       <w:r>
@@ -6580,35 +7303,47 @@
         <w:rPr>
           <w:sz w:val="21"/>
         </w:rPr>
-        <w:t>(2) La documentación original indica que cada sesión corresponde a un usuario diferente, lo que respalda la conservación de las 125 filas con atributos idénticos. Sin embargo, esto no garantiza por sí solo la independencia estadística entre las observaciones;</w:t>
-      </w:r>
-      <w:r>
-        <w:rPr>
-          <w:sz w:val="21"/>
-        </w:rPr>
-        <w:t xml:space="preserve"> </w:t>
-      </w:r>
-      <w:r>
-        <w:rPr>
-          <w:sz w:val="21"/>
-        </w:rPr>
-        <w:t xml:space="preserve"> (3) la estrechez de los intervalos refleja el gran n y no implica relevancia práctica.</w:t>
+        <w:t xml:space="preserve">(2) La documentación original indica que cada sesión corresponde a un usuario diferente, lo que respalda la conservación de las 125 filas con atributos idénticos. Sin embargo, esto no garantiza por sí solo la independencia estadística entre las </w:t>
+      </w:r>
+      <w:r>
+        <w:rPr>
+          <w:sz w:val="21"/>
+        </w:rPr>
+        <w:t>observaciones;</w:t>
+      </w:r>
+      <w:r>
+        <w:rPr>
+          <w:sz w:val="21"/>
+        </w:rPr>
+        <w:t xml:space="preserve"> (</w:t>
+      </w:r>
+      <w:r>
+        <w:rPr>
+          <w:sz w:val="21"/>
+        </w:rPr>
+        <w:t>3) la estrechez de los intervalos refleja el gran n y no implica relevancia práctica.</w:t>
       </w:r>
     </w:p>
     <w:p>
       <w:pPr>
         <w:pStyle w:val="Ttulo1"/>
         <w:jc w:val="both"/>
-      </w:pPr>
-      <w:bookmarkStart w:id="9" w:name="_Toc242557117"/>
-      <w:bookmarkStart w:id="10" w:name="_Toc242598247"/>
-      <w:bookmarkStart w:id="11" w:name="_Toc242715769"/>
-      <w:r>
+        <w:rPr>
+          <w:color w:val="4472C4" w:themeColor="accent1"/>
+        </w:rPr>
+      </w:pPr>
+      <w:bookmarkStart w:id="10" w:name="_Toc242557117"/>
+      <w:bookmarkStart w:id="11" w:name="_Toc242598247"/>
+      <w:bookmarkStart w:id="12" w:name="_Toc242740191"/>
+      <w:r>
+        <w:rPr>
+          <w:color w:val="4472C4" w:themeColor="accent1"/>
+        </w:rPr>
         <w:t>4. Pruebas de hipótesis</w:t>
       </w:r>
-      <w:bookmarkEnd w:id="9"/>
       <w:bookmarkEnd w:id="10"/>
       <w:bookmarkEnd w:id="11"/>
+      <w:bookmarkEnd w:id="12"/>
     </w:p>
     <w:p>
       <w:pPr>
@@ -7071,7 +7806,7 @@
     <w:p>
       <w:pPr>
         <w:keepNext/>
-        <w:spacing w:after="40" w:line="264" w:lineRule="auto"/>
+        <w:spacing w:line="264" w:lineRule="auto"/>
         <w:jc w:val="both"/>
       </w:pPr>
       <w:r>
@@ -7080,6 +7815,13 @@
           <w:sz w:val="18"/>
         </w:rPr>
         <w:lastRenderedPageBreak/>
+        <w:t xml:space="preserve">   </w:t>
+      </w:r>
+      <w:r>
+        <w:rPr>
+          <w:b/>
+          <w:sz w:val="18"/>
+        </w:rPr>
         <w:t>Tabla 4. Resumen de las pruebas de hipótesis (α = 0,05)</w:t>
       </w:r>
     </w:p>
@@ -7545,16 +8287,22 @@
       <w:pPr>
         <w:pStyle w:val="Ttulo1"/>
         <w:jc w:val="both"/>
-      </w:pPr>
-      <w:bookmarkStart w:id="12" w:name="_Toc242557118"/>
-      <w:bookmarkStart w:id="13" w:name="_Toc242598248"/>
-      <w:bookmarkStart w:id="14" w:name="_Toc242715770"/>
-      <w:r>
+        <w:rPr>
+          <w:color w:val="4472C4" w:themeColor="accent1"/>
+        </w:rPr>
+      </w:pPr>
+      <w:bookmarkStart w:id="13" w:name="_Toc242557118"/>
+      <w:bookmarkStart w:id="14" w:name="_Toc242598248"/>
+      <w:bookmarkStart w:id="15" w:name="_Toc242740192"/>
+      <w:r>
+        <w:rPr>
+          <w:color w:val="4472C4" w:themeColor="accent1"/>
+        </w:rPr>
         <w:t>5. Informe de avance del proyecto</w:t>
       </w:r>
-      <w:bookmarkEnd w:id="12"/>
       <w:bookmarkEnd w:id="13"/>
       <w:bookmarkEnd w:id="14"/>
+      <w:bookmarkEnd w:id="15"/>
     </w:p>
     <w:p>
       <w:pPr>
@@ -7806,16 +8554,22 @@
       <w:pPr>
         <w:pStyle w:val="Ttulo1"/>
         <w:jc w:val="both"/>
-      </w:pPr>
-      <w:bookmarkStart w:id="15" w:name="_Toc242557119"/>
-      <w:bookmarkStart w:id="16" w:name="_Toc242598249"/>
-      <w:bookmarkStart w:id="17" w:name="_Toc242715771"/>
-      <w:r>
+        <w:rPr>
+          <w:color w:val="4472C4" w:themeColor="accent1"/>
+        </w:rPr>
+      </w:pPr>
+      <w:bookmarkStart w:id="16" w:name="_Toc242557119"/>
+      <w:bookmarkStart w:id="17" w:name="_Toc242598249"/>
+      <w:bookmarkStart w:id="18" w:name="_Toc242740193"/>
+      <w:r>
+        <w:rPr>
+          <w:color w:val="4472C4" w:themeColor="accent1"/>
+        </w:rPr>
         <w:t>6. Notebook y repositorio GitHub</w:t>
       </w:r>
-      <w:bookmarkEnd w:id="15"/>
       <w:bookmarkEnd w:id="16"/>
       <w:bookmarkEnd w:id="17"/>
+      <w:bookmarkEnd w:id="18"/>
     </w:p>
     <w:p>
       <w:pPr>
@@ -7947,8 +8701,17 @@
         <w:rPr>
           <w:sz w:val="21"/>
         </w:rPr>
-        <w:t>Repositorio: https://github.com/vedurancisterna-alt/Estadistica_Computacional</w:t>
-      </w:r>
+        <w:t xml:space="preserve">Repositorio: </w:t>
+      </w:r>
+      <w:hyperlink r:id="rId23" w:history="1">
+        <w:r>
+          <w:rPr>
+            <w:rStyle w:val="Hipervnculo"/>
+            <w:sz w:val="21"/>
+          </w:rPr>
+          <w:t>https://github.com/vedurancisterna-alt/Estadistica_Computacional</w:t>
+        </w:r>
+      </w:hyperlink>
     </w:p>
     <w:p>
       <w:pPr>
@@ -7994,17 +8757,23 @@
       <w:pPr>
         <w:pStyle w:val="Ttulo1"/>
         <w:jc w:val="both"/>
-      </w:pPr>
-      <w:bookmarkStart w:id="18" w:name="_Toc242557120"/>
-      <w:bookmarkStart w:id="19" w:name="_Toc242598250"/>
-      <w:bookmarkStart w:id="20" w:name="_Toc242715772"/>
-      <w:r>
+        <w:rPr>
+          <w:color w:val="4472C4" w:themeColor="accent1"/>
+        </w:rPr>
+      </w:pPr>
+      <w:bookmarkStart w:id="19" w:name="_Toc242557120"/>
+      <w:bookmarkStart w:id="20" w:name="_Toc242598250"/>
+      <w:bookmarkStart w:id="21" w:name="_Toc242740194"/>
+      <w:r>
+        <w:rPr>
+          <w:color w:val="4472C4" w:themeColor="accent1"/>
+        </w:rPr>
         <w:lastRenderedPageBreak/>
         <w:t>7. Bibliografía (APA 7)</w:t>
       </w:r>
-      <w:bookmarkEnd w:id="18"/>
       <w:bookmarkEnd w:id="19"/>
       <w:bookmarkEnd w:id="20"/>
+      <w:bookmarkEnd w:id="21"/>
     </w:p>
     <w:p>
       <w:pPr>
@@ -8083,7 +8852,7 @@
         </w:rPr>
         <w:t xml:space="preserve">(1), 50–60. </w:t>
       </w:r>
-      <w:hyperlink r:id="rId23" w:history="1">
+      <w:hyperlink r:id="rId24" w:history="1">
         <w:r>
           <w:rPr>
             <w:rStyle w:val="Hipervnculo"/>
@@ -8174,7 +8943,7 @@
         </w:rPr>
         <w:t xml:space="preserve"> [Data set]. UCI Machine Learning Repository. </w:t>
       </w:r>
-      <w:hyperlink r:id="rId24" w:history="1">
+      <w:hyperlink r:id="rId25" w:history="1">
         <w:r>
           <w:rPr>
             <w:rStyle w:val="Hipervnculo"/>
@@ -8249,7 +9018,7 @@
         </w:rPr>
         <w:t xml:space="preserve">(10), 6893–6908. </w:t>
       </w:r>
-      <w:hyperlink r:id="rId25" w:history="1">
+      <w:hyperlink r:id="rId26" w:history="1">
         <w:r>
           <w:rPr>
             <w:rStyle w:val="Hipervnculo"/>
@@ -8273,7 +9042,7 @@
         </w:rPr>
         <w:t xml:space="preserve">Virtanen, P., Gommers, R., Oliphant, T. E., Haberland, M., Reddy, T., Cournapeau, D., Burovski, E., Peterson, P., Weckesser, W., Bright, J., van der Walt, S. J., Brett, M., Wilson, J., Millman, K. J., Mayorov, N., Nelson, A. R. J., Jones, E., Kern, R., Larson, E., … van Mulbregt, P. (2020). SciPy 1.0: Fundamental algorithms for scientific computing in Python. Nature Methods, 17(3), 261–272. </w:t>
       </w:r>
-      <w:hyperlink r:id="rId26" w:history="1">
+      <w:hyperlink r:id="rId27" w:history="1">
         <w:r>
           <w:rPr>
             <w:rStyle w:val="Hipervnculo"/>
@@ -8284,7 +9053,7 @@
       </w:hyperlink>
     </w:p>
     <w:sectPr>
-      <w:footerReference w:type="default" r:id="rId27"/>
+      <w:footerReference w:type="default" r:id="rId28"/>
       <w:pgSz w:w="11906" w:h="16838"/>
       <w:pgMar w:top="1417" w:right="1417" w:bottom="1417" w:left="1417" w:header="708" w:footer="708" w:gutter="0"/>
       <w:cols w:space="720"/>
@@ -9037,6 +9806,7 @@
   <w:style w:type="character" w:default="1" w:styleId="Fuentedeprrafopredeter">
     <w:name w:val="Default Paragraph Font"/>
     <w:uiPriority w:val="1"/>
+    <w:semiHidden/>
     <w:unhideWhenUsed/>
   </w:style>
   <w:style w:type="table" w:default="1" w:styleId="Tablanormal">
@@ -9253,6 +10023,25 @@
       <w:rFonts w:ascii="Times New Roman" w:hAnsi="Times New Roman" w:cs="Times New Roman"/>
       <w:sz w:val="24"/>
       <w:szCs w:val="24"/>
+    </w:rPr>
+  </w:style>
+  <w:style w:type="paragraph" w:styleId="Descripcin">
+    <w:name w:val="caption"/>
+    <w:basedOn w:val="Normal"/>
+    <w:next w:val="Normal"/>
+    <w:uiPriority w:val="35"/>
+    <w:unhideWhenUsed/>
+    <w:qFormat/>
+    <w:rsid w:val="00467A85"/>
+    <w:pPr>
+      <w:spacing w:after="200"/>
+    </w:pPr>
+    <w:rPr>
+      <w:i/>
+      <w:iCs/>
+      <w:color w:val="44546A" w:themeColor="text2"/>
+      <w:sz w:val="18"/>
+      <w:szCs w:val="18"/>
     </w:rPr>
   </w:style>
 </w:styles>

</xml_diff>

<commit_message>
Agrega informe S3, actualiza README y requirements, ordena informes
</commit_message>
<xml_diff>
--- a/docs/informe_sumativa1_grupo2.docx
+++ b/docs/informe_sumativa1_grupo2.docx
@@ -1203,12 +1203,11 @@
           <w:b/>
         </w:rPr>
       </w:pPr>
-      <w:proofErr w:type="spellStart"/>
       <w:r>
         <w:rPr>
           <w:b/>
           <w:bCs/>
-          <w:lang w:val="en-US"/>
+          <w:lang w:val="es-CL"/>
         </w:rPr>
         <w:t>I</w:t>
       </w:r>
@@ -1216,7 +1215,7 @@
         <w:rPr>
           <w:b/>
           <w:bCs/>
-          <w:lang w:val="en-US"/>
+          <w:lang w:val="es-CL"/>
         </w:rPr>
         <w:t>ntegrante</w:t>
       </w:r>
@@ -1224,16 +1223,15 @@
         <w:rPr>
           <w:b/>
           <w:bCs/>
-          <w:lang w:val="en-US"/>
+          <w:lang w:val="es-CL"/>
         </w:rPr>
         <w:t>s</w:t>
       </w:r>
-      <w:proofErr w:type="spellEnd"/>
       <w:r>
         <w:rPr>
           <w:b/>
           <w:bCs/>
-          <w:lang w:val="en-US"/>
+          <w:lang w:val="es-CL"/>
         </w:rPr>
         <w:t>:</w:t>
       </w:r>
@@ -1470,7 +1468,15 @@
           <w:color w:val="231F20"/>
           <w:spacing w:val="-2"/>
         </w:rPr>
-        <w:t>12</w:t>
+        <w:t>1</w:t>
+      </w:r>
+      <w:r>
+        <w:rPr>
+          <w:bCs/>
+          <w:color w:val="231F20"/>
+          <w:spacing w:val="-2"/>
+        </w:rPr>
+        <w:t>4</w:t>
       </w:r>
       <w:r>
         <w:rPr>
@@ -2397,21 +2403,7 @@
         <w:rPr>
           <w:sz w:val="21"/>
         </w:rPr>
-        <w:t xml:space="preserve">El </w:t>
-      </w:r>
-      <w:proofErr w:type="spellStart"/>
-      <w:r>
-        <w:rPr>
-          <w:sz w:val="21"/>
-        </w:rPr>
-        <w:t>dataset</w:t>
-      </w:r>
-      <w:proofErr w:type="spellEnd"/>
-      <w:r>
-        <w:rPr>
-          <w:sz w:val="21"/>
-        </w:rPr>
-        <w:t xml:space="preserve"> </w:t>
+        <w:t xml:space="preserve">El dataset </w:t>
       </w:r>
       <w:r>
         <w:rPr>
@@ -2496,10 +2488,16 @@
       </w:r>
       <w:r>
         <w:rPr>
+          <w:sz w:val="21"/>
+        </w:rPr>
+        <w:t>S1</w:t>
+      </w:r>
+      <w:r>
+        <w:rPr>
           <w:rFonts w:ascii="Consolas" w:hAnsi="Consolas"/>
           <w:sz w:val="19"/>
         </w:rPr>
-        <w:t>F2/</w:t>
+        <w:t>/</w:t>
       </w:r>
       <w:r>
         <w:rPr>
@@ -3066,21 +3064,7 @@
               <w:rPr>
                 <w:sz w:val="17"/>
               </w:rPr>
-              <w:t>Sin valores negativos; tasas en [</w:t>
-            </w:r>
-            <w:proofErr w:type="gramStart"/>
-            <w:r>
-              <w:rPr>
-                <w:sz w:val="17"/>
-              </w:rPr>
-              <w:t>0 ;</w:t>
-            </w:r>
-            <w:proofErr w:type="gramEnd"/>
-            <w:r>
-              <w:rPr>
-                <w:sz w:val="17"/>
-              </w:rPr>
-              <w:t xml:space="preserve"> 0,2]</w:t>
+              <w:t>Sin valores negativos; tasas en [0 ; 0,2]</w:t>
             </w:r>
           </w:p>
         </w:tc>
@@ -3385,21 +3369,7 @@
         <w:rPr>
           <w:sz w:val="21"/>
         </w:rPr>
-        <w:t xml:space="preserve">Las 125 filas con valores idénticos (1,01 %) se conservaron, dado que la documentación original del </w:t>
-      </w:r>
-      <w:proofErr w:type="spellStart"/>
-      <w:r>
-        <w:rPr>
-          <w:sz w:val="21"/>
-        </w:rPr>
-        <w:t>dataset</w:t>
-      </w:r>
-      <w:proofErr w:type="spellEnd"/>
-      <w:r>
-        <w:rPr>
-          <w:sz w:val="21"/>
-        </w:rPr>
-        <w:t xml:space="preserve"> (Sakar &amp; </w:t>
+        <w:t xml:space="preserve">Las 125 filas con valores idénticos (1,01 %) se conservaron, dado que la documentación original del dataset (Sakar &amp; </w:t>
       </w:r>
       <w:proofErr w:type="spellStart"/>
       <w:r>
@@ -6318,35 +6288,7 @@
         <w:rPr>
           <w:sz w:val="21"/>
         </w:rPr>
-        <w:t xml:space="preserve">: x̄ ± </w:t>
-      </w:r>
-      <w:proofErr w:type="gramStart"/>
-      <w:r>
-        <w:rPr>
-          <w:sz w:val="21"/>
-        </w:rPr>
-        <w:t>t(</w:t>
-      </w:r>
-      <w:proofErr w:type="gramEnd"/>
-      <w:r>
-        <w:rPr>
-          <w:sz w:val="21"/>
-        </w:rPr>
-        <w:t>0,975; n−</w:t>
-      </w:r>
-      <w:proofErr w:type="gramStart"/>
-      <w:r>
-        <w:rPr>
-          <w:sz w:val="21"/>
-        </w:rPr>
-        <w:t>1)·</w:t>
-      </w:r>
-      <w:proofErr w:type="gramEnd"/>
-      <w:r>
-        <w:rPr>
-          <w:sz w:val="21"/>
-        </w:rPr>
-        <w:t>s/√n.</w:t>
+        <w:t>: x̄ ± t(0,975; n−1)·s/√n.</w:t>
       </w:r>
     </w:p>
     <w:p>
@@ -6723,58 +6665,30 @@
               <w:rPr>
                 <w:sz w:val="17"/>
               </w:rPr>
-              <w:t>[1.160,</w:t>
-            </w:r>
-            <w:proofErr w:type="gramStart"/>
+              <w:t>[1.160,96 ; 1.228,53]</w:t>
+            </w:r>
+          </w:p>
+        </w:tc>
+        <w:tc>
+          <w:tcPr>
+            <w:tcW w:w="2154" w:type="dxa"/>
+            <w:tcBorders>
+              <w:top w:val="single" w:sz="4" w:space="0" w:color="000000"/>
+              <w:left w:val="nil"/>
+              <w:bottom w:val="nil"/>
+              <w:right w:val="nil"/>
+            </w:tcBorders>
+          </w:tcPr>
+          <w:p>
+            <w:pPr>
+              <w:keepNext/>
+              <w:jc w:val="both"/>
+            </w:pPr>
             <w:r>
               <w:rPr>
                 <w:sz w:val="17"/>
               </w:rPr>
-              <w:t>96 ;</w:t>
-            </w:r>
-            <w:proofErr w:type="gramEnd"/>
-            <w:r>
-              <w:rPr>
-                <w:sz w:val="17"/>
-              </w:rPr>
-              <w:t xml:space="preserve"> 1.228,53]</w:t>
-            </w:r>
-          </w:p>
-        </w:tc>
-        <w:tc>
-          <w:tcPr>
-            <w:tcW w:w="2154" w:type="dxa"/>
-            <w:tcBorders>
-              <w:top w:val="single" w:sz="4" w:space="0" w:color="000000"/>
-              <w:left w:val="nil"/>
-              <w:bottom w:val="nil"/>
-              <w:right w:val="nil"/>
-            </w:tcBorders>
-          </w:tcPr>
-          <w:p>
-            <w:pPr>
-              <w:keepNext/>
-              <w:jc w:val="both"/>
-            </w:pPr>
-            <w:r>
-              <w:rPr>
-                <w:sz w:val="17"/>
-              </w:rPr>
-              <w:t>[1.161,</w:t>
-            </w:r>
-            <w:proofErr w:type="gramStart"/>
-            <w:r>
-              <w:rPr>
-                <w:sz w:val="17"/>
-              </w:rPr>
-              <w:t>09 ;</w:t>
-            </w:r>
-            <w:proofErr w:type="gramEnd"/>
-            <w:r>
-              <w:rPr>
-                <w:sz w:val="17"/>
-              </w:rPr>
-              <w:t xml:space="preserve"> 1.229,04]</w:t>
+              <w:t>[1.161,09 ; 1.229,04]</w:t>
             </w:r>
           </w:p>
         </w:tc>
@@ -6874,58 +6788,30 @@
               <w:rPr>
                 <w:sz w:val="17"/>
               </w:rPr>
-              <w:t>[</w:t>
-            </w:r>
-            <w:proofErr w:type="gramStart"/>
+              <w:t>[5,561 ; 6,217]</w:t>
+            </w:r>
+          </w:p>
+        </w:tc>
+        <w:tc>
+          <w:tcPr>
+            <w:tcW w:w="2154" w:type="dxa"/>
+            <w:tcBorders>
+              <w:top w:val="nil"/>
+              <w:left w:val="nil"/>
+              <w:bottom w:val="nil"/>
+              <w:right w:val="nil"/>
+            </w:tcBorders>
+          </w:tcPr>
+          <w:p>
+            <w:pPr>
+              <w:keepNext/>
+              <w:jc w:val="both"/>
+            </w:pPr>
             <w:r>
               <w:rPr>
                 <w:sz w:val="17"/>
               </w:rPr>
-              <w:t>5,561 ;</w:t>
-            </w:r>
-            <w:proofErr w:type="gramEnd"/>
-            <w:r>
-              <w:rPr>
-                <w:sz w:val="17"/>
-              </w:rPr>
-              <w:t xml:space="preserve"> 6,217]</w:t>
-            </w:r>
-          </w:p>
-        </w:tc>
-        <w:tc>
-          <w:tcPr>
-            <w:tcW w:w="2154" w:type="dxa"/>
-            <w:tcBorders>
-              <w:top w:val="nil"/>
-              <w:left w:val="nil"/>
-              <w:bottom w:val="nil"/>
-              <w:right w:val="nil"/>
-            </w:tcBorders>
-          </w:tcPr>
-          <w:p>
-            <w:pPr>
-              <w:keepNext/>
-              <w:jc w:val="both"/>
-            </w:pPr>
-            <w:r>
-              <w:rPr>
-                <w:sz w:val="17"/>
-              </w:rPr>
-              <w:t>[</w:t>
-            </w:r>
-            <w:proofErr w:type="gramStart"/>
-            <w:r>
-              <w:rPr>
-                <w:sz w:val="17"/>
-              </w:rPr>
-              <w:t>5,572 ;</w:t>
-            </w:r>
-            <w:proofErr w:type="gramEnd"/>
-            <w:r>
-              <w:rPr>
-                <w:sz w:val="17"/>
-              </w:rPr>
-              <w:t xml:space="preserve"> 6,223]</w:t>
+              <w:t>[5,572 ; 6,223]</w:t>
             </w:r>
           </w:p>
         </w:tc>
@@ -7021,57 +6907,29 @@
               <w:rPr>
                 <w:sz w:val="17"/>
               </w:rPr>
-              <w:t>[0,</w:t>
-            </w:r>
-            <w:proofErr w:type="gramStart"/>
+              <w:t>[0,0422 ; 0,0439]</w:t>
+            </w:r>
+          </w:p>
+        </w:tc>
+        <w:tc>
+          <w:tcPr>
+            <w:tcW w:w="2154" w:type="dxa"/>
+            <w:tcBorders>
+              <w:top w:val="nil"/>
+              <w:left w:val="nil"/>
+              <w:bottom w:val="single" w:sz="8" w:space="0" w:color="000000"/>
+              <w:right w:val="nil"/>
+            </w:tcBorders>
+          </w:tcPr>
+          <w:p>
+            <w:pPr>
+              <w:jc w:val="both"/>
+            </w:pPr>
             <w:r>
               <w:rPr>
                 <w:sz w:val="17"/>
               </w:rPr>
-              <w:t>0422 ;</w:t>
-            </w:r>
-            <w:proofErr w:type="gramEnd"/>
-            <w:r>
-              <w:rPr>
-                <w:sz w:val="17"/>
-              </w:rPr>
-              <w:t xml:space="preserve"> 0,0439]</w:t>
-            </w:r>
-          </w:p>
-        </w:tc>
-        <w:tc>
-          <w:tcPr>
-            <w:tcW w:w="2154" w:type="dxa"/>
-            <w:tcBorders>
-              <w:top w:val="nil"/>
-              <w:left w:val="nil"/>
-              <w:bottom w:val="single" w:sz="8" w:space="0" w:color="000000"/>
-              <w:right w:val="nil"/>
-            </w:tcBorders>
-          </w:tcPr>
-          <w:p>
-            <w:pPr>
-              <w:jc w:val="both"/>
-            </w:pPr>
-            <w:r>
-              <w:rPr>
-                <w:sz w:val="17"/>
-              </w:rPr>
-              <w:t>[0,</w:t>
-            </w:r>
-            <w:proofErr w:type="gramStart"/>
-            <w:r>
-              <w:rPr>
-                <w:sz w:val="17"/>
-              </w:rPr>
-              <w:t>0422 ;</w:t>
-            </w:r>
-            <w:proofErr w:type="gramEnd"/>
-            <w:r>
-              <w:rPr>
-                <w:sz w:val="17"/>
-              </w:rPr>
-              <w:t xml:space="preserve"> 0,0440]</w:t>
+              <w:t>[0,0422 ; 0,0440]</w:t>
             </w:r>
           </w:p>
         </w:tc>
@@ -7230,21 +7088,7 @@
         <w:rPr>
           <w:sz w:val="21"/>
         </w:rPr>
-        <w:t xml:space="preserve"> se estimó en p̂ = 15,47%, con IC 95% (aproximación normal) de [14,84</w:t>
-      </w:r>
-      <w:proofErr w:type="gramStart"/>
-      <w:r>
-        <w:rPr>
-          <w:sz w:val="21"/>
-        </w:rPr>
-        <w:t>% ;</w:t>
-      </w:r>
-      <w:proofErr w:type="gramEnd"/>
-      <w:r>
-        <w:rPr>
-          <w:sz w:val="21"/>
-        </w:rPr>
-        <w:t xml:space="preserve"> 16,11%]; las condiciones </w:t>
+        <w:t xml:space="preserve"> se estimó en p̂ = 15,47%, con IC 95% (aproximación normal) de [14,84% ; 16,11%]; las condiciones </w:t>
       </w:r>
       <w:proofErr w:type="spellStart"/>
       <w:r>
@@ -8587,7 +8431,14 @@
           <w:rFonts w:ascii="Consolas" w:hAnsi="Consolas"/>
           <w:sz w:val="19"/>
         </w:rPr>
-        <w:t>F2/01_exploracion_inicial.ipynb</w:t>
+        <w:t xml:space="preserve"> S1</w:t>
+      </w:r>
+      <w:r>
+        <w:rPr>
+          <w:rFonts w:ascii="Consolas" w:hAnsi="Consolas"/>
+          <w:sz w:val="19"/>
+        </w:rPr>
+        <w:t>/01_exploracion_inicial.ipynb</w:t>
       </w:r>
       <w:r>
         <w:rPr>

</xml_diff>